<commit_message>
Issue #7: update scope documentation details
</commit_message>
<xml_diff>
--- a/doc/res/DPP_parameters.docx
+++ b/doc/res/DPP_parameters.docx
@@ -3500,14 +3500,14 @@
         </w:tblCellMar>
       </w:tblPr>
       <w:tblGrid>
-        <w:gridCol w:w="775"/>
-        <w:gridCol w:w="9197"/>
+        <w:gridCol w:w="774"/>
+        <w:gridCol w:w="9198"/>
       </w:tblGrid>
       <w:tr>
         <w:trPr/>
         <w:tc>
           <w:tcPr>
-            <w:tcW w:w="775" w:type="dxa"/>
+            <w:tcW w:w="774" w:type="dxa"/>
             <w:tcBorders>
               <w:top w:val="single" w:sz="4" w:space="0" w:color="000000"/>
               <w:start w:val="single" w:sz="4" w:space="0" w:color="000000"/>
@@ -3544,7 +3544,7 @@
         </w:tc>
         <w:tc>
           <w:tcPr>
-            <w:tcW w:w="9197" w:type="dxa"/>
+            <w:tcW w:w="9198" w:type="dxa"/>
             <w:tcBorders>
               <w:top w:val="single" w:sz="4" w:space="0" w:color="000000"/>
               <w:start w:val="single" w:sz="4" w:space="0" w:color="000000"/>
@@ -3585,7 +3585,7 @@
         <w:trPr/>
         <w:tc>
           <w:tcPr>
-            <w:tcW w:w="775" w:type="dxa"/>
+            <w:tcW w:w="774" w:type="dxa"/>
             <w:tcBorders>
               <w:start w:val="single" w:sz="4" w:space="0" w:color="000000"/>
               <w:bottom w:val="single" w:sz="4" w:space="0" w:color="000000"/>
@@ -3632,7 +3632,7 @@
         </w:tc>
         <w:tc>
           <w:tcPr>
-            <w:tcW w:w="9197" w:type="dxa"/>
+            <w:tcW w:w="9198" w:type="dxa"/>
             <w:tcBorders>
               <w:start w:val="single" w:sz="4" w:space="0" w:color="000000"/>
               <w:bottom w:val="single" w:sz="4" w:space="0" w:color="000000"/>
@@ -3683,7 +3683,7 @@
         <w:trPr/>
         <w:tc>
           <w:tcPr>
-            <w:tcW w:w="775" w:type="dxa"/>
+            <w:tcW w:w="774" w:type="dxa"/>
             <w:tcBorders>
               <w:start w:val="single" w:sz="4" w:space="0" w:color="000000"/>
               <w:bottom w:val="single" w:sz="4" w:space="0" w:color="000000"/>
@@ -3730,7 +3730,7 @@
         </w:tc>
         <w:tc>
           <w:tcPr>
-            <w:tcW w:w="9197" w:type="dxa"/>
+            <w:tcW w:w="9198" w:type="dxa"/>
             <w:tcBorders>
               <w:start w:val="single" w:sz="4" w:space="0" w:color="000000"/>
               <w:bottom w:val="single" w:sz="4" w:space="0" w:color="000000"/>
@@ -3770,7 +3770,7 @@
         <w:trPr/>
         <w:tc>
           <w:tcPr>
-            <w:tcW w:w="775" w:type="dxa"/>
+            <w:tcW w:w="774" w:type="dxa"/>
             <w:tcBorders>
               <w:start w:val="single" w:sz="4" w:space="0" w:color="000000"/>
               <w:bottom w:val="single" w:sz="4" w:space="0" w:color="000000"/>
@@ -3817,7 +3817,7 @@
         </w:tc>
         <w:tc>
           <w:tcPr>
-            <w:tcW w:w="9197" w:type="dxa"/>
+            <w:tcW w:w="9198" w:type="dxa"/>
             <w:tcBorders>
               <w:start w:val="single" w:sz="4" w:space="0" w:color="000000"/>
               <w:bottom w:val="single" w:sz="4" w:space="0" w:color="000000"/>
@@ -3847,7 +3847,7 @@
         <w:trPr/>
         <w:tc>
           <w:tcPr>
-            <w:tcW w:w="775" w:type="dxa"/>
+            <w:tcW w:w="774" w:type="dxa"/>
             <w:tcBorders>
               <w:start w:val="single" w:sz="4" w:space="0" w:color="000000"/>
               <w:bottom w:val="single" w:sz="4" w:space="0" w:color="000000"/>
@@ -3894,7 +3894,7 @@
         </w:tc>
         <w:tc>
           <w:tcPr>
-            <w:tcW w:w="9197" w:type="dxa"/>
+            <w:tcW w:w="9198" w:type="dxa"/>
             <w:tcBorders>
               <w:start w:val="single" w:sz="4" w:space="0" w:color="000000"/>
               <w:bottom w:val="single" w:sz="4" w:space="0" w:color="000000"/>
@@ -4349,9 +4349,9 @@
       </w:tblPr>
       <w:tblGrid>
         <w:gridCol w:w="1350"/>
-        <w:gridCol w:w="2927"/>
+        <w:gridCol w:w="2926"/>
         <w:gridCol w:w="1800"/>
-        <w:gridCol w:w="1357"/>
+        <w:gridCol w:w="1358"/>
         <w:gridCol w:w="2538"/>
       </w:tblGrid>
       <w:tr>
@@ -4395,7 +4395,7 @@
         </w:tc>
         <w:tc>
           <w:tcPr>
-            <w:tcW w:w="2927" w:type="dxa"/>
+            <w:tcW w:w="2926" w:type="dxa"/>
             <w:tcBorders>
               <w:top w:val="single" w:sz="4" w:space="0" w:color="000000"/>
               <w:start w:val="single" w:sz="4" w:space="0" w:color="000000"/>
@@ -4469,7 +4469,7 @@
         </w:tc>
         <w:tc>
           <w:tcPr>
-            <w:tcW w:w="1357" w:type="dxa"/>
+            <w:tcW w:w="1358" w:type="dxa"/>
             <w:tcBorders>
               <w:top w:val="single" w:sz="4" w:space="0" w:color="000000"/>
               <w:start w:val="single" w:sz="4" w:space="0" w:color="000000"/>
@@ -4594,7 +4594,7 @@
         </w:tc>
         <w:tc>
           <w:tcPr>
-            <w:tcW w:w="2927" w:type="dxa"/>
+            <w:tcW w:w="2926" w:type="dxa"/>
             <w:tcBorders>
               <w:start w:val="single" w:sz="4" w:space="0" w:color="000000"/>
               <w:bottom w:val="single" w:sz="4" w:space="0" w:color="000000"/>
@@ -4722,7 +4722,7 @@
         </w:tc>
         <w:tc>
           <w:tcPr>
-            <w:tcW w:w="1357" w:type="dxa"/>
+            <w:tcW w:w="1358" w:type="dxa"/>
             <w:tcBorders>
               <w:start w:val="single" w:sz="4" w:space="0" w:color="000000"/>
               <w:bottom w:val="single" w:sz="4" w:space="0" w:color="000000"/>
@@ -4867,7 +4867,7 @@
         </w:tc>
         <w:tc>
           <w:tcPr>
-            <w:tcW w:w="2927" w:type="dxa"/>
+            <w:tcW w:w="2926" w:type="dxa"/>
             <w:tcBorders>
               <w:start w:val="single" w:sz="4" w:space="0" w:color="000000"/>
               <w:bottom w:val="single" w:sz="4" w:space="0" w:color="000000"/>
@@ -4978,7 +4978,7 @@
         </w:tc>
         <w:tc>
           <w:tcPr>
-            <w:tcW w:w="1357" w:type="dxa"/>
+            <w:tcW w:w="1358" w:type="dxa"/>
             <w:tcBorders>
               <w:start w:val="single" w:sz="4" w:space="0" w:color="000000"/>
               <w:bottom w:val="single" w:sz="4" w:space="0" w:color="000000"/>
@@ -5123,7 +5123,7 @@
         </w:tc>
         <w:tc>
           <w:tcPr>
-            <w:tcW w:w="2927" w:type="dxa"/>
+            <w:tcW w:w="2926" w:type="dxa"/>
             <w:tcBorders>
               <w:start w:val="single" w:sz="4" w:space="0" w:color="000000"/>
               <w:bottom w:val="single" w:sz="4" w:space="0" w:color="000000"/>
@@ -5234,7 +5234,7 @@
         </w:tc>
         <w:tc>
           <w:tcPr>
-            <w:tcW w:w="1357" w:type="dxa"/>
+            <w:tcW w:w="1358" w:type="dxa"/>
             <w:tcBorders>
               <w:start w:val="single" w:sz="4" w:space="0" w:color="000000"/>
               <w:bottom w:val="single" w:sz="4" w:space="0" w:color="000000"/>
@@ -5379,7 +5379,7 @@
         </w:tc>
         <w:tc>
           <w:tcPr>
-            <w:tcW w:w="2927" w:type="dxa"/>
+            <w:tcW w:w="2926" w:type="dxa"/>
             <w:tcBorders>
               <w:start w:val="single" w:sz="4" w:space="0" w:color="000000"/>
               <w:bottom w:val="single" w:sz="4" w:space="0" w:color="000000"/>
@@ -5490,7 +5490,7 @@
         </w:tc>
         <w:tc>
           <w:tcPr>
-            <w:tcW w:w="1357" w:type="dxa"/>
+            <w:tcW w:w="1358" w:type="dxa"/>
             <w:tcBorders>
               <w:start w:val="single" w:sz="4" w:space="0" w:color="000000"/>
               <w:bottom w:val="single" w:sz="4" w:space="0" w:color="000000"/>
@@ -5635,7 +5635,7 @@
         </w:tc>
         <w:tc>
           <w:tcPr>
-            <w:tcW w:w="2927" w:type="dxa"/>
+            <w:tcW w:w="2926" w:type="dxa"/>
             <w:tcBorders>
               <w:start w:val="single" w:sz="4" w:space="0" w:color="000000"/>
               <w:bottom w:val="single" w:sz="4" w:space="0" w:color="000000"/>
@@ -5746,7 +5746,7 @@
         </w:tc>
         <w:tc>
           <w:tcPr>
-            <w:tcW w:w="1357" w:type="dxa"/>
+            <w:tcW w:w="1358" w:type="dxa"/>
             <w:tcBorders>
               <w:start w:val="single" w:sz="4" w:space="0" w:color="000000"/>
               <w:bottom w:val="single" w:sz="4" w:space="0" w:color="000000"/>
@@ -5891,7 +5891,7 @@
         </w:tc>
         <w:tc>
           <w:tcPr>
-            <w:tcW w:w="2927" w:type="dxa"/>
+            <w:tcW w:w="2926" w:type="dxa"/>
             <w:tcBorders>
               <w:start w:val="single" w:sz="4" w:space="0" w:color="000000"/>
               <w:bottom w:val="single" w:sz="4" w:space="0" w:color="000000"/>
@@ -5985,7 +5985,7 @@
         </w:tc>
         <w:tc>
           <w:tcPr>
-            <w:tcW w:w="1357" w:type="dxa"/>
+            <w:tcW w:w="1358" w:type="dxa"/>
             <w:tcBorders>
               <w:start w:val="single" w:sz="4" w:space="0" w:color="000000"/>
               <w:bottom w:val="single" w:sz="4" w:space="0" w:color="000000"/>
@@ -6130,7 +6130,7 @@
         </w:tc>
         <w:tc>
           <w:tcPr>
-            <w:tcW w:w="2927" w:type="dxa"/>
+            <w:tcW w:w="2926" w:type="dxa"/>
             <w:tcBorders>
               <w:start w:val="single" w:sz="4" w:space="0" w:color="000000"/>
               <w:bottom w:val="single" w:sz="4" w:space="0" w:color="000000"/>
@@ -6224,7 +6224,7 @@
         </w:tc>
         <w:tc>
           <w:tcPr>
-            <w:tcW w:w="1357" w:type="dxa"/>
+            <w:tcW w:w="1358" w:type="dxa"/>
             <w:tcBorders>
               <w:start w:val="single" w:sz="4" w:space="0" w:color="000000"/>
               <w:bottom w:val="single" w:sz="4" w:space="0" w:color="000000"/>
@@ -6369,7 +6369,7 @@
         </w:tc>
         <w:tc>
           <w:tcPr>
-            <w:tcW w:w="2927" w:type="dxa"/>
+            <w:tcW w:w="2926" w:type="dxa"/>
             <w:tcBorders>
               <w:start w:val="single" w:sz="4" w:space="0" w:color="000000"/>
               <w:bottom w:val="single" w:sz="4" w:space="0" w:color="000000"/>
@@ -6463,7 +6463,7 @@
         </w:tc>
         <w:tc>
           <w:tcPr>
-            <w:tcW w:w="1357" w:type="dxa"/>
+            <w:tcW w:w="1358" w:type="dxa"/>
             <w:tcBorders>
               <w:start w:val="single" w:sz="4" w:space="0" w:color="000000"/>
               <w:bottom w:val="single" w:sz="4" w:space="0" w:color="000000"/>
@@ -6608,7 +6608,7 @@
         </w:tc>
         <w:tc>
           <w:tcPr>
-            <w:tcW w:w="2927" w:type="dxa"/>
+            <w:tcW w:w="2926" w:type="dxa"/>
             <w:tcBorders>
               <w:start w:val="single" w:sz="4" w:space="0" w:color="000000"/>
               <w:bottom w:val="single" w:sz="4" w:space="0" w:color="000000"/>
@@ -6702,7 +6702,7 @@
         </w:tc>
         <w:tc>
           <w:tcPr>
-            <w:tcW w:w="1357" w:type="dxa"/>
+            <w:tcW w:w="1358" w:type="dxa"/>
             <w:tcBorders>
               <w:start w:val="single" w:sz="4" w:space="0" w:color="000000"/>
               <w:bottom w:val="single" w:sz="4" w:space="0" w:color="000000"/>
@@ -6847,7 +6847,7 @@
         </w:tc>
         <w:tc>
           <w:tcPr>
-            <w:tcW w:w="2927" w:type="dxa"/>
+            <w:tcW w:w="2926" w:type="dxa"/>
             <w:tcBorders>
               <w:start w:val="single" w:sz="4" w:space="0" w:color="000000"/>
               <w:bottom w:val="single" w:sz="4" w:space="0" w:color="000000"/>
@@ -6941,7 +6941,7 @@
         </w:tc>
         <w:tc>
           <w:tcPr>
-            <w:tcW w:w="1357" w:type="dxa"/>
+            <w:tcW w:w="1358" w:type="dxa"/>
             <w:tcBorders>
               <w:start w:val="single" w:sz="4" w:space="0" w:color="000000"/>
               <w:bottom w:val="single" w:sz="4" w:space="0" w:color="000000"/>
@@ -7086,7 +7086,7 @@
         </w:tc>
         <w:tc>
           <w:tcPr>
-            <w:tcW w:w="2927" w:type="dxa"/>
+            <w:tcW w:w="2926" w:type="dxa"/>
             <w:tcBorders>
               <w:start w:val="single" w:sz="4" w:space="0" w:color="000000"/>
               <w:bottom w:val="single" w:sz="4" w:space="0" w:color="000000"/>
@@ -7180,7 +7180,7 @@
         </w:tc>
         <w:tc>
           <w:tcPr>
-            <w:tcW w:w="1357" w:type="dxa"/>
+            <w:tcW w:w="1358" w:type="dxa"/>
             <w:tcBorders>
               <w:start w:val="single" w:sz="4" w:space="0" w:color="000000"/>
               <w:bottom w:val="single" w:sz="4" w:space="0" w:color="000000"/>
@@ -7312,7 +7312,7 @@
         </w:tc>
         <w:tc>
           <w:tcPr>
-            <w:tcW w:w="2927" w:type="dxa"/>
+            <w:tcW w:w="2926" w:type="dxa"/>
             <w:tcBorders>
               <w:start w:val="single" w:sz="4" w:space="0" w:color="000000"/>
               <w:bottom w:val="single" w:sz="4" w:space="0" w:color="000000"/>
@@ -7423,7 +7423,7 @@
         </w:tc>
         <w:tc>
           <w:tcPr>
-            <w:tcW w:w="1357" w:type="dxa"/>
+            <w:tcW w:w="1358" w:type="dxa"/>
             <w:tcBorders>
               <w:start w:val="single" w:sz="4" w:space="0" w:color="000000"/>
               <w:bottom w:val="single" w:sz="4" w:space="0" w:color="000000"/>
@@ -7568,7 +7568,7 @@
         </w:tc>
         <w:tc>
           <w:tcPr>
-            <w:tcW w:w="2927" w:type="dxa"/>
+            <w:tcW w:w="2926" w:type="dxa"/>
             <w:tcBorders>
               <w:start w:val="single" w:sz="4" w:space="0" w:color="000000"/>
               <w:bottom w:val="single" w:sz="4" w:space="0" w:color="000000"/>
@@ -7662,7 +7662,7 @@
         </w:tc>
         <w:tc>
           <w:tcPr>
-            <w:tcW w:w="1357" w:type="dxa"/>
+            <w:tcW w:w="1358" w:type="dxa"/>
             <w:tcBorders>
               <w:start w:val="single" w:sz="4" w:space="0" w:color="000000"/>
               <w:bottom w:val="single" w:sz="4" w:space="0" w:color="000000"/>
@@ -7807,7 +7807,7 @@
         </w:tc>
         <w:tc>
           <w:tcPr>
-            <w:tcW w:w="2927" w:type="dxa"/>
+            <w:tcW w:w="2926" w:type="dxa"/>
             <w:tcBorders>
               <w:start w:val="single" w:sz="4" w:space="0" w:color="000000"/>
               <w:bottom w:val="single" w:sz="4" w:space="0" w:color="000000"/>
@@ -7901,7 +7901,7 @@
         </w:tc>
         <w:tc>
           <w:tcPr>
-            <w:tcW w:w="1357" w:type="dxa"/>
+            <w:tcW w:w="1358" w:type="dxa"/>
             <w:tcBorders>
               <w:start w:val="single" w:sz="4" w:space="0" w:color="000000"/>
               <w:bottom w:val="single" w:sz="4" w:space="0" w:color="000000"/>
@@ -8047,7 +8047,7 @@
         </w:tc>
         <w:tc>
           <w:tcPr>
-            <w:tcW w:w="2927" w:type="dxa"/>
+            <w:tcW w:w="2926" w:type="dxa"/>
             <w:tcBorders>
               <w:start w:val="single" w:sz="4" w:space="0" w:color="000000"/>
               <w:bottom w:val="single" w:sz="4" w:space="0" w:color="000000"/>
@@ -8141,7 +8141,7 @@
         </w:tc>
         <w:tc>
           <w:tcPr>
-            <w:tcW w:w="1357" w:type="dxa"/>
+            <w:tcW w:w="1358" w:type="dxa"/>
             <w:tcBorders>
               <w:start w:val="single" w:sz="4" w:space="0" w:color="000000"/>
               <w:bottom w:val="single" w:sz="4" w:space="0" w:color="000000"/>
@@ -8286,7 +8286,7 @@
         </w:tc>
         <w:tc>
           <w:tcPr>
-            <w:tcW w:w="2927" w:type="dxa"/>
+            <w:tcW w:w="2926" w:type="dxa"/>
             <w:tcBorders>
               <w:start w:val="single" w:sz="4" w:space="0" w:color="000000"/>
               <w:bottom w:val="single" w:sz="4" w:space="0" w:color="000000"/>
@@ -8380,7 +8380,7 @@
         </w:tc>
         <w:tc>
           <w:tcPr>
-            <w:tcW w:w="1357" w:type="dxa"/>
+            <w:tcW w:w="1358" w:type="dxa"/>
             <w:tcBorders>
               <w:start w:val="single" w:sz="4" w:space="0" w:color="000000"/>
               <w:bottom w:val="single" w:sz="4" w:space="0" w:color="000000"/>
@@ -8523,7 +8523,7 @@
         </w:tc>
         <w:tc>
           <w:tcPr>
-            <w:tcW w:w="2927" w:type="dxa"/>
+            <w:tcW w:w="2926" w:type="dxa"/>
             <w:tcBorders>
               <w:start w:val="single" w:sz="4" w:space="0" w:color="000000"/>
               <w:bottom w:val="single" w:sz="4" w:space="0" w:color="000000"/>
@@ -8634,7 +8634,7 @@
         </w:tc>
         <w:tc>
           <w:tcPr>
-            <w:tcW w:w="1357" w:type="dxa"/>
+            <w:tcW w:w="1358" w:type="dxa"/>
             <w:tcBorders>
               <w:start w:val="single" w:sz="4" w:space="0" w:color="000000"/>
               <w:bottom w:val="single" w:sz="4" w:space="0" w:color="000000"/>
@@ -8783,9 +8783,9 @@
       </w:tblPr>
       <w:tblGrid>
         <w:gridCol w:w="1678"/>
-        <w:gridCol w:w="2599"/>
+        <w:gridCol w:w="2598"/>
         <w:gridCol w:w="1800"/>
-        <w:gridCol w:w="1357"/>
+        <w:gridCol w:w="1358"/>
         <w:gridCol w:w="2538"/>
       </w:tblGrid>
       <w:tr>
@@ -8829,7 +8829,7 @@
         </w:tc>
         <w:tc>
           <w:tcPr>
-            <w:tcW w:w="2599" w:type="dxa"/>
+            <w:tcW w:w="2598" w:type="dxa"/>
             <w:tcBorders>
               <w:top w:val="single" w:sz="4" w:space="0" w:color="000000"/>
               <w:start w:val="single" w:sz="4" w:space="0" w:color="000000"/>
@@ -8903,7 +8903,7 @@
         </w:tc>
         <w:tc>
           <w:tcPr>
-            <w:tcW w:w="1357" w:type="dxa"/>
+            <w:tcW w:w="1358" w:type="dxa"/>
             <w:tcBorders>
               <w:top w:val="single" w:sz="4" w:space="0" w:color="000000"/>
               <w:start w:val="single" w:sz="4" w:space="0" w:color="000000"/>
@@ -9028,7 +9028,7 @@
         </w:tc>
         <w:tc>
           <w:tcPr>
-            <w:tcW w:w="2599" w:type="dxa"/>
+            <w:tcW w:w="2598" w:type="dxa"/>
             <w:tcBorders>
               <w:start w:val="single" w:sz="4" w:space="0" w:color="000000"/>
               <w:bottom w:val="single" w:sz="4" w:space="0" w:color="000000"/>
@@ -9190,7 +9190,7 @@
         </w:tc>
         <w:tc>
           <w:tcPr>
-            <w:tcW w:w="1357" w:type="dxa"/>
+            <w:tcW w:w="1358" w:type="dxa"/>
             <w:tcBorders>
               <w:start w:val="single" w:sz="4" w:space="0" w:color="000000"/>
               <w:bottom w:val="single" w:sz="4" w:space="0" w:color="000000"/>
@@ -9335,7 +9335,7 @@
         </w:tc>
         <w:tc>
           <w:tcPr>
-            <w:tcW w:w="2599" w:type="dxa"/>
+            <w:tcW w:w="2598" w:type="dxa"/>
             <w:tcBorders>
               <w:start w:val="single" w:sz="4" w:space="0" w:color="000000"/>
               <w:bottom w:val="single" w:sz="4" w:space="0" w:color="000000"/>
@@ -9439,7 +9439,7 @@
         </w:tc>
         <w:tc>
           <w:tcPr>
-            <w:tcW w:w="1357" w:type="dxa"/>
+            <w:tcW w:w="1358" w:type="dxa"/>
             <w:tcBorders>
               <w:start w:val="single" w:sz="4" w:space="0" w:color="000000"/>
               <w:bottom w:val="single" w:sz="4" w:space="0" w:color="000000"/>
@@ -9584,7 +9584,7 @@
         </w:tc>
         <w:tc>
           <w:tcPr>
-            <w:tcW w:w="2599" w:type="dxa"/>
+            <w:tcW w:w="2598" w:type="dxa"/>
             <w:tcBorders>
               <w:start w:val="single" w:sz="4" w:space="0" w:color="000000"/>
               <w:bottom w:val="single" w:sz="4" w:space="0" w:color="000000"/>
@@ -9725,7 +9725,7 @@
         </w:tc>
         <w:tc>
           <w:tcPr>
-            <w:tcW w:w="1357" w:type="dxa"/>
+            <w:tcW w:w="1358" w:type="dxa"/>
             <w:tcBorders>
               <w:start w:val="single" w:sz="4" w:space="0" w:color="000000"/>
               <w:bottom w:val="single" w:sz="4" w:space="0" w:color="000000"/>
@@ -9870,7 +9870,7 @@
         </w:tc>
         <w:tc>
           <w:tcPr>
-            <w:tcW w:w="2599" w:type="dxa"/>
+            <w:tcW w:w="2598" w:type="dxa"/>
             <w:tcBorders>
               <w:start w:val="single" w:sz="4" w:space="0" w:color="000000"/>
               <w:bottom w:val="single" w:sz="4" w:space="0" w:color="000000"/>
@@ -9957,7 +9957,7 @@
         </w:tc>
         <w:tc>
           <w:tcPr>
-            <w:tcW w:w="1357" w:type="dxa"/>
+            <w:tcW w:w="1358" w:type="dxa"/>
             <w:tcBorders>
               <w:start w:val="single" w:sz="4" w:space="0" w:color="000000"/>
               <w:bottom w:val="single" w:sz="4" w:space="0" w:color="000000"/>
@@ -10102,7 +10102,7 @@
         </w:tc>
         <w:tc>
           <w:tcPr>
-            <w:tcW w:w="2599" w:type="dxa"/>
+            <w:tcW w:w="2598" w:type="dxa"/>
             <w:tcBorders>
               <w:start w:val="single" w:sz="4" w:space="0" w:color="000000"/>
               <w:bottom w:val="single" w:sz="4" w:space="0" w:color="000000"/>
@@ -10205,7 +10205,7 @@
         </w:tc>
         <w:tc>
           <w:tcPr>
-            <w:tcW w:w="1357" w:type="dxa"/>
+            <w:tcW w:w="1358" w:type="dxa"/>
             <w:tcBorders>
               <w:start w:val="single" w:sz="4" w:space="0" w:color="000000"/>
               <w:bottom w:val="single" w:sz="4" w:space="0" w:color="000000"/>
@@ -10337,7 +10337,7 @@
         </w:tc>
         <w:tc>
           <w:tcPr>
-            <w:tcW w:w="2599" w:type="dxa"/>
+            <w:tcW w:w="2598" w:type="dxa"/>
             <w:tcBorders>
               <w:start w:val="single" w:sz="4" w:space="0" w:color="000000"/>
               <w:bottom w:val="single" w:sz="4" w:space="0" w:color="000000"/>
@@ -10431,7 +10431,7 @@
         </w:tc>
         <w:tc>
           <w:tcPr>
-            <w:tcW w:w="1357" w:type="dxa"/>
+            <w:tcW w:w="1358" w:type="dxa"/>
             <w:tcBorders>
               <w:start w:val="single" w:sz="4" w:space="0" w:color="000000"/>
               <w:bottom w:val="single" w:sz="4" w:space="0" w:color="000000"/>
@@ -10630,17 +10630,17 @@
         </w:tblCellMar>
       </w:tblPr>
       <w:tblGrid>
-        <w:gridCol w:w="1851"/>
-        <w:gridCol w:w="2426"/>
-        <w:gridCol w:w="1800"/>
-        <w:gridCol w:w="1357"/>
+        <w:gridCol w:w="1850"/>
+        <w:gridCol w:w="2525"/>
+        <w:gridCol w:w="1701"/>
+        <w:gridCol w:w="1358"/>
         <w:gridCol w:w="2538"/>
       </w:tblGrid>
       <w:tr>
         <w:trPr/>
         <w:tc>
           <w:tcPr>
-            <w:tcW w:w="1851" w:type="dxa"/>
+            <w:tcW w:w="1850" w:type="dxa"/>
             <w:tcBorders>
               <w:top w:val="single" w:sz="4" w:space="0" w:color="000000"/>
               <w:start w:val="single" w:sz="4" w:space="0" w:color="000000"/>
@@ -10677,7 +10677,7 @@
         </w:tc>
         <w:tc>
           <w:tcPr>
-            <w:tcW w:w="2426" w:type="dxa"/>
+            <w:tcW w:w="2525" w:type="dxa"/>
             <w:tcBorders>
               <w:top w:val="single" w:sz="4" w:space="0" w:color="000000"/>
               <w:start w:val="single" w:sz="4" w:space="0" w:color="000000"/>
@@ -10714,7 +10714,7 @@
         </w:tc>
         <w:tc>
           <w:tcPr>
-            <w:tcW w:w="1800" w:type="dxa"/>
+            <w:tcW w:w="1701" w:type="dxa"/>
             <w:tcBorders>
               <w:top w:val="single" w:sz="4" w:space="0" w:color="000000"/>
               <w:start w:val="single" w:sz="4" w:space="0" w:color="000000"/>
@@ -10751,7 +10751,7 @@
         </w:tc>
         <w:tc>
           <w:tcPr>
-            <w:tcW w:w="1357" w:type="dxa"/>
+            <w:tcW w:w="1358" w:type="dxa"/>
             <w:tcBorders>
               <w:top w:val="single" w:sz="4" w:space="0" w:color="000000"/>
               <w:start w:val="single" w:sz="4" w:space="0" w:color="000000"/>
@@ -10829,7 +10829,7 @@
         <w:trPr/>
         <w:tc>
           <w:tcPr>
-            <w:tcW w:w="1851" w:type="dxa"/>
+            <w:tcW w:w="1850" w:type="dxa"/>
             <w:tcBorders>
               <w:start w:val="single" w:sz="4" w:space="0" w:color="000000"/>
               <w:bottom w:val="single" w:sz="4" w:space="0" w:color="000000"/>
@@ -10876,7 +10876,7 @@
         </w:tc>
         <w:tc>
           <w:tcPr>
-            <w:tcW w:w="2426" w:type="dxa"/>
+            <w:tcW w:w="2525" w:type="dxa"/>
             <w:tcBorders>
               <w:start w:val="single" w:sz="4" w:space="0" w:color="000000"/>
               <w:bottom w:val="single" w:sz="4" w:space="0" w:color="000000"/>
@@ -10991,7 +10991,7 @@
         </w:tc>
         <w:tc>
           <w:tcPr>
-            <w:tcW w:w="1800" w:type="dxa"/>
+            <w:tcW w:w="1701" w:type="dxa"/>
             <w:tcBorders>
               <w:start w:val="single" w:sz="4" w:space="0" w:color="000000"/>
               <w:bottom w:val="single" w:sz="4" w:space="0" w:color="000000"/>
@@ -11038,7 +11038,7 @@
         </w:tc>
         <w:tc>
           <w:tcPr>
-            <w:tcW w:w="1357" w:type="dxa"/>
+            <w:tcW w:w="1358" w:type="dxa"/>
             <w:tcBorders>
               <w:start w:val="single" w:sz="4" w:space="0" w:color="000000"/>
               <w:bottom w:val="single" w:sz="4" w:space="0" w:color="000000"/>
@@ -11136,7 +11136,7 @@
         <w:trPr/>
         <w:tc>
           <w:tcPr>
-            <w:tcW w:w="1851" w:type="dxa"/>
+            <w:tcW w:w="1850" w:type="dxa"/>
             <w:tcBorders>
               <w:start w:val="single" w:sz="4" w:space="0" w:color="000000"/>
               <w:bottom w:val="single" w:sz="4" w:space="0" w:color="000000"/>
@@ -11183,7 +11183,7 @@
         </w:tc>
         <w:tc>
           <w:tcPr>
-            <w:tcW w:w="2426" w:type="dxa"/>
+            <w:tcW w:w="2525" w:type="dxa"/>
             <w:tcBorders>
               <w:start w:val="single" w:sz="4" w:space="0" w:color="000000"/>
               <w:bottom w:val="single" w:sz="4" w:space="0" w:color="000000"/>
@@ -11210,7 +11210,7 @@
         </w:tc>
         <w:tc>
           <w:tcPr>
-            <w:tcW w:w="1800" w:type="dxa"/>
+            <w:tcW w:w="1701" w:type="dxa"/>
             <w:tcBorders>
               <w:start w:val="single" w:sz="4" w:space="0" w:color="000000"/>
               <w:bottom w:val="single" w:sz="4" w:space="0" w:color="000000"/>
@@ -11257,7 +11257,7 @@
         </w:tc>
         <w:tc>
           <w:tcPr>
-            <w:tcW w:w="1357" w:type="dxa"/>
+            <w:tcW w:w="1358" w:type="dxa"/>
             <w:tcBorders>
               <w:start w:val="single" w:sz="4" w:space="0" w:color="000000"/>
               <w:bottom w:val="single" w:sz="4" w:space="0" w:color="000000"/>
@@ -11355,7 +11355,7 @@
         <w:trPr/>
         <w:tc>
           <w:tcPr>
-            <w:tcW w:w="1851" w:type="dxa"/>
+            <w:tcW w:w="1850" w:type="dxa"/>
             <w:tcBorders>
               <w:start w:val="single" w:sz="4" w:space="0" w:color="000000"/>
               <w:bottom w:val="single" w:sz="4" w:space="0" w:color="000000"/>
@@ -11402,7 +11402,7 @@
         </w:tc>
         <w:tc>
           <w:tcPr>
-            <w:tcW w:w="2426" w:type="dxa"/>
+            <w:tcW w:w="2525" w:type="dxa"/>
             <w:tcBorders>
               <w:start w:val="single" w:sz="4" w:space="0" w:color="000000"/>
               <w:bottom w:val="single" w:sz="4" w:space="0" w:color="000000"/>
@@ -11442,7 +11442,7 @@
         </w:tc>
         <w:tc>
           <w:tcPr>
-            <w:tcW w:w="1800" w:type="dxa"/>
+            <w:tcW w:w="1701" w:type="dxa"/>
             <w:tcBorders>
               <w:start w:val="single" w:sz="4" w:space="0" w:color="000000"/>
               <w:bottom w:val="single" w:sz="4" w:space="0" w:color="000000"/>
@@ -11489,7 +11489,7 @@
         </w:tc>
         <w:tc>
           <w:tcPr>
-            <w:tcW w:w="1357" w:type="dxa"/>
+            <w:tcW w:w="1358" w:type="dxa"/>
             <w:tcBorders>
               <w:start w:val="single" w:sz="4" w:space="0" w:color="000000"/>
               <w:bottom w:val="single" w:sz="4" w:space="0" w:color="000000"/>
@@ -11587,7 +11587,7 @@
         <w:trPr/>
         <w:tc>
           <w:tcPr>
-            <w:tcW w:w="1851" w:type="dxa"/>
+            <w:tcW w:w="1850" w:type="dxa"/>
             <w:tcBorders>
               <w:start w:val="single" w:sz="4" w:space="0" w:color="000000"/>
               <w:bottom w:val="single" w:sz="4" w:space="0" w:color="000000"/>
@@ -11634,7 +11634,7 @@
         </w:tc>
         <w:tc>
           <w:tcPr>
-            <w:tcW w:w="2426" w:type="dxa"/>
+            <w:tcW w:w="2525" w:type="dxa"/>
             <w:tcBorders>
               <w:start w:val="single" w:sz="4" w:space="0" w:color="000000"/>
               <w:bottom w:val="single" w:sz="4" w:space="0" w:color="000000"/>
@@ -11674,7 +11674,7 @@
         </w:tc>
         <w:tc>
           <w:tcPr>
-            <w:tcW w:w="1800" w:type="dxa"/>
+            <w:tcW w:w="1701" w:type="dxa"/>
             <w:tcBorders>
               <w:start w:val="single" w:sz="4" w:space="0" w:color="000000"/>
               <w:bottom w:val="single" w:sz="4" w:space="0" w:color="000000"/>
@@ -11721,7 +11721,7 @@
         </w:tc>
         <w:tc>
           <w:tcPr>
-            <w:tcW w:w="1357" w:type="dxa"/>
+            <w:tcW w:w="1358" w:type="dxa"/>
             <w:tcBorders>
               <w:start w:val="single" w:sz="4" w:space="0" w:color="000000"/>
               <w:bottom w:val="single" w:sz="4" w:space="0" w:color="000000"/>
@@ -11819,7 +11819,7 @@
         <w:trPr/>
         <w:tc>
           <w:tcPr>
-            <w:tcW w:w="1851" w:type="dxa"/>
+            <w:tcW w:w="1850" w:type="dxa"/>
             <w:tcBorders>
               <w:start w:val="single" w:sz="4" w:space="0" w:color="000000"/>
               <w:bottom w:val="single" w:sz="4" w:space="0" w:color="000000"/>
@@ -11866,7 +11866,7 @@
         </w:tc>
         <w:tc>
           <w:tcPr>
-            <w:tcW w:w="2426" w:type="dxa"/>
+            <w:tcW w:w="2525" w:type="dxa"/>
             <w:tcBorders>
               <w:start w:val="single" w:sz="4" w:space="0" w:color="000000"/>
               <w:bottom w:val="single" w:sz="4" w:space="0" w:color="000000"/>
@@ -11900,7 +11900,7 @@
         </w:tc>
         <w:tc>
           <w:tcPr>
-            <w:tcW w:w="1800" w:type="dxa"/>
+            <w:tcW w:w="1701" w:type="dxa"/>
             <w:tcBorders>
               <w:start w:val="single" w:sz="4" w:space="0" w:color="000000"/>
               <w:bottom w:val="single" w:sz="4" w:space="0" w:color="000000"/>
@@ -11947,7 +11947,7 @@
         </w:tc>
         <w:tc>
           <w:tcPr>
-            <w:tcW w:w="1357" w:type="dxa"/>
+            <w:tcW w:w="1358" w:type="dxa"/>
             <w:tcBorders>
               <w:start w:val="single" w:sz="4" w:space="0" w:color="000000"/>
               <w:bottom w:val="single" w:sz="4" w:space="0" w:color="000000"/>
@@ -12032,7 +12032,7 @@
         <w:trPr/>
         <w:tc>
           <w:tcPr>
-            <w:tcW w:w="1851" w:type="dxa"/>
+            <w:tcW w:w="1850" w:type="dxa"/>
             <w:tcBorders>
               <w:start w:val="single" w:sz="4" w:space="0" w:color="000000"/>
               <w:bottom w:val="single" w:sz="4" w:space="0" w:color="000000"/>
@@ -12079,7 +12079,7 @@
         </w:tc>
         <w:tc>
           <w:tcPr>
-            <w:tcW w:w="2426" w:type="dxa"/>
+            <w:tcW w:w="2525" w:type="dxa"/>
             <w:tcBorders>
               <w:start w:val="single" w:sz="4" w:space="0" w:color="000000"/>
               <w:bottom w:val="single" w:sz="4" w:space="0" w:color="000000"/>
@@ -12126,7 +12126,7 @@
         </w:tc>
         <w:tc>
           <w:tcPr>
-            <w:tcW w:w="1800" w:type="dxa"/>
+            <w:tcW w:w="1701" w:type="dxa"/>
             <w:tcBorders>
               <w:start w:val="single" w:sz="4" w:space="0" w:color="000000"/>
               <w:bottom w:val="single" w:sz="4" w:space="0" w:color="000000"/>
@@ -12173,7 +12173,7 @@
         </w:tc>
         <w:tc>
           <w:tcPr>
-            <w:tcW w:w="1357" w:type="dxa"/>
+            <w:tcW w:w="1358" w:type="dxa"/>
             <w:tcBorders>
               <w:start w:val="single" w:sz="4" w:space="0" w:color="000000"/>
               <w:bottom w:val="single" w:sz="4" w:space="0" w:color="000000"/>
@@ -12271,40 +12271,27 @@
         <w:trPr/>
         <w:tc>
           <w:tcPr>
-            <w:tcW w:w="1851" w:type="dxa"/>
-            <w:tcBorders>
-              <w:start w:val="single" w:sz="4" w:space="0" w:color="000000"/>
-              <w:bottom w:val="single" w:sz="4" w:space="0" w:color="000000"/>
-            </w:tcBorders>
-          </w:tcPr>
-          <w:p>
-            <w:pPr>
-              <w:pStyle w:val="TableContents"/>
-              <w:jc w:val="start"/>
-              <w:rPr>
-                <w:rFonts w:ascii="Liberation Serif" w:hAnsi="Liberation Serif"/>
-                <w:b w:val="false"/>
-                <w:bCs w:val="false"/>
-                <w:i w:val="false"/>
-                <w:iCs w:val="false"/>
-                <w:strike w:val="false"/>
-                <w:dstrike w:val="false"/>
-                <w:outline w:val="false"/>
-                <w:shadow w:val="false"/>
-                <w:color w:val="auto"/>
-                <w:sz w:val="24"/>
-                <w:szCs w:val="24"/>
-                <w:u w:val="none"/>
-              </w:rPr>
-            </w:pPr>
-            <w:r>
-              <w:rPr>
-                <w:b w:val="false"/>
-                <w:bCs w:val="false"/>
-                <w:i w:val="false"/>
-                <w:iCs w:val="false"/>
-                <w:strike w:val="false"/>
-                <w:dstrike w:val="false"/>
+            <w:tcW w:w="1850" w:type="dxa"/>
+            <w:tcBorders>
+              <w:start w:val="single" w:sz="4" w:space="0" w:color="000000"/>
+              <w:bottom w:val="single" w:sz="4" w:space="0" w:color="000000"/>
+            </w:tcBorders>
+          </w:tcPr>
+          <w:p>
+            <w:pPr>
+              <w:pStyle w:val="TableContents"/>
+              <w:jc w:val="start"/>
+              <w:rPr>
+                <w:strike/>
+              </w:rPr>
+            </w:pPr>
+            <w:r>
+              <w:rPr>
+                <w:b w:val="false"/>
+                <w:bCs w:val="false"/>
+                <w:i w:val="false"/>
+                <w:iCs w:val="false"/>
+                <w:strike/>
                 <w:outline w:val="false"/>
                 <w:shadow w:val="false"/>
                 <w:color w:val="auto"/>
@@ -12318,54 +12305,383 @@
         </w:tc>
         <w:tc>
           <w:tcPr>
-            <w:tcW w:w="2426" w:type="dxa"/>
-            <w:tcBorders>
-              <w:start w:val="single" w:sz="4" w:space="0" w:color="000000"/>
-              <w:bottom w:val="single" w:sz="4" w:space="0" w:color="000000"/>
-            </w:tcBorders>
-          </w:tcPr>
-          <w:p>
-            <w:pPr>
-              <w:pStyle w:val="TableContents"/>
-              <w:jc w:val="start"/>
-              <w:rPr>
-                <w:rFonts w:ascii="Liberation Serif" w:hAnsi="Liberation Serif"/>
-                <w:b w:val="false"/>
-                <w:bCs w:val="false"/>
-                <w:i w:val="false"/>
-                <w:iCs w:val="false"/>
-                <w:strike w:val="false"/>
-                <w:dstrike w:val="false"/>
-                <w:outline w:val="false"/>
-                <w:shadow w:val="false"/>
-                <w:color w:val="auto"/>
-                <w:sz w:val="24"/>
-                <w:szCs w:val="24"/>
-                <w:u w:val="none"/>
-              </w:rPr>
-            </w:pPr>
-            <w:r>
-              <w:rPr>
-                <w:b w:val="false"/>
-                <w:bCs w:val="false"/>
-                <w:i w:val="false"/>
-                <w:iCs w:val="false"/>
-                <w:strike w:val="false"/>
-                <w:dstrike w:val="false"/>
-                <w:outline w:val="false"/>
-                <w:shadow w:val="false"/>
-                <w:color w:val="auto"/>
-                <w:sz w:val="24"/>
-                <w:szCs w:val="24"/>
-                <w:u w:val="none"/>
-              </w:rPr>
-              <w:t>Buffer full flag?</w:t>
-            </w:r>
-          </w:p>
-        </w:tc>
-        <w:tc>
-          <w:tcPr>
-            <w:tcW w:w="1800" w:type="dxa"/>
+            <w:tcW w:w="2525" w:type="dxa"/>
+            <w:tcBorders>
+              <w:start w:val="single" w:sz="4" w:space="0" w:color="000000"/>
+              <w:bottom w:val="single" w:sz="4" w:space="0" w:color="000000"/>
+            </w:tcBorders>
+          </w:tcPr>
+          <w:p>
+            <w:pPr>
+              <w:pStyle w:val="TableContents"/>
+              <w:jc w:val="start"/>
+              <w:rPr>
+                <w:b/>
+                <w:bCs/>
+              </w:rPr>
+            </w:pPr>
+            <w:r>
+              <w:rPr>
+                <w:b/>
+                <w:bCs/>
+                <w:i w:val="false"/>
+                <w:iCs w:val="false"/>
+                <w:strike w:val="false"/>
+                <w:dstrike w:val="false"/>
+                <w:outline w:val="false"/>
+                <w:shadow w:val="false"/>
+                <w:color w:val="auto"/>
+                <w:sz w:val="24"/>
+                <w:szCs w:val="24"/>
+                <w:u w:val="none"/>
+              </w:rPr>
+              <w:t>D</w:t>
+            </w:r>
+            <w:r>
+              <w:rPr>
+                <w:b/>
+                <w:bCs/>
+                <w:i w:val="false"/>
+                <w:iCs w:val="false"/>
+                <w:strike w:val="false"/>
+                <w:dstrike w:val="false"/>
+                <w:outline w:val="false"/>
+                <w:shadow w:val="false"/>
+                <w:color w:val="auto"/>
+                <w:sz w:val="24"/>
+                <w:szCs w:val="24"/>
+                <w:u w:val="none"/>
+              </w:rPr>
+              <w:t>E</w:t>
+            </w:r>
+            <w:r>
+              <w:rPr>
+                <w:b/>
+                <w:bCs/>
+                <w:i w:val="false"/>
+                <w:iCs w:val="false"/>
+                <w:strike w:val="false"/>
+                <w:dstrike w:val="false"/>
+                <w:outline w:val="false"/>
+                <w:shadow w:val="false"/>
+                <w:color w:val="auto"/>
+                <w:sz w:val="24"/>
+                <w:szCs w:val="24"/>
+                <w:u w:val="none"/>
+              </w:rPr>
+              <w:t>P</w:t>
+            </w:r>
+            <w:r>
+              <w:rPr>
+                <w:b/>
+                <w:bCs/>
+                <w:i w:val="false"/>
+                <w:iCs w:val="false"/>
+                <w:strike w:val="false"/>
+                <w:dstrike w:val="false"/>
+                <w:outline w:val="false"/>
+                <w:shadow w:val="false"/>
+                <w:color w:val="auto"/>
+                <w:sz w:val="24"/>
+                <w:szCs w:val="24"/>
+                <w:u w:val="none"/>
+              </w:rPr>
+              <w:t>R</w:t>
+            </w:r>
+            <w:r>
+              <w:rPr>
+                <w:b/>
+                <w:bCs/>
+                <w:i w:val="false"/>
+                <w:iCs w:val="false"/>
+                <w:strike w:val="false"/>
+                <w:dstrike w:val="false"/>
+                <w:outline w:val="false"/>
+                <w:shadow w:val="false"/>
+                <w:color w:val="auto"/>
+                <w:sz w:val="24"/>
+                <w:szCs w:val="24"/>
+                <w:u w:val="none"/>
+              </w:rPr>
+              <w:t>ECATED</w:t>
+            </w:r>
+            <w:r>
+              <w:rPr>
+                <w:b w:val="false"/>
+                <w:bCs w:val="false"/>
+                <w:i w:val="false"/>
+                <w:iCs w:val="false"/>
+                <w:strike w:val="false"/>
+                <w:dstrike w:val="false"/>
+                <w:outline w:val="false"/>
+                <w:shadow w:val="false"/>
+                <w:color w:val="auto"/>
+                <w:sz w:val="24"/>
+                <w:szCs w:val="24"/>
+                <w:u w:val="none"/>
+              </w:rPr>
+              <w:t xml:space="preserve">. </w:t>
+            </w:r>
+            <w:r>
+              <w:rPr>
+                <w:b w:val="false"/>
+                <w:bCs w:val="false"/>
+                <w:i w:val="false"/>
+                <w:iCs w:val="false"/>
+                <w:strike w:val="false"/>
+                <w:dstrike w:val="false"/>
+                <w:outline w:val="false"/>
+                <w:shadow w:val="false"/>
+                <w:color w:val="auto"/>
+                <w:sz w:val="24"/>
+                <w:szCs w:val="24"/>
+                <w:u w:val="none"/>
+              </w:rPr>
+              <w:t>S</w:t>
+            </w:r>
+            <w:r>
+              <w:rPr>
+                <w:b w:val="false"/>
+                <w:bCs w:val="false"/>
+                <w:i w:val="false"/>
+                <w:iCs w:val="false"/>
+                <w:strike w:val="false"/>
+                <w:dstrike w:val="false"/>
+                <w:outline w:val="false"/>
+                <w:shadow w:val="false"/>
+                <w:color w:val="auto"/>
+                <w:sz w:val="24"/>
+                <w:szCs w:val="24"/>
+                <w:u w:val="none"/>
+              </w:rPr>
+              <w:t>t</w:t>
+            </w:r>
+            <w:r>
+              <w:rPr>
+                <w:b w:val="false"/>
+                <w:bCs w:val="false"/>
+                <w:i w:val="false"/>
+                <w:iCs w:val="false"/>
+                <w:strike w:val="false"/>
+                <w:dstrike w:val="false"/>
+                <w:outline w:val="false"/>
+                <w:shadow w:val="false"/>
+                <w:color w:val="auto"/>
+                <w:sz w:val="24"/>
+                <w:szCs w:val="24"/>
+                <w:u w:val="none"/>
+              </w:rPr>
+              <w:t>a</w:t>
+            </w:r>
+            <w:r>
+              <w:rPr>
+                <w:b w:val="false"/>
+                <w:bCs w:val="false"/>
+                <w:i w:val="false"/>
+                <w:iCs w:val="false"/>
+                <w:strike w:val="false"/>
+                <w:dstrike w:val="false"/>
+                <w:outline w:val="false"/>
+                <w:shadow w:val="false"/>
+                <w:color w:val="auto"/>
+                <w:sz w:val="24"/>
+                <w:szCs w:val="24"/>
+                <w:u w:val="none"/>
+              </w:rPr>
+              <w:t>t</w:t>
+            </w:r>
+            <w:r>
+              <w:rPr>
+                <w:b w:val="false"/>
+                <w:bCs w:val="false"/>
+                <w:i w:val="false"/>
+                <w:iCs w:val="false"/>
+                <w:strike w:val="false"/>
+                <w:dstrike w:val="false"/>
+                <w:outline w:val="false"/>
+                <w:shadow w:val="false"/>
+                <w:color w:val="auto"/>
+                <w:sz w:val="24"/>
+                <w:szCs w:val="24"/>
+                <w:u w:val="none"/>
+              </w:rPr>
+              <w:t>u</w:t>
+            </w:r>
+            <w:r>
+              <w:rPr>
+                <w:b w:val="false"/>
+                <w:bCs w:val="false"/>
+                <w:i w:val="false"/>
+                <w:iCs w:val="false"/>
+                <w:strike w:val="false"/>
+                <w:dstrike w:val="false"/>
+                <w:outline w:val="false"/>
+                <w:shadow w:val="false"/>
+                <w:color w:val="auto"/>
+                <w:sz w:val="24"/>
+                <w:szCs w:val="24"/>
+                <w:u w:val="none"/>
+              </w:rPr>
+              <w:t xml:space="preserve">s </w:t>
+            </w:r>
+            <w:r>
+              <w:rPr>
+                <w:b w:val="false"/>
+                <w:bCs w:val="false"/>
+                <w:i w:val="false"/>
+                <w:iCs w:val="false"/>
+                <w:strike w:val="false"/>
+                <w:dstrike w:val="false"/>
+                <w:outline w:val="false"/>
+                <w:shadow w:val="false"/>
+                <w:color w:val="auto"/>
+                <w:sz w:val="24"/>
+                <w:szCs w:val="24"/>
+                <w:u w:val="none"/>
+              </w:rPr>
+              <w:t>o</w:t>
+            </w:r>
+            <w:r>
+              <w:rPr>
+                <w:b w:val="false"/>
+                <w:bCs w:val="false"/>
+                <w:i w:val="false"/>
+                <w:iCs w:val="false"/>
+                <w:strike w:val="false"/>
+                <w:dstrike w:val="false"/>
+                <w:outline w:val="false"/>
+                <w:shadow w:val="false"/>
+                <w:color w:val="auto"/>
+                <w:sz w:val="24"/>
+                <w:szCs w:val="24"/>
+                <w:u w:val="none"/>
+              </w:rPr>
+              <w:t xml:space="preserve">f </w:t>
+            </w:r>
+            <w:r>
+              <w:rPr>
+                <w:b w:val="false"/>
+                <w:bCs w:val="false"/>
+                <w:i w:val="false"/>
+                <w:iCs w:val="false"/>
+                <w:strike w:val="false"/>
+                <w:dstrike w:val="false"/>
+                <w:outline w:val="false"/>
+                <w:shadow w:val="false"/>
+                <w:color w:val="auto"/>
+                <w:sz w:val="24"/>
+                <w:szCs w:val="24"/>
+                <w:u w:val="none"/>
+              </w:rPr>
+              <w:t>t</w:t>
+            </w:r>
+            <w:r>
+              <w:rPr>
+                <w:b w:val="false"/>
+                <w:bCs w:val="false"/>
+                <w:i w:val="false"/>
+                <w:iCs w:val="false"/>
+                <w:strike w:val="false"/>
+                <w:dstrike w:val="false"/>
+                <w:outline w:val="false"/>
+                <w:shadow w:val="false"/>
+                <w:color w:val="auto"/>
+                <w:sz w:val="24"/>
+                <w:szCs w:val="24"/>
+                <w:u w:val="none"/>
+              </w:rPr>
+              <w:t>h</w:t>
+            </w:r>
+            <w:r>
+              <w:rPr>
+                <w:b w:val="false"/>
+                <w:bCs w:val="false"/>
+                <w:i w:val="false"/>
+                <w:iCs w:val="false"/>
+                <w:strike w:val="false"/>
+                <w:dstrike w:val="false"/>
+                <w:outline w:val="false"/>
+                <w:shadow w:val="false"/>
+                <w:color w:val="auto"/>
+                <w:sz w:val="24"/>
+                <w:szCs w:val="24"/>
+                <w:u w:val="none"/>
+              </w:rPr>
+              <w:t xml:space="preserve">e </w:t>
+            </w:r>
+            <w:r>
+              <w:rPr>
+                <w:b w:val="false"/>
+                <w:bCs w:val="false"/>
+                <w:i w:val="false"/>
+                <w:iCs w:val="false"/>
+                <w:strike w:val="false"/>
+                <w:dstrike w:val="false"/>
+                <w:outline w:val="false"/>
+                <w:shadow w:val="false"/>
+                <w:color w:val="auto"/>
+                <w:sz w:val="24"/>
+                <w:szCs w:val="24"/>
+                <w:u w:val="none"/>
+              </w:rPr>
+              <w:t>F</w:t>
+            </w:r>
+            <w:r>
+              <w:rPr>
+                <w:b w:val="false"/>
+                <w:bCs w:val="false"/>
+                <w:i w:val="false"/>
+                <w:iCs w:val="false"/>
+                <w:strike w:val="false"/>
+                <w:dstrike w:val="false"/>
+                <w:outline w:val="false"/>
+                <w:shadow w:val="false"/>
+                <w:color w:val="auto"/>
+                <w:sz w:val="24"/>
+                <w:szCs w:val="24"/>
+                <w:u w:val="none"/>
+              </w:rPr>
+              <w:t>I</w:t>
+            </w:r>
+            <w:r>
+              <w:rPr>
+                <w:b w:val="false"/>
+                <w:bCs w:val="false"/>
+                <w:i w:val="false"/>
+                <w:iCs w:val="false"/>
+                <w:strike w:val="false"/>
+                <w:dstrike w:val="false"/>
+                <w:outline w:val="false"/>
+                <w:shadow w:val="false"/>
+                <w:color w:val="auto"/>
+                <w:sz w:val="24"/>
+                <w:szCs w:val="24"/>
+                <w:u w:val="none"/>
+              </w:rPr>
+              <w:t>F</w:t>
+            </w:r>
+            <w:r>
+              <w:rPr>
+                <w:b w:val="false"/>
+                <w:bCs w:val="false"/>
+                <w:i w:val="false"/>
+                <w:iCs w:val="false"/>
+                <w:strike w:val="false"/>
+                <w:dstrike w:val="false"/>
+                <w:outline w:val="false"/>
+                <w:shadow w:val="false"/>
+                <w:color w:val="auto"/>
+                <w:sz w:val="24"/>
+                <w:szCs w:val="24"/>
+                <w:u w:val="none"/>
+              </w:rPr>
+              <w:t xml:space="preserve">O. </w:t>
+            </w:r>
+          </w:p>
+        </w:tc>
+        <w:tc>
+          <w:tcPr>
+            <w:tcW w:w="1701" w:type="dxa"/>
             <w:tcBorders>
               <w:start w:val="single" w:sz="4" w:space="0" w:color="000000"/>
               <w:bottom w:val="single" w:sz="4" w:space="0" w:color="000000"/>
@@ -12412,7 +12728,7 @@
         </w:tc>
         <w:tc>
           <w:tcPr>
-            <w:tcW w:w="1357" w:type="dxa"/>
+            <w:tcW w:w="1358" w:type="dxa"/>
             <w:tcBorders>
               <w:start w:val="single" w:sz="4" w:space="0" w:color="000000"/>
               <w:bottom w:val="single" w:sz="4" w:space="0" w:color="000000"/>
@@ -12510,7 +12826,7 @@
         <w:trPr/>
         <w:tc>
           <w:tcPr>
-            <w:tcW w:w="1851" w:type="dxa"/>
+            <w:tcW w:w="1850" w:type="dxa"/>
             <w:tcBorders>
               <w:start w:val="single" w:sz="4" w:space="0" w:color="000000"/>
               <w:bottom w:val="single" w:sz="4" w:space="0" w:color="000000"/>
@@ -12557,7 +12873,7 @@
         </w:tc>
         <w:tc>
           <w:tcPr>
-            <w:tcW w:w="2426" w:type="dxa"/>
+            <w:tcW w:w="2525" w:type="dxa"/>
             <w:tcBorders>
               <w:start w:val="single" w:sz="4" w:space="0" w:color="000000"/>
               <w:bottom w:val="single" w:sz="4" w:space="0" w:color="000000"/>
@@ -12905,7 +13221,7 @@
         </w:tc>
         <w:tc>
           <w:tcPr>
-            <w:tcW w:w="1800" w:type="dxa"/>
+            <w:tcW w:w="1701" w:type="dxa"/>
             <w:tcBorders>
               <w:start w:val="single" w:sz="4" w:space="0" w:color="000000"/>
               <w:bottom w:val="single" w:sz="4" w:space="0" w:color="000000"/>
@@ -12952,7 +13268,7 @@
         </w:tc>
         <w:tc>
           <w:tcPr>
-            <w:tcW w:w="1357" w:type="dxa"/>
+            <w:tcW w:w="1358" w:type="dxa"/>
             <w:tcBorders>
               <w:start w:val="single" w:sz="4" w:space="0" w:color="000000"/>
               <w:bottom w:val="single" w:sz="4" w:space="0" w:color="000000"/>
@@ -13050,7 +13366,7 @@
         <w:trPr/>
         <w:tc>
           <w:tcPr>
-            <w:tcW w:w="1851" w:type="dxa"/>
+            <w:tcW w:w="1850" w:type="dxa"/>
             <w:tcBorders>
               <w:start w:val="single" w:sz="4" w:space="0" w:color="000000"/>
               <w:bottom w:val="single" w:sz="4" w:space="0" w:color="000000"/>
@@ -13097,7 +13413,7 @@
         </w:tc>
         <w:tc>
           <w:tcPr>
-            <w:tcW w:w="2426" w:type="dxa"/>
+            <w:tcW w:w="2525" w:type="dxa"/>
             <w:tcBorders>
               <w:start w:val="single" w:sz="4" w:space="0" w:color="000000"/>
               <w:bottom w:val="single" w:sz="4" w:space="0" w:color="000000"/>
@@ -13335,7 +13651,7 @@
         </w:tc>
         <w:tc>
           <w:tcPr>
-            <w:tcW w:w="1800" w:type="dxa"/>
+            <w:tcW w:w="1701" w:type="dxa"/>
             <w:tcBorders>
               <w:start w:val="single" w:sz="4" w:space="0" w:color="000000"/>
               <w:bottom w:val="single" w:sz="4" w:space="0" w:color="000000"/>
@@ -13382,7 +13698,7 @@
         </w:tc>
         <w:tc>
           <w:tcPr>
-            <w:tcW w:w="1357" w:type="dxa"/>
+            <w:tcW w:w="1358" w:type="dxa"/>
             <w:tcBorders>
               <w:start w:val="single" w:sz="4" w:space="0" w:color="000000"/>
               <w:bottom w:val="single" w:sz="4" w:space="0" w:color="000000"/>
@@ -13631,7 +13947,7 @@
         <w:trPr/>
         <w:tc>
           <w:tcPr>
-            <w:tcW w:w="1851" w:type="dxa"/>
+            <w:tcW w:w="1850" w:type="dxa"/>
             <w:tcBorders>
               <w:start w:val="single" w:sz="4" w:space="0" w:color="000000"/>
               <w:bottom w:val="single" w:sz="4" w:space="0" w:color="000000"/>
@@ -13678,7 +13994,7 @@
         </w:tc>
         <w:tc>
           <w:tcPr>
-            <w:tcW w:w="2426" w:type="dxa"/>
+            <w:tcW w:w="2525" w:type="dxa"/>
             <w:tcBorders>
               <w:start w:val="single" w:sz="4" w:space="0" w:color="000000"/>
               <w:bottom w:val="single" w:sz="4" w:space="0" w:color="000000"/>
@@ -13725,7 +14041,7 @@
         </w:tc>
         <w:tc>
           <w:tcPr>
-            <w:tcW w:w="1800" w:type="dxa"/>
+            <w:tcW w:w="1701" w:type="dxa"/>
             <w:tcBorders>
               <w:start w:val="single" w:sz="4" w:space="0" w:color="000000"/>
               <w:bottom w:val="single" w:sz="4" w:space="0" w:color="000000"/>
@@ -13772,7 +14088,7 @@
         </w:tc>
         <w:tc>
           <w:tcPr>
-            <w:tcW w:w="1357" w:type="dxa"/>
+            <w:tcW w:w="1358" w:type="dxa"/>
             <w:tcBorders>
               <w:start w:val="single" w:sz="4" w:space="0" w:color="000000"/>
               <w:bottom w:val="single" w:sz="4" w:space="0" w:color="000000"/>
@@ -13912,9 +14228,9 @@
       </w:tblPr>
       <w:tblGrid>
         <w:gridCol w:w="1678"/>
-        <w:gridCol w:w="2967"/>
+        <w:gridCol w:w="2966"/>
         <w:gridCol w:w="1884"/>
-        <w:gridCol w:w="1534"/>
+        <w:gridCol w:w="1535"/>
         <w:gridCol w:w="1909"/>
       </w:tblGrid>
       <w:tr>
@@ -13958,7 +14274,7 @@
         </w:tc>
         <w:tc>
           <w:tcPr>
-            <w:tcW w:w="2967" w:type="dxa"/>
+            <w:tcW w:w="2966" w:type="dxa"/>
             <w:tcBorders>
               <w:top w:val="single" w:sz="4" w:space="0" w:color="000000"/>
               <w:start w:val="single" w:sz="4" w:space="0" w:color="000000"/>
@@ -14032,7 +14348,7 @@
         </w:tc>
         <w:tc>
           <w:tcPr>
-            <w:tcW w:w="1534" w:type="dxa"/>
+            <w:tcW w:w="1535" w:type="dxa"/>
             <w:tcBorders>
               <w:top w:val="single" w:sz="4" w:space="0" w:color="000000"/>
               <w:start w:val="single" w:sz="4" w:space="0" w:color="000000"/>
@@ -14157,7 +14473,7 @@
         </w:tc>
         <w:tc>
           <w:tcPr>
-            <w:tcW w:w="2967" w:type="dxa"/>
+            <w:tcW w:w="2966" w:type="dxa"/>
             <w:tcBorders>
               <w:start w:val="single" w:sz="4" w:space="0" w:color="000000"/>
               <w:bottom w:val="single" w:sz="4" w:space="0" w:color="000000"/>
@@ -14236,7 +14552,7 @@
         </w:tc>
         <w:tc>
           <w:tcPr>
-            <w:tcW w:w="1534" w:type="dxa"/>
+            <w:tcW w:w="1535" w:type="dxa"/>
             <w:tcBorders>
               <w:start w:val="single" w:sz="4" w:space="0" w:color="000000"/>
               <w:bottom w:val="single" w:sz="4" w:space="0" w:color="000000"/>
@@ -14409,7 +14725,7 @@
         </w:tc>
         <w:tc>
           <w:tcPr>
-            <w:tcW w:w="2967" w:type="dxa"/>
+            <w:tcW w:w="2966" w:type="dxa"/>
             <w:tcBorders>
               <w:start w:val="single" w:sz="4" w:space="0" w:color="000000"/>
               <w:bottom w:val="single" w:sz="4" w:space="0" w:color="000000"/>
@@ -14909,7 +15225,7 @@
         </w:tc>
         <w:tc>
           <w:tcPr>
-            <w:tcW w:w="1534" w:type="dxa"/>
+            <w:tcW w:w="1535" w:type="dxa"/>
             <w:tcBorders>
               <w:start w:val="single" w:sz="4" w:space="0" w:color="000000"/>
               <w:bottom w:val="single" w:sz="4" w:space="0" w:color="000000"/>
@@ -15132,17 +15448,17 @@
         </w:tblCellMar>
       </w:tblPr>
       <w:tblGrid>
-        <w:gridCol w:w="1129"/>
+        <w:gridCol w:w="1128"/>
         <w:gridCol w:w="3600"/>
         <w:gridCol w:w="1444"/>
-        <w:gridCol w:w="1177"/>
+        <w:gridCol w:w="1178"/>
         <w:gridCol w:w="2622"/>
       </w:tblGrid>
       <w:tr>
         <w:trPr/>
         <w:tc>
           <w:tcPr>
-            <w:tcW w:w="1129" w:type="dxa"/>
+            <w:tcW w:w="1128" w:type="dxa"/>
             <w:tcBorders>
               <w:top w:val="single" w:sz="4" w:space="0" w:color="000000"/>
               <w:start w:val="single" w:sz="4" w:space="0" w:color="000000"/>
@@ -15253,7 +15569,7 @@
         </w:tc>
         <w:tc>
           <w:tcPr>
-            <w:tcW w:w="1177" w:type="dxa"/>
+            <w:tcW w:w="1178" w:type="dxa"/>
             <w:tcBorders>
               <w:top w:val="single" w:sz="4" w:space="0" w:color="000000"/>
               <w:start w:val="single" w:sz="4" w:space="0" w:color="000000"/>
@@ -15333,7 +15649,7 @@
         </w:trPr>
         <w:tc>
           <w:tcPr>
-            <w:tcW w:w="1129" w:type="dxa"/>
+            <w:tcW w:w="1128" w:type="dxa"/>
             <w:tcBorders>
               <w:start w:val="single" w:sz="4" w:space="0" w:color="000000"/>
               <w:bottom w:val="single" w:sz="4" w:space="0" w:color="000000"/>
@@ -15486,7 +15802,7 @@
         </w:tc>
         <w:tc>
           <w:tcPr>
-            <w:tcW w:w="1177" w:type="dxa"/>
+            <w:tcW w:w="1178" w:type="dxa"/>
             <w:tcBorders>
               <w:start w:val="single" w:sz="4" w:space="0" w:color="000000"/>
               <w:bottom w:val="single" w:sz="4" w:space="0" w:color="000000"/>
@@ -15624,7 +15940,7 @@
         <w:trPr/>
         <w:tc>
           <w:tcPr>
-            <w:tcW w:w="1129" w:type="dxa"/>
+            <w:tcW w:w="1128" w:type="dxa"/>
             <w:tcBorders>
               <w:start w:val="single" w:sz="4" w:space="0" w:color="000000"/>
               <w:bottom w:val="single" w:sz="4" w:space="0" w:color="000000"/>
@@ -16309,7 +16625,7 @@
         </w:tc>
         <w:tc>
           <w:tcPr>
-            <w:tcW w:w="1177" w:type="dxa"/>
+            <w:tcW w:w="1178" w:type="dxa"/>
             <w:tcBorders>
               <w:start w:val="single" w:sz="4" w:space="0" w:color="000000"/>
               <w:bottom w:val="single" w:sz="4" w:space="0" w:color="000000"/>
@@ -16483,7 +16799,7 @@
         <w:trPr/>
         <w:tc>
           <w:tcPr>
-            <w:tcW w:w="1129" w:type="dxa"/>
+            <w:tcW w:w="1128" w:type="dxa"/>
             <w:tcBorders>
               <w:start w:val="single" w:sz="4" w:space="0" w:color="000000"/>
               <w:bottom w:val="single" w:sz="4" w:space="0" w:color="000000"/>
@@ -16623,7 +16939,7 @@
         </w:tc>
         <w:tc>
           <w:tcPr>
-            <w:tcW w:w="1177" w:type="dxa"/>
+            <w:tcW w:w="1178" w:type="dxa"/>
             <w:tcBorders>
               <w:start w:val="single" w:sz="4" w:space="0" w:color="000000"/>
               <w:bottom w:val="single" w:sz="4" w:space="0" w:color="000000"/>
@@ -16721,7 +17037,7 @@
         <w:trPr/>
         <w:tc>
           <w:tcPr>
-            <w:tcW w:w="1129" w:type="dxa"/>
+            <w:tcW w:w="1128" w:type="dxa"/>
             <w:tcBorders>
               <w:start w:val="single" w:sz="4" w:space="0" w:color="000000"/>
               <w:bottom w:val="single" w:sz="4" w:space="0" w:color="000000"/>
@@ -17155,7 +17471,7 @@
         </w:tc>
         <w:tc>
           <w:tcPr>
-            <w:tcW w:w="1177" w:type="dxa"/>
+            <w:tcW w:w="1178" w:type="dxa"/>
             <w:tcBorders>
               <w:start w:val="single" w:sz="4" w:space="0" w:color="000000"/>
               <w:bottom w:val="single" w:sz="4" w:space="0" w:color="000000"/>
@@ -17329,7 +17645,7 @@
         <w:trPr/>
         <w:tc>
           <w:tcPr>
-            <w:tcW w:w="1129" w:type="dxa"/>
+            <w:tcW w:w="1128" w:type="dxa"/>
             <w:tcBorders>
               <w:start w:val="single" w:sz="4" w:space="0" w:color="000000"/>
               <w:bottom w:val="single" w:sz="4" w:space="0" w:color="000000"/>
@@ -17503,7 +17819,7 @@
         </w:tc>
         <w:tc>
           <w:tcPr>
-            <w:tcW w:w="1177" w:type="dxa"/>
+            <w:tcW w:w="1178" w:type="dxa"/>
             <w:tcBorders>
               <w:start w:val="single" w:sz="4" w:space="0" w:color="000000"/>
               <w:bottom w:val="single" w:sz="4" w:space="0" w:color="000000"/>
@@ -17601,7 +17917,7 @@
         <w:trPr/>
         <w:tc>
           <w:tcPr>
-            <w:tcW w:w="1129" w:type="dxa"/>
+            <w:tcW w:w="1128" w:type="dxa"/>
             <w:tcBorders>
               <w:start w:val="single" w:sz="4" w:space="0" w:color="000000"/>
               <w:bottom w:val="single" w:sz="4" w:space="0" w:color="000000"/>
@@ -17775,7 +18091,7 @@
         </w:tc>
         <w:tc>
           <w:tcPr>
-            <w:tcW w:w="1177" w:type="dxa"/>
+            <w:tcW w:w="1178" w:type="dxa"/>
             <w:tcBorders>
               <w:start w:val="single" w:sz="4" w:space="0" w:color="000000"/>
               <w:bottom w:val="single" w:sz="4" w:space="0" w:color="000000"/>
@@ -17873,7 +18189,7 @@
         <w:trPr/>
         <w:tc>
           <w:tcPr>
-            <w:tcW w:w="1129" w:type="dxa"/>
+            <w:tcW w:w="1128" w:type="dxa"/>
             <w:tcBorders>
               <w:start w:val="single" w:sz="4" w:space="0" w:color="000000"/>
               <w:bottom w:val="single" w:sz="4" w:space="0" w:color="000000"/>
@@ -18013,7 +18329,7 @@
         </w:tc>
         <w:tc>
           <w:tcPr>
-            <w:tcW w:w="1177" w:type="dxa"/>
+            <w:tcW w:w="1178" w:type="dxa"/>
             <w:tcBorders>
               <w:start w:val="single" w:sz="4" w:space="0" w:color="000000"/>
               <w:bottom w:val="single" w:sz="4" w:space="0" w:color="000000"/>
@@ -18162,8 +18478,8 @@
       </w:tblPr>
       <w:tblGrid>
         <w:gridCol w:w="1313"/>
-        <w:gridCol w:w="3332"/>
-        <w:gridCol w:w="1355"/>
+        <w:gridCol w:w="3331"/>
+        <w:gridCol w:w="1356"/>
         <w:gridCol w:w="1350"/>
         <w:gridCol w:w="2622"/>
       </w:tblGrid>
@@ -18208,7 +18524,7 @@
         </w:tc>
         <w:tc>
           <w:tcPr>
-            <w:tcW w:w="3332" w:type="dxa"/>
+            <w:tcW w:w="3331" w:type="dxa"/>
             <w:tcBorders>
               <w:top w:val="single" w:sz="4" w:space="0" w:color="000000"/>
               <w:start w:val="single" w:sz="4" w:space="0" w:color="000000"/>
@@ -18245,7 +18561,7 @@
         </w:tc>
         <w:tc>
           <w:tcPr>
-            <w:tcW w:w="1355" w:type="dxa"/>
+            <w:tcW w:w="1356" w:type="dxa"/>
             <w:tcBorders>
               <w:top w:val="single" w:sz="4" w:space="0" w:color="000000"/>
               <w:start w:val="single" w:sz="4" w:space="0" w:color="000000"/>
@@ -18407,7 +18723,7 @@
         </w:tc>
         <w:tc>
           <w:tcPr>
-            <w:tcW w:w="3332" w:type="dxa"/>
+            <w:tcW w:w="3331" w:type="dxa"/>
             <w:tcBorders>
               <w:start w:val="single" w:sz="4" w:space="0" w:color="000000"/>
               <w:bottom w:val="single" w:sz="4" w:space="0" w:color="000000"/>
@@ -18678,7 +18994,7 @@
         </w:tc>
         <w:tc>
           <w:tcPr>
-            <w:tcW w:w="1355" w:type="dxa"/>
+            <w:tcW w:w="1356" w:type="dxa"/>
             <w:tcBorders>
               <w:start w:val="single" w:sz="4" w:space="0" w:color="000000"/>
               <w:bottom w:val="single" w:sz="4" w:space="0" w:color="000000"/>
@@ -18888,17 +19204,17 @@
         </w:tblCellMar>
       </w:tblPr>
       <w:tblGrid>
-        <w:gridCol w:w="2151"/>
+        <w:gridCol w:w="2150"/>
         <w:gridCol w:w="1800"/>
         <w:gridCol w:w="1894"/>
-        <w:gridCol w:w="1899"/>
+        <w:gridCol w:w="1900"/>
         <w:gridCol w:w="2228"/>
       </w:tblGrid>
       <w:tr>
         <w:trPr/>
         <w:tc>
           <w:tcPr>
-            <w:tcW w:w="2151" w:type="dxa"/>
+            <w:tcW w:w="2150" w:type="dxa"/>
             <w:tcBorders>
               <w:top w:val="single" w:sz="4" w:space="0" w:color="000000"/>
               <w:start w:val="single" w:sz="4" w:space="0" w:color="000000"/>
@@ -19009,7 +19325,7 @@
         </w:tc>
         <w:tc>
           <w:tcPr>
-            <w:tcW w:w="1899" w:type="dxa"/>
+            <w:tcW w:w="1900" w:type="dxa"/>
             <w:tcBorders>
               <w:top w:val="single" w:sz="4" w:space="0" w:color="000000"/>
               <w:start w:val="single" w:sz="4" w:space="0" w:color="000000"/>
@@ -19087,7 +19403,7 @@
         <w:trPr/>
         <w:tc>
           <w:tcPr>
-            <w:tcW w:w="2151" w:type="dxa"/>
+            <w:tcW w:w="2150" w:type="dxa"/>
             <w:tcBorders>
               <w:start w:val="single" w:sz="4" w:space="0" w:color="000000"/>
               <w:bottom w:val="single" w:sz="4" w:space="0" w:color="000000"/>
@@ -19193,7 +19509,7 @@
         </w:tc>
         <w:tc>
           <w:tcPr>
-            <w:tcW w:w="1899" w:type="dxa"/>
+            <w:tcW w:w="1900" w:type="dxa"/>
             <w:tcBorders>
               <w:start w:val="single" w:sz="4" w:space="0" w:color="000000"/>
               <w:bottom w:val="single" w:sz="4" w:space="0" w:color="000000"/>
@@ -19269,7 +19585,7 @@
         <w:trPr/>
         <w:tc>
           <w:tcPr>
-            <w:tcW w:w="2151" w:type="dxa"/>
+            <w:tcW w:w="2150" w:type="dxa"/>
             <w:tcBorders>
               <w:start w:val="single" w:sz="4" w:space="0" w:color="000000"/>
               <w:bottom w:val="single" w:sz="4" w:space="0" w:color="000000"/>
@@ -19376,7 +19692,7 @@
         </w:tc>
         <w:tc>
           <w:tcPr>
-            <w:tcW w:w="1899" w:type="dxa"/>
+            <w:tcW w:w="1900" w:type="dxa"/>
             <w:tcBorders>
               <w:start w:val="single" w:sz="4" w:space="0" w:color="000000"/>
               <w:bottom w:val="single" w:sz="4" w:space="0" w:color="000000"/>
@@ -19452,7 +19768,7 @@
         <w:trPr/>
         <w:tc>
           <w:tcPr>
-            <w:tcW w:w="2151" w:type="dxa"/>
+            <w:tcW w:w="2150" w:type="dxa"/>
             <w:tcBorders>
               <w:start w:val="single" w:sz="4" w:space="0" w:color="000000"/>
               <w:bottom w:val="single" w:sz="4" w:space="0" w:color="000000"/>
@@ -19559,7 +19875,7 @@
         </w:tc>
         <w:tc>
           <w:tcPr>
-            <w:tcW w:w="1899" w:type="dxa"/>
+            <w:tcW w:w="1900" w:type="dxa"/>
             <w:tcBorders>
               <w:start w:val="single" w:sz="4" w:space="0" w:color="000000"/>
               <w:bottom w:val="single" w:sz="4" w:space="0" w:color="000000"/>
@@ -20962,9 +21278,9 @@
       </w:tblPr>
       <w:tblGrid>
         <w:gridCol w:w="1350"/>
-        <w:gridCol w:w="2927"/>
+        <w:gridCol w:w="2926"/>
         <w:gridCol w:w="1800"/>
-        <w:gridCol w:w="1357"/>
+        <w:gridCol w:w="1358"/>
         <w:gridCol w:w="2538"/>
       </w:tblGrid>
       <w:tr>
@@ -21008,7 +21324,7 @@
         </w:tc>
         <w:tc>
           <w:tcPr>
-            <w:tcW w:w="2927" w:type="dxa"/>
+            <w:tcW w:w="2926" w:type="dxa"/>
             <w:tcBorders>
               <w:top w:val="single" w:sz="4" w:space="0" w:color="000000"/>
               <w:start w:val="single" w:sz="4" w:space="0" w:color="000000"/>
@@ -21082,7 +21398,7 @@
         </w:tc>
         <w:tc>
           <w:tcPr>
-            <w:tcW w:w="1357" w:type="dxa"/>
+            <w:tcW w:w="1358" w:type="dxa"/>
             <w:tcBorders>
               <w:top w:val="single" w:sz="4" w:space="0" w:color="000000"/>
               <w:start w:val="single" w:sz="4" w:space="0" w:color="000000"/>
@@ -21207,7 +21523,7 @@
         </w:tc>
         <w:tc>
           <w:tcPr>
-            <w:tcW w:w="2927" w:type="dxa"/>
+            <w:tcW w:w="2926" w:type="dxa"/>
             <w:tcBorders>
               <w:start w:val="single" w:sz="4" w:space="0" w:color="000000"/>
               <w:bottom w:val="single" w:sz="4" w:space="0" w:color="000000"/>
@@ -21335,7 +21651,7 @@
         </w:tc>
         <w:tc>
           <w:tcPr>
-            <w:tcW w:w="1357" w:type="dxa"/>
+            <w:tcW w:w="1358" w:type="dxa"/>
             <w:tcBorders>
               <w:start w:val="single" w:sz="4" w:space="0" w:color="000000"/>
               <w:bottom w:val="single" w:sz="4" w:space="0" w:color="000000"/>
@@ -21480,7 +21796,7 @@
         </w:tc>
         <w:tc>
           <w:tcPr>
-            <w:tcW w:w="2927" w:type="dxa"/>
+            <w:tcW w:w="2926" w:type="dxa"/>
             <w:tcBorders>
               <w:start w:val="single" w:sz="4" w:space="0" w:color="000000"/>
               <w:bottom w:val="single" w:sz="4" w:space="0" w:color="000000"/>
@@ -21591,7 +21907,7 @@
         </w:tc>
         <w:tc>
           <w:tcPr>
-            <w:tcW w:w="1357" w:type="dxa"/>
+            <w:tcW w:w="1358" w:type="dxa"/>
             <w:tcBorders>
               <w:start w:val="single" w:sz="4" w:space="0" w:color="000000"/>
               <w:bottom w:val="single" w:sz="4" w:space="0" w:color="000000"/>
@@ -21736,7 +22052,7 @@
         </w:tc>
         <w:tc>
           <w:tcPr>
-            <w:tcW w:w="2927" w:type="dxa"/>
+            <w:tcW w:w="2926" w:type="dxa"/>
             <w:tcBorders>
               <w:start w:val="single" w:sz="4" w:space="0" w:color="000000"/>
               <w:bottom w:val="single" w:sz="4" w:space="0" w:color="000000"/>
@@ -21847,7 +22163,7 @@
         </w:tc>
         <w:tc>
           <w:tcPr>
-            <w:tcW w:w="1357" w:type="dxa"/>
+            <w:tcW w:w="1358" w:type="dxa"/>
             <w:tcBorders>
               <w:start w:val="single" w:sz="4" w:space="0" w:color="000000"/>
               <w:bottom w:val="single" w:sz="4" w:space="0" w:color="000000"/>
@@ -21992,7 +22308,7 @@
         </w:tc>
         <w:tc>
           <w:tcPr>
-            <w:tcW w:w="2927" w:type="dxa"/>
+            <w:tcW w:w="2926" w:type="dxa"/>
             <w:tcBorders>
               <w:start w:val="single" w:sz="4" w:space="0" w:color="000000"/>
               <w:bottom w:val="single" w:sz="4" w:space="0" w:color="000000"/>
@@ -22103,7 +22419,7 @@
         </w:tc>
         <w:tc>
           <w:tcPr>
-            <w:tcW w:w="1357" w:type="dxa"/>
+            <w:tcW w:w="1358" w:type="dxa"/>
             <w:tcBorders>
               <w:start w:val="single" w:sz="4" w:space="0" w:color="000000"/>
               <w:bottom w:val="single" w:sz="4" w:space="0" w:color="000000"/>
@@ -22248,7 +22564,7 @@
         </w:tc>
         <w:tc>
           <w:tcPr>
-            <w:tcW w:w="2927" w:type="dxa"/>
+            <w:tcW w:w="2926" w:type="dxa"/>
             <w:tcBorders>
               <w:start w:val="single" w:sz="4" w:space="0" w:color="000000"/>
               <w:bottom w:val="single" w:sz="4" w:space="0" w:color="000000"/>
@@ -22359,7 +22675,7 @@
         </w:tc>
         <w:tc>
           <w:tcPr>
-            <w:tcW w:w="1357" w:type="dxa"/>
+            <w:tcW w:w="1358" w:type="dxa"/>
             <w:tcBorders>
               <w:start w:val="single" w:sz="4" w:space="0" w:color="000000"/>
               <w:bottom w:val="single" w:sz="4" w:space="0" w:color="000000"/>
@@ -22504,7 +22820,7 @@
         </w:tc>
         <w:tc>
           <w:tcPr>
-            <w:tcW w:w="2927" w:type="dxa"/>
+            <w:tcW w:w="2926" w:type="dxa"/>
             <w:tcBorders>
               <w:start w:val="single" w:sz="4" w:space="0" w:color="000000"/>
               <w:bottom w:val="single" w:sz="4" w:space="0" w:color="000000"/>
@@ -22598,7 +22914,7 @@
         </w:tc>
         <w:tc>
           <w:tcPr>
-            <w:tcW w:w="1357" w:type="dxa"/>
+            <w:tcW w:w="1358" w:type="dxa"/>
             <w:tcBorders>
               <w:start w:val="single" w:sz="4" w:space="0" w:color="000000"/>
               <w:bottom w:val="single" w:sz="4" w:space="0" w:color="000000"/>
@@ -22743,7 +23059,7 @@
         </w:tc>
         <w:tc>
           <w:tcPr>
-            <w:tcW w:w="2927" w:type="dxa"/>
+            <w:tcW w:w="2926" w:type="dxa"/>
             <w:tcBorders>
               <w:start w:val="single" w:sz="4" w:space="0" w:color="000000"/>
               <w:bottom w:val="single" w:sz="4" w:space="0" w:color="000000"/>
@@ -22837,7 +23153,7 @@
         </w:tc>
         <w:tc>
           <w:tcPr>
-            <w:tcW w:w="1357" w:type="dxa"/>
+            <w:tcW w:w="1358" w:type="dxa"/>
             <w:tcBorders>
               <w:start w:val="single" w:sz="4" w:space="0" w:color="000000"/>
               <w:bottom w:val="single" w:sz="4" w:space="0" w:color="000000"/>
@@ -22982,7 +23298,7 @@
         </w:tc>
         <w:tc>
           <w:tcPr>
-            <w:tcW w:w="2927" w:type="dxa"/>
+            <w:tcW w:w="2926" w:type="dxa"/>
             <w:tcBorders>
               <w:start w:val="single" w:sz="4" w:space="0" w:color="000000"/>
               <w:bottom w:val="single" w:sz="4" w:space="0" w:color="000000"/>
@@ -23076,7 +23392,7 @@
         </w:tc>
         <w:tc>
           <w:tcPr>
-            <w:tcW w:w="1357" w:type="dxa"/>
+            <w:tcW w:w="1358" w:type="dxa"/>
             <w:tcBorders>
               <w:start w:val="single" w:sz="4" w:space="0" w:color="000000"/>
               <w:bottom w:val="single" w:sz="4" w:space="0" w:color="000000"/>
@@ -23221,7 +23537,7 @@
         </w:tc>
         <w:tc>
           <w:tcPr>
-            <w:tcW w:w="2927" w:type="dxa"/>
+            <w:tcW w:w="2926" w:type="dxa"/>
             <w:tcBorders>
               <w:start w:val="single" w:sz="4" w:space="0" w:color="000000"/>
               <w:bottom w:val="single" w:sz="4" w:space="0" w:color="000000"/>
@@ -23315,7 +23631,7 @@
         </w:tc>
         <w:tc>
           <w:tcPr>
-            <w:tcW w:w="1357" w:type="dxa"/>
+            <w:tcW w:w="1358" w:type="dxa"/>
             <w:tcBorders>
               <w:start w:val="single" w:sz="4" w:space="0" w:color="000000"/>
               <w:bottom w:val="single" w:sz="4" w:space="0" w:color="000000"/>
@@ -23460,7 +23776,7 @@
         </w:tc>
         <w:tc>
           <w:tcPr>
-            <w:tcW w:w="2927" w:type="dxa"/>
+            <w:tcW w:w="2926" w:type="dxa"/>
             <w:tcBorders>
               <w:start w:val="single" w:sz="4" w:space="0" w:color="000000"/>
               <w:bottom w:val="single" w:sz="4" w:space="0" w:color="000000"/>
@@ -23554,7 +23870,7 @@
         </w:tc>
         <w:tc>
           <w:tcPr>
-            <w:tcW w:w="1357" w:type="dxa"/>
+            <w:tcW w:w="1358" w:type="dxa"/>
             <w:tcBorders>
               <w:start w:val="single" w:sz="4" w:space="0" w:color="000000"/>
               <w:bottom w:val="single" w:sz="4" w:space="0" w:color="000000"/>
@@ -23699,7 +24015,7 @@
         </w:tc>
         <w:tc>
           <w:tcPr>
-            <w:tcW w:w="2927" w:type="dxa"/>
+            <w:tcW w:w="2926" w:type="dxa"/>
             <w:tcBorders>
               <w:start w:val="single" w:sz="4" w:space="0" w:color="000000"/>
               <w:bottom w:val="single" w:sz="4" w:space="0" w:color="000000"/>
@@ -23793,7 +24109,7 @@
         </w:tc>
         <w:tc>
           <w:tcPr>
-            <w:tcW w:w="1357" w:type="dxa"/>
+            <w:tcW w:w="1358" w:type="dxa"/>
             <w:tcBorders>
               <w:start w:val="single" w:sz="4" w:space="0" w:color="000000"/>
               <w:bottom w:val="single" w:sz="4" w:space="0" w:color="000000"/>
@@ -23925,7 +24241,7 @@
         </w:tc>
         <w:tc>
           <w:tcPr>
-            <w:tcW w:w="2927" w:type="dxa"/>
+            <w:tcW w:w="2926" w:type="dxa"/>
             <w:tcBorders>
               <w:start w:val="single" w:sz="4" w:space="0" w:color="000000"/>
               <w:bottom w:val="single" w:sz="4" w:space="0" w:color="000000"/>
@@ -24036,7 +24352,7 @@
         </w:tc>
         <w:tc>
           <w:tcPr>
-            <w:tcW w:w="1357" w:type="dxa"/>
+            <w:tcW w:w="1358" w:type="dxa"/>
             <w:tcBorders>
               <w:start w:val="single" w:sz="4" w:space="0" w:color="000000"/>
               <w:bottom w:val="single" w:sz="4" w:space="0" w:color="000000"/>
@@ -24181,7 +24497,7 @@
         </w:tc>
         <w:tc>
           <w:tcPr>
-            <w:tcW w:w="2927" w:type="dxa"/>
+            <w:tcW w:w="2926" w:type="dxa"/>
             <w:tcBorders>
               <w:start w:val="single" w:sz="4" w:space="0" w:color="000000"/>
               <w:bottom w:val="single" w:sz="4" w:space="0" w:color="000000"/>
@@ -24275,7 +24591,7 @@
         </w:tc>
         <w:tc>
           <w:tcPr>
-            <w:tcW w:w="1357" w:type="dxa"/>
+            <w:tcW w:w="1358" w:type="dxa"/>
             <w:tcBorders>
               <w:start w:val="single" w:sz="4" w:space="0" w:color="000000"/>
               <w:bottom w:val="single" w:sz="4" w:space="0" w:color="000000"/>
@@ -24420,7 +24736,7 @@
         </w:tc>
         <w:tc>
           <w:tcPr>
-            <w:tcW w:w="2927" w:type="dxa"/>
+            <w:tcW w:w="2926" w:type="dxa"/>
             <w:tcBorders>
               <w:start w:val="single" w:sz="4" w:space="0" w:color="000000"/>
               <w:bottom w:val="single" w:sz="4" w:space="0" w:color="000000"/>
@@ -24514,7 +24830,7 @@
         </w:tc>
         <w:tc>
           <w:tcPr>
-            <w:tcW w:w="1357" w:type="dxa"/>
+            <w:tcW w:w="1358" w:type="dxa"/>
             <w:tcBorders>
               <w:start w:val="single" w:sz="4" w:space="0" w:color="000000"/>
               <w:bottom w:val="single" w:sz="4" w:space="0" w:color="000000"/>
@@ -24660,7 +24976,7 @@
         </w:tc>
         <w:tc>
           <w:tcPr>
-            <w:tcW w:w="2927" w:type="dxa"/>
+            <w:tcW w:w="2926" w:type="dxa"/>
             <w:tcBorders>
               <w:start w:val="single" w:sz="4" w:space="0" w:color="000000"/>
               <w:bottom w:val="single" w:sz="4" w:space="0" w:color="000000"/>
@@ -24754,7 +25070,7 @@
         </w:tc>
         <w:tc>
           <w:tcPr>
-            <w:tcW w:w="1357" w:type="dxa"/>
+            <w:tcW w:w="1358" w:type="dxa"/>
             <w:tcBorders>
               <w:start w:val="single" w:sz="4" w:space="0" w:color="000000"/>
               <w:bottom w:val="single" w:sz="4" w:space="0" w:color="000000"/>
@@ -24899,7 +25215,7 @@
         </w:tc>
         <w:tc>
           <w:tcPr>
-            <w:tcW w:w="2927" w:type="dxa"/>
+            <w:tcW w:w="2926" w:type="dxa"/>
             <w:tcBorders>
               <w:start w:val="single" w:sz="4" w:space="0" w:color="000000"/>
               <w:bottom w:val="single" w:sz="4" w:space="0" w:color="000000"/>
@@ -24993,7 +25309,7 @@
         </w:tc>
         <w:tc>
           <w:tcPr>
-            <w:tcW w:w="1357" w:type="dxa"/>
+            <w:tcW w:w="1358" w:type="dxa"/>
             <w:tcBorders>
               <w:start w:val="single" w:sz="4" w:space="0" w:color="000000"/>
               <w:bottom w:val="single" w:sz="4" w:space="0" w:color="000000"/>
@@ -25136,7 +25452,7 @@
         </w:tc>
         <w:tc>
           <w:tcPr>
-            <w:tcW w:w="2927" w:type="dxa"/>
+            <w:tcW w:w="2926" w:type="dxa"/>
             <w:tcBorders>
               <w:start w:val="single" w:sz="4" w:space="0" w:color="000000"/>
               <w:bottom w:val="single" w:sz="4" w:space="0" w:color="000000"/>
@@ -25247,7 +25563,7 @@
         </w:tc>
         <w:tc>
           <w:tcPr>
-            <w:tcW w:w="1357" w:type="dxa"/>
+            <w:tcW w:w="1358" w:type="dxa"/>
             <w:tcBorders>
               <w:start w:val="single" w:sz="4" w:space="0" w:color="000000"/>
               <w:bottom w:val="single" w:sz="4" w:space="0" w:color="000000"/>
@@ -25395,9 +25711,9 @@
         </w:tblCellMar>
       </w:tblPr>
       <w:tblGrid>
-        <w:gridCol w:w="1129"/>
+        <w:gridCol w:w="1128"/>
         <w:gridCol w:w="3516"/>
-        <w:gridCol w:w="1355"/>
+        <w:gridCol w:w="1356"/>
         <w:gridCol w:w="1350"/>
         <w:gridCol w:w="2622"/>
       </w:tblGrid>
@@ -25405,7 +25721,7 @@
         <w:trPr/>
         <w:tc>
           <w:tcPr>
-            <w:tcW w:w="1129" w:type="dxa"/>
+            <w:tcW w:w="1128" w:type="dxa"/>
             <w:tcBorders>
               <w:top w:val="single" w:sz="4" w:space="0" w:color="000000"/>
               <w:start w:val="single" w:sz="4" w:space="0" w:color="000000"/>
@@ -25479,7 +25795,7 @@
         </w:tc>
         <w:tc>
           <w:tcPr>
-            <w:tcW w:w="1355" w:type="dxa"/>
+            <w:tcW w:w="1356" w:type="dxa"/>
             <w:tcBorders>
               <w:top w:val="single" w:sz="4" w:space="0" w:color="000000"/>
               <w:start w:val="single" w:sz="4" w:space="0" w:color="000000"/>
@@ -25594,7 +25910,7 @@
         <w:trPr/>
         <w:tc>
           <w:tcPr>
-            <w:tcW w:w="1129" w:type="dxa"/>
+            <w:tcW w:w="1128" w:type="dxa"/>
             <w:tcBorders>
               <w:start w:val="single" w:sz="4" w:space="0" w:color="000000"/>
               <w:bottom w:val="single" w:sz="4" w:space="0" w:color="000000"/>
@@ -25688,7 +26004,7 @@
         </w:tc>
         <w:tc>
           <w:tcPr>
-            <w:tcW w:w="1355" w:type="dxa"/>
+            <w:tcW w:w="1356" w:type="dxa"/>
             <w:tcBorders>
               <w:start w:val="single" w:sz="4" w:space="0" w:color="000000"/>
               <w:bottom w:val="single" w:sz="4" w:space="0" w:color="000000"/>
@@ -25885,7 +26201,7 @@
         <w:trPr/>
         <w:tc>
           <w:tcPr>
-            <w:tcW w:w="1129" w:type="dxa"/>
+            <w:tcW w:w="1128" w:type="dxa"/>
             <w:tcBorders>
               <w:start w:val="single" w:sz="4" w:space="0" w:color="000000"/>
               <w:bottom w:val="single" w:sz="4" w:space="0" w:color="000000"/>
@@ -26523,7 +26839,7 @@
         </w:tc>
         <w:tc>
           <w:tcPr>
-            <w:tcW w:w="1355" w:type="dxa"/>
+            <w:tcW w:w="1356" w:type="dxa"/>
             <w:tcBorders>
               <w:start w:val="single" w:sz="4" w:space="0" w:color="000000"/>
               <w:bottom w:val="single" w:sz="4" w:space="0" w:color="000000"/>
@@ -26744,7 +27060,7 @@
         <w:trPr/>
         <w:tc>
           <w:tcPr>
-            <w:tcW w:w="1129" w:type="dxa"/>
+            <w:tcW w:w="1128" w:type="dxa"/>
             <w:tcBorders>
               <w:start w:val="single" w:sz="4" w:space="0" w:color="000000"/>
               <w:bottom w:val="single" w:sz="4" w:space="0" w:color="000000"/>
@@ -26837,7 +27153,7 @@
         </w:tc>
         <w:tc>
           <w:tcPr>
-            <w:tcW w:w="1355" w:type="dxa"/>
+            <w:tcW w:w="1356" w:type="dxa"/>
             <w:tcBorders>
               <w:start w:val="single" w:sz="4" w:space="0" w:color="000000"/>
               <w:bottom w:val="single" w:sz="4" w:space="0" w:color="000000"/>
@@ -26982,7 +27298,7 @@
         <w:trPr/>
         <w:tc>
           <w:tcPr>
-            <w:tcW w:w="1129" w:type="dxa"/>
+            <w:tcW w:w="1128" w:type="dxa"/>
             <w:tcBorders>
               <w:start w:val="single" w:sz="4" w:space="0" w:color="000000"/>
               <w:bottom w:val="single" w:sz="4" w:space="0" w:color="000000"/>
@@ -27109,7 +27425,7 @@
         </w:tc>
         <w:tc>
           <w:tcPr>
-            <w:tcW w:w="1355" w:type="dxa"/>
+            <w:tcW w:w="1356" w:type="dxa"/>
             <w:tcBorders>
               <w:start w:val="single" w:sz="4" w:space="0" w:color="000000"/>
               <w:bottom w:val="single" w:sz="4" w:space="0" w:color="000000"/>
@@ -27254,7 +27570,7 @@
         <w:trPr/>
         <w:tc>
           <w:tcPr>
-            <w:tcW w:w="1129" w:type="dxa"/>
+            <w:tcW w:w="1128" w:type="dxa"/>
             <w:tcBorders>
               <w:start w:val="single" w:sz="4" w:space="0" w:color="000000"/>
               <w:bottom w:val="single" w:sz="4" w:space="0" w:color="000000"/>
@@ -27381,7 +27697,7 @@
         </w:tc>
         <w:tc>
           <w:tcPr>
-            <w:tcW w:w="1355" w:type="dxa"/>
+            <w:tcW w:w="1356" w:type="dxa"/>
             <w:tcBorders>
               <w:start w:val="single" w:sz="4" w:space="0" w:color="000000"/>
               <w:bottom w:val="single" w:sz="4" w:space="0" w:color="000000"/>
@@ -27595,8 +27911,8 @@
         <w:gridCol w:w="1678"/>
         <w:gridCol w:w="1800"/>
         <w:gridCol w:w="2522"/>
-        <w:gridCol w:w="1879"/>
-        <w:gridCol w:w="2093"/>
+        <w:gridCol w:w="1878"/>
+        <w:gridCol w:w="2094"/>
       </w:tblGrid>
       <w:tr>
         <w:trPr/>
@@ -27713,7 +28029,7 @@
         </w:tc>
         <w:tc>
           <w:tcPr>
-            <w:tcW w:w="1879" w:type="dxa"/>
+            <w:tcW w:w="1878" w:type="dxa"/>
             <w:tcBorders>
               <w:top w:val="single" w:sz="4" w:space="0" w:color="000000"/>
               <w:start w:val="single" w:sz="4" w:space="0" w:color="000000"/>
@@ -27750,7 +28066,7 @@
         </w:tc>
         <w:tc>
           <w:tcPr>
-            <w:tcW w:w="2093" w:type="dxa"/>
+            <w:tcW w:w="2094" w:type="dxa"/>
             <w:tcBorders>
               <w:top w:val="single" w:sz="4" w:space="0" w:color="000000"/>
               <w:start w:val="single" w:sz="4" w:space="0" w:color="000000"/>
@@ -27897,7 +28213,7 @@
         </w:tc>
         <w:tc>
           <w:tcPr>
-            <w:tcW w:w="1879" w:type="dxa"/>
+            <w:tcW w:w="1878" w:type="dxa"/>
             <w:tcBorders>
               <w:start w:val="single" w:sz="4" w:space="0" w:color="000000"/>
               <w:bottom w:val="single" w:sz="4" w:space="0" w:color="000000"/>
@@ -27933,7 +28249,7 @@
         </w:tc>
         <w:tc>
           <w:tcPr>
-            <w:tcW w:w="2093" w:type="dxa"/>
+            <w:tcW w:w="2094" w:type="dxa"/>
             <w:tcBorders>
               <w:start w:val="single" w:sz="4" w:space="0" w:color="000000"/>
               <w:bottom w:val="single" w:sz="4" w:space="0" w:color="000000"/>
@@ -28080,7 +28396,7 @@
         </w:tc>
         <w:tc>
           <w:tcPr>
-            <w:tcW w:w="1879" w:type="dxa"/>
+            <w:tcW w:w="1878" w:type="dxa"/>
             <w:tcBorders>
               <w:start w:val="single" w:sz="4" w:space="0" w:color="000000"/>
               <w:bottom w:val="single" w:sz="4" w:space="0" w:color="000000"/>
@@ -28116,7 +28432,7 @@
         </w:tc>
         <w:tc>
           <w:tcPr>
-            <w:tcW w:w="2093" w:type="dxa"/>
+            <w:tcW w:w="2094" w:type="dxa"/>
             <w:tcBorders>
               <w:start w:val="single" w:sz="4" w:space="0" w:color="000000"/>
               <w:bottom w:val="single" w:sz="4" w:space="0" w:color="000000"/>
@@ -28263,7 +28579,7 @@
         </w:tc>
         <w:tc>
           <w:tcPr>
-            <w:tcW w:w="1879" w:type="dxa"/>
+            <w:tcW w:w="1878" w:type="dxa"/>
             <w:tcBorders>
               <w:start w:val="single" w:sz="4" w:space="0" w:color="000000"/>
               <w:bottom w:val="single" w:sz="4" w:space="0" w:color="000000"/>
@@ -28299,7 +28615,7 @@
         </w:tc>
         <w:tc>
           <w:tcPr>
-            <w:tcW w:w="2093" w:type="dxa"/>
+            <w:tcW w:w="2094" w:type="dxa"/>
             <w:tcBorders>
               <w:start w:val="single" w:sz="4" w:space="0" w:color="000000"/>
               <w:bottom w:val="single" w:sz="4" w:space="0" w:color="000000"/>
@@ -28381,9 +28697,9 @@
       </w:tblPr>
       <w:tblGrid>
         <w:gridCol w:w="1678"/>
-        <w:gridCol w:w="2599"/>
+        <w:gridCol w:w="2598"/>
         <w:gridCol w:w="1800"/>
-        <w:gridCol w:w="1357"/>
+        <w:gridCol w:w="1358"/>
         <w:gridCol w:w="2538"/>
       </w:tblGrid>
       <w:tr>
@@ -28427,7 +28743,7 @@
         </w:tc>
         <w:tc>
           <w:tcPr>
-            <w:tcW w:w="2599" w:type="dxa"/>
+            <w:tcW w:w="2598" w:type="dxa"/>
             <w:tcBorders>
               <w:top w:val="single" w:sz="4" w:space="0" w:color="000000"/>
               <w:start w:val="single" w:sz="4" w:space="0" w:color="000000"/>
@@ -28501,7 +28817,7 @@
         </w:tc>
         <w:tc>
           <w:tcPr>
-            <w:tcW w:w="1357" w:type="dxa"/>
+            <w:tcW w:w="1358" w:type="dxa"/>
             <w:tcBorders>
               <w:top w:val="single" w:sz="4" w:space="0" w:color="000000"/>
               <w:start w:val="single" w:sz="4" w:space="0" w:color="000000"/>
@@ -28626,7 +28942,7 @@
         </w:tc>
         <w:tc>
           <w:tcPr>
-            <w:tcW w:w="2599" w:type="dxa"/>
+            <w:tcW w:w="2598" w:type="dxa"/>
             <w:tcBorders>
               <w:start w:val="single" w:sz="4" w:space="0" w:color="000000"/>
               <w:bottom w:val="single" w:sz="4" w:space="0" w:color="000000"/>
@@ -28788,7 +29104,7 @@
         </w:tc>
         <w:tc>
           <w:tcPr>
-            <w:tcW w:w="1357" w:type="dxa"/>
+            <w:tcW w:w="1358" w:type="dxa"/>
             <w:tcBorders>
               <w:start w:val="single" w:sz="4" w:space="0" w:color="000000"/>
               <w:bottom w:val="single" w:sz="4" w:space="0" w:color="000000"/>
@@ -28933,7 +29249,7 @@
         </w:tc>
         <w:tc>
           <w:tcPr>
-            <w:tcW w:w="2599" w:type="dxa"/>
+            <w:tcW w:w="2598" w:type="dxa"/>
             <w:tcBorders>
               <w:start w:val="single" w:sz="4" w:space="0" w:color="000000"/>
               <w:bottom w:val="single" w:sz="4" w:space="0" w:color="000000"/>
@@ -29037,7 +29353,7 @@
         </w:tc>
         <w:tc>
           <w:tcPr>
-            <w:tcW w:w="1357" w:type="dxa"/>
+            <w:tcW w:w="1358" w:type="dxa"/>
             <w:tcBorders>
               <w:start w:val="single" w:sz="4" w:space="0" w:color="000000"/>
               <w:bottom w:val="single" w:sz="4" w:space="0" w:color="000000"/>
@@ -29182,7 +29498,7 @@
         </w:tc>
         <w:tc>
           <w:tcPr>
-            <w:tcW w:w="2599" w:type="dxa"/>
+            <w:tcW w:w="2598" w:type="dxa"/>
             <w:tcBorders>
               <w:start w:val="single" w:sz="4" w:space="0" w:color="000000"/>
               <w:bottom w:val="single" w:sz="4" w:space="0" w:color="000000"/>
@@ -29323,7 +29639,7 @@
         </w:tc>
         <w:tc>
           <w:tcPr>
-            <w:tcW w:w="1357" w:type="dxa"/>
+            <w:tcW w:w="1358" w:type="dxa"/>
             <w:tcBorders>
               <w:start w:val="single" w:sz="4" w:space="0" w:color="000000"/>
               <w:bottom w:val="single" w:sz="4" w:space="0" w:color="000000"/>
@@ -29468,7 +29784,7 @@
         </w:tc>
         <w:tc>
           <w:tcPr>
-            <w:tcW w:w="2599" w:type="dxa"/>
+            <w:tcW w:w="2598" w:type="dxa"/>
             <w:tcBorders>
               <w:start w:val="single" w:sz="4" w:space="0" w:color="000000"/>
               <w:bottom w:val="single" w:sz="4" w:space="0" w:color="000000"/>
@@ -29555,7 +29871,7 @@
         </w:tc>
         <w:tc>
           <w:tcPr>
-            <w:tcW w:w="1357" w:type="dxa"/>
+            <w:tcW w:w="1358" w:type="dxa"/>
             <w:tcBorders>
               <w:start w:val="single" w:sz="4" w:space="0" w:color="000000"/>
               <w:bottom w:val="single" w:sz="4" w:space="0" w:color="000000"/>
@@ -29700,7 +30016,7 @@
         </w:tc>
         <w:tc>
           <w:tcPr>
-            <w:tcW w:w="2599" w:type="dxa"/>
+            <w:tcW w:w="2598" w:type="dxa"/>
             <w:tcBorders>
               <w:start w:val="single" w:sz="4" w:space="0" w:color="000000"/>
               <w:bottom w:val="single" w:sz="4" w:space="0" w:color="000000"/>
@@ -29803,7 +30119,7 @@
         </w:tc>
         <w:tc>
           <w:tcPr>
-            <w:tcW w:w="1357" w:type="dxa"/>
+            <w:tcW w:w="1358" w:type="dxa"/>
             <w:tcBorders>
               <w:start w:val="single" w:sz="4" w:space="0" w:color="000000"/>
               <w:bottom w:val="single" w:sz="4" w:space="0" w:color="000000"/>
@@ -29935,7 +30251,7 @@
         </w:tc>
         <w:tc>
           <w:tcPr>
-            <w:tcW w:w="2599" w:type="dxa"/>
+            <w:tcW w:w="2598" w:type="dxa"/>
             <w:tcBorders>
               <w:start w:val="single" w:sz="4" w:space="0" w:color="000000"/>
               <w:bottom w:val="single" w:sz="4" w:space="0" w:color="000000"/>
@@ -30029,7 +30345,7 @@
         </w:tc>
         <w:tc>
           <w:tcPr>
-            <w:tcW w:w="1357" w:type="dxa"/>
+            <w:tcW w:w="1358" w:type="dxa"/>
             <w:tcBorders>
               <w:start w:val="single" w:sz="4" w:space="0" w:color="000000"/>
               <w:bottom w:val="single" w:sz="4" w:space="0" w:color="000000"/>
@@ -30187,9 +30503,9 @@
       </w:tblPr>
       <w:tblGrid>
         <w:gridCol w:w="1678"/>
-        <w:gridCol w:w="2599"/>
+        <w:gridCol w:w="2598"/>
         <w:gridCol w:w="1800"/>
-        <w:gridCol w:w="1357"/>
+        <w:gridCol w:w="1358"/>
         <w:gridCol w:w="2538"/>
       </w:tblGrid>
       <w:tr>
@@ -30233,7 +30549,7 @@
         </w:tc>
         <w:tc>
           <w:tcPr>
-            <w:tcW w:w="2599" w:type="dxa"/>
+            <w:tcW w:w="2598" w:type="dxa"/>
             <w:tcBorders>
               <w:top w:val="single" w:sz="4" w:space="0" w:color="000000"/>
               <w:start w:val="single" w:sz="4" w:space="0" w:color="000000"/>
@@ -30307,7 +30623,7 @@
         </w:tc>
         <w:tc>
           <w:tcPr>
-            <w:tcW w:w="1357" w:type="dxa"/>
+            <w:tcW w:w="1358" w:type="dxa"/>
             <w:tcBorders>
               <w:top w:val="single" w:sz="4" w:space="0" w:color="000000"/>
               <w:start w:val="single" w:sz="4" w:space="0" w:color="000000"/>
@@ -30432,7 +30748,7 @@
         </w:tc>
         <w:tc>
           <w:tcPr>
-            <w:tcW w:w="2599" w:type="dxa"/>
+            <w:tcW w:w="2598" w:type="dxa"/>
             <w:tcBorders>
               <w:start w:val="single" w:sz="4" w:space="0" w:color="000000"/>
               <w:bottom w:val="single" w:sz="4" w:space="0" w:color="000000"/>
@@ -30635,7 +30951,7 @@
         </w:tc>
         <w:tc>
           <w:tcPr>
-            <w:tcW w:w="1357" w:type="dxa"/>
+            <w:tcW w:w="1358" w:type="dxa"/>
             <w:tcBorders>
               <w:start w:val="single" w:sz="4" w:space="0" w:color="000000"/>
               <w:bottom w:val="single" w:sz="4" w:space="0" w:color="000000"/>
@@ -30780,7 +31096,7 @@
         </w:tc>
         <w:tc>
           <w:tcPr>
-            <w:tcW w:w="2599" w:type="dxa"/>
+            <w:tcW w:w="2598" w:type="dxa"/>
             <w:tcBorders>
               <w:start w:val="single" w:sz="4" w:space="0" w:color="000000"/>
               <w:bottom w:val="single" w:sz="4" w:space="0" w:color="000000"/>
@@ -30854,7 +31170,7 @@
         </w:tc>
         <w:tc>
           <w:tcPr>
-            <w:tcW w:w="1357" w:type="dxa"/>
+            <w:tcW w:w="1358" w:type="dxa"/>
             <w:tcBorders>
               <w:start w:val="single" w:sz="4" w:space="0" w:color="000000"/>
               <w:bottom w:val="single" w:sz="4" w:space="0" w:color="000000"/>
@@ -30999,7 +31315,7 @@
         </w:tc>
         <w:tc>
           <w:tcPr>
-            <w:tcW w:w="2599" w:type="dxa"/>
+            <w:tcW w:w="2598" w:type="dxa"/>
             <w:tcBorders>
               <w:start w:val="single" w:sz="4" w:space="0" w:color="000000"/>
               <w:bottom w:val="single" w:sz="4" w:space="0" w:color="000000"/>
@@ -31119,7 +31435,7 @@
         </w:tc>
         <w:tc>
           <w:tcPr>
-            <w:tcW w:w="1357" w:type="dxa"/>
+            <w:tcW w:w="1358" w:type="dxa"/>
             <w:tcBorders>
               <w:start w:val="single" w:sz="4" w:space="0" w:color="000000"/>
               <w:bottom w:val="single" w:sz="4" w:space="0" w:color="000000"/>
@@ -31273,17 +31589,17 @@
         </w:tblCellMar>
       </w:tblPr>
       <w:tblGrid>
-        <w:gridCol w:w="1078"/>
+        <w:gridCol w:w="1077"/>
         <w:gridCol w:w="3199"/>
         <w:gridCol w:w="1800"/>
-        <w:gridCol w:w="1357"/>
+        <w:gridCol w:w="1358"/>
         <w:gridCol w:w="2538"/>
       </w:tblGrid>
       <w:tr>
         <w:trPr/>
         <w:tc>
           <w:tcPr>
-            <w:tcW w:w="1078" w:type="dxa"/>
+            <w:tcW w:w="1077" w:type="dxa"/>
             <w:tcBorders>
               <w:top w:val="single" w:sz="4" w:space="0" w:color="000000"/>
               <w:start w:val="single" w:sz="4" w:space="0" w:color="000000"/>
@@ -31394,7 +31710,7 @@
         </w:tc>
         <w:tc>
           <w:tcPr>
-            <w:tcW w:w="1357" w:type="dxa"/>
+            <w:tcW w:w="1358" w:type="dxa"/>
             <w:tcBorders>
               <w:top w:val="single" w:sz="4" w:space="0" w:color="000000"/>
               <w:start w:val="single" w:sz="4" w:space="0" w:color="000000"/>
@@ -31472,7 +31788,7 @@
         <w:trPr/>
         <w:tc>
           <w:tcPr>
-            <w:tcW w:w="1078" w:type="dxa"/>
+            <w:tcW w:w="1077" w:type="dxa"/>
             <w:tcBorders>
               <w:start w:val="single" w:sz="4" w:space="0" w:color="000000"/>
               <w:bottom w:val="single" w:sz="4" w:space="0" w:color="000000"/>
@@ -31812,7 +32128,7 @@
         </w:tc>
         <w:tc>
           <w:tcPr>
-            <w:tcW w:w="1357" w:type="dxa"/>
+            <w:tcW w:w="1358" w:type="dxa"/>
             <w:tcBorders>
               <w:start w:val="single" w:sz="4" w:space="0" w:color="000000"/>
               <w:bottom w:val="single" w:sz="4" w:space="0" w:color="000000"/>
@@ -31910,7 +32226,7 @@
         <w:trPr/>
         <w:tc>
           <w:tcPr>
-            <w:tcW w:w="1078" w:type="dxa"/>
+            <w:tcW w:w="1077" w:type="dxa"/>
             <w:tcBorders>
               <w:start w:val="single" w:sz="4" w:space="0" w:color="000000"/>
               <w:bottom w:val="single" w:sz="4" w:space="0" w:color="000000"/>
@@ -32088,7 +32404,7 @@
         </w:tc>
         <w:tc>
           <w:tcPr>
-            <w:tcW w:w="1357" w:type="dxa"/>
+            <w:tcW w:w="1358" w:type="dxa"/>
             <w:tcBorders>
               <w:start w:val="single" w:sz="4" w:space="0" w:color="000000"/>
               <w:bottom w:val="single" w:sz="4" w:space="0" w:color="000000"/>
@@ -32491,9 +32807,9 @@
       </w:tblPr>
       <w:tblGrid>
         <w:gridCol w:w="1678"/>
-        <w:gridCol w:w="2599"/>
+        <w:gridCol w:w="2598"/>
         <w:gridCol w:w="1800"/>
-        <w:gridCol w:w="1357"/>
+        <w:gridCol w:w="1358"/>
         <w:gridCol w:w="2538"/>
       </w:tblGrid>
       <w:tr>
@@ -32537,7 +32853,7 @@
         </w:tc>
         <w:tc>
           <w:tcPr>
-            <w:tcW w:w="2599" w:type="dxa"/>
+            <w:tcW w:w="2598" w:type="dxa"/>
             <w:tcBorders>
               <w:top w:val="single" w:sz="4" w:space="0" w:color="000000"/>
               <w:start w:val="single" w:sz="4" w:space="0" w:color="000000"/>
@@ -32611,7 +32927,7 @@
         </w:tc>
         <w:tc>
           <w:tcPr>
-            <w:tcW w:w="1357" w:type="dxa"/>
+            <w:tcW w:w="1358" w:type="dxa"/>
             <w:tcBorders>
               <w:top w:val="single" w:sz="4" w:space="0" w:color="000000"/>
               <w:start w:val="single" w:sz="4" w:space="0" w:color="000000"/>
@@ -32736,7 +33052,7 @@
         </w:tc>
         <w:tc>
           <w:tcPr>
-            <w:tcW w:w="2599" w:type="dxa"/>
+            <w:tcW w:w="2598" w:type="dxa"/>
             <w:tcBorders>
               <w:start w:val="single" w:sz="4" w:space="0" w:color="000000"/>
               <w:bottom w:val="single" w:sz="4" w:space="0" w:color="000000"/>
@@ -33018,7 +33334,7 @@
         </w:tc>
         <w:tc>
           <w:tcPr>
-            <w:tcW w:w="1357" w:type="dxa"/>
+            <w:tcW w:w="1358" w:type="dxa"/>
             <w:tcBorders>
               <w:start w:val="single" w:sz="4" w:space="0" w:color="000000"/>
               <w:bottom w:val="single" w:sz="4" w:space="0" w:color="000000"/>
@@ -33163,7 +33479,7 @@
         </w:tc>
         <w:tc>
           <w:tcPr>
-            <w:tcW w:w="2599" w:type="dxa"/>
+            <w:tcW w:w="2598" w:type="dxa"/>
             <w:tcBorders>
               <w:start w:val="single" w:sz="4" w:space="0" w:color="000000"/>
               <w:bottom w:val="single" w:sz="4" w:space="0" w:color="000000"/>
@@ -33451,7 +33767,7 @@
         </w:tc>
         <w:tc>
           <w:tcPr>
-            <w:tcW w:w="1357" w:type="dxa"/>
+            <w:tcW w:w="1358" w:type="dxa"/>
             <w:tcBorders>
               <w:start w:val="single" w:sz="4" w:space="0" w:color="000000"/>
               <w:bottom w:val="single" w:sz="4" w:space="0" w:color="000000"/>
@@ -33597,9 +33913,9 @@
       </w:tblPr>
       <w:tblGrid>
         <w:gridCol w:w="1678"/>
-        <w:gridCol w:w="2599"/>
+        <w:gridCol w:w="2598"/>
         <w:gridCol w:w="1800"/>
-        <w:gridCol w:w="1357"/>
+        <w:gridCol w:w="1358"/>
         <w:gridCol w:w="2538"/>
       </w:tblGrid>
       <w:tr>
@@ -33643,7 +33959,7 @@
         </w:tc>
         <w:tc>
           <w:tcPr>
-            <w:tcW w:w="2599" w:type="dxa"/>
+            <w:tcW w:w="2598" w:type="dxa"/>
             <w:tcBorders>
               <w:top w:val="single" w:sz="4" w:space="0" w:color="000000"/>
               <w:start w:val="single" w:sz="4" w:space="0" w:color="000000"/>
@@ -33717,7 +34033,7 @@
         </w:tc>
         <w:tc>
           <w:tcPr>
-            <w:tcW w:w="1357" w:type="dxa"/>
+            <w:tcW w:w="1358" w:type="dxa"/>
             <w:tcBorders>
               <w:top w:val="single" w:sz="4" w:space="0" w:color="000000"/>
               <w:start w:val="single" w:sz="4" w:space="0" w:color="000000"/>
@@ -33842,7 +34158,7 @@
         </w:tc>
         <w:tc>
           <w:tcPr>
-            <w:tcW w:w="2599" w:type="dxa"/>
+            <w:tcW w:w="2598" w:type="dxa"/>
             <w:tcBorders>
               <w:start w:val="single" w:sz="4" w:space="0" w:color="000000"/>
               <w:bottom w:val="single" w:sz="4" w:space="0" w:color="000000"/>
@@ -34124,7 +34440,7 @@
         </w:tc>
         <w:tc>
           <w:tcPr>
-            <w:tcW w:w="1357" w:type="dxa"/>
+            <w:tcW w:w="1358" w:type="dxa"/>
             <w:tcBorders>
               <w:start w:val="single" w:sz="4" w:space="0" w:color="000000"/>
               <w:bottom w:val="single" w:sz="4" w:space="0" w:color="000000"/>
@@ -34269,7 +34585,7 @@
         </w:tc>
         <w:tc>
           <w:tcPr>
-            <w:tcW w:w="2599" w:type="dxa"/>
+            <w:tcW w:w="2598" w:type="dxa"/>
             <w:tcBorders>
               <w:start w:val="single" w:sz="4" w:space="0" w:color="000000"/>
               <w:bottom w:val="single" w:sz="4" w:space="0" w:color="000000"/>
@@ -34557,7 +34873,7 @@
         </w:tc>
         <w:tc>
           <w:tcPr>
-            <w:tcW w:w="1357" w:type="dxa"/>
+            <w:tcW w:w="1358" w:type="dxa"/>
             <w:tcBorders>
               <w:start w:val="single" w:sz="4" w:space="0" w:color="000000"/>
               <w:bottom w:val="single" w:sz="4" w:space="0" w:color="000000"/>
@@ -34728,8 +35044,8 @@
       </w:tblPr>
       <w:tblGrid>
         <w:gridCol w:w="1678"/>
-        <w:gridCol w:w="4400"/>
-        <w:gridCol w:w="2073"/>
+        <w:gridCol w:w="4399"/>
+        <w:gridCol w:w="2074"/>
         <w:gridCol w:w="1821"/>
       </w:tblGrid>
       <w:tr>
@@ -34773,7 +35089,7 @@
         </w:tc>
         <w:tc>
           <w:tcPr>
-            <w:tcW w:w="4400" w:type="dxa"/>
+            <w:tcW w:w="4399" w:type="dxa"/>
             <w:tcBorders>
               <w:top w:val="single" w:sz="4" w:space="0" w:color="000000"/>
               <w:start w:val="single" w:sz="4" w:space="0" w:color="000000"/>
@@ -34810,7 +35126,7 @@
         </w:tc>
         <w:tc>
           <w:tcPr>
-            <w:tcW w:w="2073" w:type="dxa"/>
+            <w:tcW w:w="2074" w:type="dxa"/>
             <w:tcBorders>
               <w:top w:val="single" w:sz="4" w:space="0" w:color="000000"/>
               <w:start w:val="single" w:sz="4" w:space="0" w:color="000000"/>
@@ -34935,7 +35251,7 @@
         </w:tc>
         <w:tc>
           <w:tcPr>
-            <w:tcW w:w="4400" w:type="dxa"/>
+            <w:tcW w:w="4399" w:type="dxa"/>
             <w:tcBorders>
               <w:start w:val="single" w:sz="4" w:space="0" w:color="000000"/>
               <w:bottom w:val="single" w:sz="4" w:space="0" w:color="000000"/>
@@ -34984,7 +35300,7 @@
         </w:tc>
         <w:tc>
           <w:tcPr>
-            <w:tcW w:w="2073" w:type="dxa"/>
+            <w:tcW w:w="2074" w:type="dxa"/>
             <w:tcBorders>
               <w:start w:val="single" w:sz="4" w:space="0" w:color="000000"/>
               <w:bottom w:val="single" w:sz="4" w:space="0" w:color="000000"/>
@@ -35735,8 +36051,8 @@
       <w:szCs w:val="26"/>
     </w:rPr>
   </w:style>
-  <w:style w:type="character" w:styleId="Bulletsuser">
-    <w:name w:val="Bullets (user)"/>
+  <w:style w:type="character" w:styleId="Bullets">
+    <w:name w:val="Bullets"/>
     <w:qFormat/>
     <w:rPr>
       <w:rFonts w:ascii="OpenSymbol" w:hAnsi="OpenSymbol" w:eastAsia="OpenSymbol" w:cs="OpenSymbol"/>

</xml_diff>

<commit_message>
Issue #7: add details to doc. regarding Timer measuring basis.
</commit_message>
<xml_diff>
--- a/doc/res/DPP_parameters.docx
+++ b/doc/res/DPP_parameters.docx
@@ -3500,14 +3500,14 @@
         </w:tblCellMar>
       </w:tblPr>
       <w:tblGrid>
-        <w:gridCol w:w="774"/>
-        <w:gridCol w:w="9198"/>
+        <w:gridCol w:w="773"/>
+        <w:gridCol w:w="9199"/>
       </w:tblGrid>
       <w:tr>
         <w:trPr/>
         <w:tc>
           <w:tcPr>
-            <w:tcW w:w="774" w:type="dxa"/>
+            <w:tcW w:w="773" w:type="dxa"/>
             <w:tcBorders>
               <w:top w:val="single" w:sz="4" w:space="0" w:color="000000"/>
               <w:start w:val="single" w:sz="4" w:space="0" w:color="000000"/>
@@ -3544,7 +3544,7 @@
         </w:tc>
         <w:tc>
           <w:tcPr>
-            <w:tcW w:w="9198" w:type="dxa"/>
+            <w:tcW w:w="9199" w:type="dxa"/>
             <w:tcBorders>
               <w:top w:val="single" w:sz="4" w:space="0" w:color="000000"/>
               <w:start w:val="single" w:sz="4" w:space="0" w:color="000000"/>
@@ -3585,7 +3585,7 @@
         <w:trPr/>
         <w:tc>
           <w:tcPr>
-            <w:tcW w:w="774" w:type="dxa"/>
+            <w:tcW w:w="773" w:type="dxa"/>
             <w:tcBorders>
               <w:start w:val="single" w:sz="4" w:space="0" w:color="000000"/>
               <w:bottom w:val="single" w:sz="4" w:space="0" w:color="000000"/>
@@ -3632,7 +3632,7 @@
         </w:tc>
         <w:tc>
           <w:tcPr>
-            <w:tcW w:w="9198" w:type="dxa"/>
+            <w:tcW w:w="9199" w:type="dxa"/>
             <w:tcBorders>
               <w:start w:val="single" w:sz="4" w:space="0" w:color="000000"/>
               <w:bottom w:val="single" w:sz="4" w:space="0" w:color="000000"/>
@@ -3683,7 +3683,7 @@
         <w:trPr/>
         <w:tc>
           <w:tcPr>
-            <w:tcW w:w="774" w:type="dxa"/>
+            <w:tcW w:w="773" w:type="dxa"/>
             <w:tcBorders>
               <w:start w:val="single" w:sz="4" w:space="0" w:color="000000"/>
               <w:bottom w:val="single" w:sz="4" w:space="0" w:color="000000"/>
@@ -3730,7 +3730,7 @@
         </w:tc>
         <w:tc>
           <w:tcPr>
-            <w:tcW w:w="9198" w:type="dxa"/>
+            <w:tcW w:w="9199" w:type="dxa"/>
             <w:tcBorders>
               <w:start w:val="single" w:sz="4" w:space="0" w:color="000000"/>
               <w:bottom w:val="single" w:sz="4" w:space="0" w:color="000000"/>
@@ -3770,7 +3770,7 @@
         <w:trPr/>
         <w:tc>
           <w:tcPr>
-            <w:tcW w:w="774" w:type="dxa"/>
+            <w:tcW w:w="773" w:type="dxa"/>
             <w:tcBorders>
               <w:start w:val="single" w:sz="4" w:space="0" w:color="000000"/>
               <w:bottom w:val="single" w:sz="4" w:space="0" w:color="000000"/>
@@ -3817,7 +3817,7 @@
         </w:tc>
         <w:tc>
           <w:tcPr>
-            <w:tcW w:w="9198" w:type="dxa"/>
+            <w:tcW w:w="9199" w:type="dxa"/>
             <w:tcBorders>
               <w:start w:val="single" w:sz="4" w:space="0" w:color="000000"/>
               <w:bottom w:val="single" w:sz="4" w:space="0" w:color="000000"/>
@@ -3847,7 +3847,7 @@
         <w:trPr/>
         <w:tc>
           <w:tcPr>
-            <w:tcW w:w="774" w:type="dxa"/>
+            <w:tcW w:w="773" w:type="dxa"/>
             <w:tcBorders>
               <w:start w:val="single" w:sz="4" w:space="0" w:color="000000"/>
               <w:bottom w:val="single" w:sz="4" w:space="0" w:color="000000"/>
@@ -3894,7 +3894,7 @@
         </w:tc>
         <w:tc>
           <w:tcPr>
-            <w:tcW w:w="9198" w:type="dxa"/>
+            <w:tcW w:w="9199" w:type="dxa"/>
             <w:tcBorders>
               <w:start w:val="single" w:sz="4" w:space="0" w:color="000000"/>
               <w:bottom w:val="single" w:sz="4" w:space="0" w:color="000000"/>
@@ -4349,9 +4349,9 @@
       </w:tblPr>
       <w:tblGrid>
         <w:gridCol w:w="1350"/>
-        <w:gridCol w:w="2926"/>
+        <w:gridCol w:w="2925"/>
         <w:gridCol w:w="1800"/>
-        <w:gridCol w:w="1358"/>
+        <w:gridCol w:w="1359"/>
         <w:gridCol w:w="2538"/>
       </w:tblGrid>
       <w:tr>
@@ -4395,7 +4395,7 @@
         </w:tc>
         <w:tc>
           <w:tcPr>
-            <w:tcW w:w="2926" w:type="dxa"/>
+            <w:tcW w:w="2925" w:type="dxa"/>
             <w:tcBorders>
               <w:top w:val="single" w:sz="4" w:space="0" w:color="000000"/>
               <w:start w:val="single" w:sz="4" w:space="0" w:color="000000"/>
@@ -4469,7 +4469,7 @@
         </w:tc>
         <w:tc>
           <w:tcPr>
-            <w:tcW w:w="1358" w:type="dxa"/>
+            <w:tcW w:w="1359" w:type="dxa"/>
             <w:tcBorders>
               <w:top w:val="single" w:sz="4" w:space="0" w:color="000000"/>
               <w:start w:val="single" w:sz="4" w:space="0" w:color="000000"/>
@@ -4594,7 +4594,7 @@
         </w:tc>
         <w:tc>
           <w:tcPr>
-            <w:tcW w:w="2926" w:type="dxa"/>
+            <w:tcW w:w="2925" w:type="dxa"/>
             <w:tcBorders>
               <w:start w:val="single" w:sz="4" w:space="0" w:color="000000"/>
               <w:bottom w:val="single" w:sz="4" w:space="0" w:color="000000"/>
@@ -4722,7 +4722,7 @@
         </w:tc>
         <w:tc>
           <w:tcPr>
-            <w:tcW w:w="1358" w:type="dxa"/>
+            <w:tcW w:w="1359" w:type="dxa"/>
             <w:tcBorders>
               <w:start w:val="single" w:sz="4" w:space="0" w:color="000000"/>
               <w:bottom w:val="single" w:sz="4" w:space="0" w:color="000000"/>
@@ -4867,7 +4867,7 @@
         </w:tc>
         <w:tc>
           <w:tcPr>
-            <w:tcW w:w="2926" w:type="dxa"/>
+            <w:tcW w:w="2925" w:type="dxa"/>
             <w:tcBorders>
               <w:start w:val="single" w:sz="4" w:space="0" w:color="000000"/>
               <w:bottom w:val="single" w:sz="4" w:space="0" w:color="000000"/>
@@ -4978,7 +4978,7 @@
         </w:tc>
         <w:tc>
           <w:tcPr>
-            <w:tcW w:w="1358" w:type="dxa"/>
+            <w:tcW w:w="1359" w:type="dxa"/>
             <w:tcBorders>
               <w:start w:val="single" w:sz="4" w:space="0" w:color="000000"/>
               <w:bottom w:val="single" w:sz="4" w:space="0" w:color="000000"/>
@@ -5123,7 +5123,7 @@
         </w:tc>
         <w:tc>
           <w:tcPr>
-            <w:tcW w:w="2926" w:type="dxa"/>
+            <w:tcW w:w="2925" w:type="dxa"/>
             <w:tcBorders>
               <w:start w:val="single" w:sz="4" w:space="0" w:color="000000"/>
               <w:bottom w:val="single" w:sz="4" w:space="0" w:color="000000"/>
@@ -5234,7 +5234,7 @@
         </w:tc>
         <w:tc>
           <w:tcPr>
-            <w:tcW w:w="1358" w:type="dxa"/>
+            <w:tcW w:w="1359" w:type="dxa"/>
             <w:tcBorders>
               <w:start w:val="single" w:sz="4" w:space="0" w:color="000000"/>
               <w:bottom w:val="single" w:sz="4" w:space="0" w:color="000000"/>
@@ -5379,7 +5379,7 @@
         </w:tc>
         <w:tc>
           <w:tcPr>
-            <w:tcW w:w="2926" w:type="dxa"/>
+            <w:tcW w:w="2925" w:type="dxa"/>
             <w:tcBorders>
               <w:start w:val="single" w:sz="4" w:space="0" w:color="000000"/>
               <w:bottom w:val="single" w:sz="4" w:space="0" w:color="000000"/>
@@ -5490,7 +5490,7 @@
         </w:tc>
         <w:tc>
           <w:tcPr>
-            <w:tcW w:w="1358" w:type="dxa"/>
+            <w:tcW w:w="1359" w:type="dxa"/>
             <w:tcBorders>
               <w:start w:val="single" w:sz="4" w:space="0" w:color="000000"/>
               <w:bottom w:val="single" w:sz="4" w:space="0" w:color="000000"/>
@@ -5635,7 +5635,7 @@
         </w:tc>
         <w:tc>
           <w:tcPr>
-            <w:tcW w:w="2926" w:type="dxa"/>
+            <w:tcW w:w="2925" w:type="dxa"/>
             <w:tcBorders>
               <w:start w:val="single" w:sz="4" w:space="0" w:color="000000"/>
               <w:bottom w:val="single" w:sz="4" w:space="0" w:color="000000"/>
@@ -5746,7 +5746,7 @@
         </w:tc>
         <w:tc>
           <w:tcPr>
-            <w:tcW w:w="1358" w:type="dxa"/>
+            <w:tcW w:w="1359" w:type="dxa"/>
             <w:tcBorders>
               <w:start w:val="single" w:sz="4" w:space="0" w:color="000000"/>
               <w:bottom w:val="single" w:sz="4" w:space="0" w:color="000000"/>
@@ -5891,7 +5891,7 @@
         </w:tc>
         <w:tc>
           <w:tcPr>
-            <w:tcW w:w="2926" w:type="dxa"/>
+            <w:tcW w:w="2925" w:type="dxa"/>
             <w:tcBorders>
               <w:start w:val="single" w:sz="4" w:space="0" w:color="000000"/>
               <w:bottom w:val="single" w:sz="4" w:space="0" w:color="000000"/>
@@ -5985,7 +5985,7 @@
         </w:tc>
         <w:tc>
           <w:tcPr>
-            <w:tcW w:w="1358" w:type="dxa"/>
+            <w:tcW w:w="1359" w:type="dxa"/>
             <w:tcBorders>
               <w:start w:val="single" w:sz="4" w:space="0" w:color="000000"/>
               <w:bottom w:val="single" w:sz="4" w:space="0" w:color="000000"/>
@@ -6130,7 +6130,7 @@
         </w:tc>
         <w:tc>
           <w:tcPr>
-            <w:tcW w:w="2926" w:type="dxa"/>
+            <w:tcW w:w="2925" w:type="dxa"/>
             <w:tcBorders>
               <w:start w:val="single" w:sz="4" w:space="0" w:color="000000"/>
               <w:bottom w:val="single" w:sz="4" w:space="0" w:color="000000"/>
@@ -6224,7 +6224,7 @@
         </w:tc>
         <w:tc>
           <w:tcPr>
-            <w:tcW w:w="1358" w:type="dxa"/>
+            <w:tcW w:w="1359" w:type="dxa"/>
             <w:tcBorders>
               <w:start w:val="single" w:sz="4" w:space="0" w:color="000000"/>
               <w:bottom w:val="single" w:sz="4" w:space="0" w:color="000000"/>
@@ -6369,7 +6369,7 @@
         </w:tc>
         <w:tc>
           <w:tcPr>
-            <w:tcW w:w="2926" w:type="dxa"/>
+            <w:tcW w:w="2925" w:type="dxa"/>
             <w:tcBorders>
               <w:start w:val="single" w:sz="4" w:space="0" w:color="000000"/>
               <w:bottom w:val="single" w:sz="4" w:space="0" w:color="000000"/>
@@ -6463,7 +6463,7 @@
         </w:tc>
         <w:tc>
           <w:tcPr>
-            <w:tcW w:w="1358" w:type="dxa"/>
+            <w:tcW w:w="1359" w:type="dxa"/>
             <w:tcBorders>
               <w:start w:val="single" w:sz="4" w:space="0" w:color="000000"/>
               <w:bottom w:val="single" w:sz="4" w:space="0" w:color="000000"/>
@@ -6608,7 +6608,7 @@
         </w:tc>
         <w:tc>
           <w:tcPr>
-            <w:tcW w:w="2926" w:type="dxa"/>
+            <w:tcW w:w="2925" w:type="dxa"/>
             <w:tcBorders>
               <w:start w:val="single" w:sz="4" w:space="0" w:color="000000"/>
               <w:bottom w:val="single" w:sz="4" w:space="0" w:color="000000"/>
@@ -6702,7 +6702,7 @@
         </w:tc>
         <w:tc>
           <w:tcPr>
-            <w:tcW w:w="1358" w:type="dxa"/>
+            <w:tcW w:w="1359" w:type="dxa"/>
             <w:tcBorders>
               <w:start w:val="single" w:sz="4" w:space="0" w:color="000000"/>
               <w:bottom w:val="single" w:sz="4" w:space="0" w:color="000000"/>
@@ -6847,7 +6847,7 @@
         </w:tc>
         <w:tc>
           <w:tcPr>
-            <w:tcW w:w="2926" w:type="dxa"/>
+            <w:tcW w:w="2925" w:type="dxa"/>
             <w:tcBorders>
               <w:start w:val="single" w:sz="4" w:space="0" w:color="000000"/>
               <w:bottom w:val="single" w:sz="4" w:space="0" w:color="000000"/>
@@ -6941,7 +6941,7 @@
         </w:tc>
         <w:tc>
           <w:tcPr>
-            <w:tcW w:w="1358" w:type="dxa"/>
+            <w:tcW w:w="1359" w:type="dxa"/>
             <w:tcBorders>
               <w:start w:val="single" w:sz="4" w:space="0" w:color="000000"/>
               <w:bottom w:val="single" w:sz="4" w:space="0" w:color="000000"/>
@@ -7086,7 +7086,7 @@
         </w:tc>
         <w:tc>
           <w:tcPr>
-            <w:tcW w:w="2926" w:type="dxa"/>
+            <w:tcW w:w="2925" w:type="dxa"/>
             <w:tcBorders>
               <w:start w:val="single" w:sz="4" w:space="0" w:color="000000"/>
               <w:bottom w:val="single" w:sz="4" w:space="0" w:color="000000"/>
@@ -7180,7 +7180,7 @@
         </w:tc>
         <w:tc>
           <w:tcPr>
-            <w:tcW w:w="1358" w:type="dxa"/>
+            <w:tcW w:w="1359" w:type="dxa"/>
             <w:tcBorders>
               <w:start w:val="single" w:sz="4" w:space="0" w:color="000000"/>
               <w:bottom w:val="single" w:sz="4" w:space="0" w:color="000000"/>
@@ -7312,7 +7312,7 @@
         </w:tc>
         <w:tc>
           <w:tcPr>
-            <w:tcW w:w="2926" w:type="dxa"/>
+            <w:tcW w:w="2925" w:type="dxa"/>
             <w:tcBorders>
               <w:start w:val="single" w:sz="4" w:space="0" w:color="000000"/>
               <w:bottom w:val="single" w:sz="4" w:space="0" w:color="000000"/>
@@ -7423,7 +7423,7 @@
         </w:tc>
         <w:tc>
           <w:tcPr>
-            <w:tcW w:w="1358" w:type="dxa"/>
+            <w:tcW w:w="1359" w:type="dxa"/>
             <w:tcBorders>
               <w:start w:val="single" w:sz="4" w:space="0" w:color="000000"/>
               <w:bottom w:val="single" w:sz="4" w:space="0" w:color="000000"/>
@@ -7568,7 +7568,7 @@
         </w:tc>
         <w:tc>
           <w:tcPr>
-            <w:tcW w:w="2926" w:type="dxa"/>
+            <w:tcW w:w="2925" w:type="dxa"/>
             <w:tcBorders>
               <w:start w:val="single" w:sz="4" w:space="0" w:color="000000"/>
               <w:bottom w:val="single" w:sz="4" w:space="0" w:color="000000"/>
@@ -7662,7 +7662,7 @@
         </w:tc>
         <w:tc>
           <w:tcPr>
-            <w:tcW w:w="1358" w:type="dxa"/>
+            <w:tcW w:w="1359" w:type="dxa"/>
             <w:tcBorders>
               <w:start w:val="single" w:sz="4" w:space="0" w:color="000000"/>
               <w:bottom w:val="single" w:sz="4" w:space="0" w:color="000000"/>
@@ -7807,7 +7807,7 @@
         </w:tc>
         <w:tc>
           <w:tcPr>
-            <w:tcW w:w="2926" w:type="dxa"/>
+            <w:tcW w:w="2925" w:type="dxa"/>
             <w:tcBorders>
               <w:start w:val="single" w:sz="4" w:space="0" w:color="000000"/>
               <w:bottom w:val="single" w:sz="4" w:space="0" w:color="000000"/>
@@ -7901,7 +7901,7 @@
         </w:tc>
         <w:tc>
           <w:tcPr>
-            <w:tcW w:w="1358" w:type="dxa"/>
+            <w:tcW w:w="1359" w:type="dxa"/>
             <w:tcBorders>
               <w:start w:val="single" w:sz="4" w:space="0" w:color="000000"/>
               <w:bottom w:val="single" w:sz="4" w:space="0" w:color="000000"/>
@@ -8047,7 +8047,7 @@
         </w:tc>
         <w:tc>
           <w:tcPr>
-            <w:tcW w:w="2926" w:type="dxa"/>
+            <w:tcW w:w="2925" w:type="dxa"/>
             <w:tcBorders>
               <w:start w:val="single" w:sz="4" w:space="0" w:color="000000"/>
               <w:bottom w:val="single" w:sz="4" w:space="0" w:color="000000"/>
@@ -8141,7 +8141,7 @@
         </w:tc>
         <w:tc>
           <w:tcPr>
-            <w:tcW w:w="1358" w:type="dxa"/>
+            <w:tcW w:w="1359" w:type="dxa"/>
             <w:tcBorders>
               <w:start w:val="single" w:sz="4" w:space="0" w:color="000000"/>
               <w:bottom w:val="single" w:sz="4" w:space="0" w:color="000000"/>
@@ -8286,7 +8286,7 @@
         </w:tc>
         <w:tc>
           <w:tcPr>
-            <w:tcW w:w="2926" w:type="dxa"/>
+            <w:tcW w:w="2925" w:type="dxa"/>
             <w:tcBorders>
               <w:start w:val="single" w:sz="4" w:space="0" w:color="000000"/>
               <w:bottom w:val="single" w:sz="4" w:space="0" w:color="000000"/>
@@ -8380,7 +8380,7 @@
         </w:tc>
         <w:tc>
           <w:tcPr>
-            <w:tcW w:w="1358" w:type="dxa"/>
+            <w:tcW w:w="1359" w:type="dxa"/>
             <w:tcBorders>
               <w:start w:val="single" w:sz="4" w:space="0" w:color="000000"/>
               <w:bottom w:val="single" w:sz="4" w:space="0" w:color="000000"/>
@@ -8523,7 +8523,7 @@
         </w:tc>
         <w:tc>
           <w:tcPr>
-            <w:tcW w:w="2926" w:type="dxa"/>
+            <w:tcW w:w="2925" w:type="dxa"/>
             <w:tcBorders>
               <w:start w:val="single" w:sz="4" w:space="0" w:color="000000"/>
               <w:bottom w:val="single" w:sz="4" w:space="0" w:color="000000"/>
@@ -8634,7 +8634,7 @@
         </w:tc>
         <w:tc>
           <w:tcPr>
-            <w:tcW w:w="1358" w:type="dxa"/>
+            <w:tcW w:w="1359" w:type="dxa"/>
             <w:tcBorders>
               <w:start w:val="single" w:sz="4" w:space="0" w:color="000000"/>
               <w:bottom w:val="single" w:sz="4" w:space="0" w:color="000000"/>
@@ -8783,9 +8783,9 @@
       </w:tblPr>
       <w:tblGrid>
         <w:gridCol w:w="1678"/>
-        <w:gridCol w:w="2598"/>
+        <w:gridCol w:w="2597"/>
         <w:gridCol w:w="1800"/>
-        <w:gridCol w:w="1358"/>
+        <w:gridCol w:w="1359"/>
         <w:gridCol w:w="2538"/>
       </w:tblGrid>
       <w:tr>
@@ -8829,7 +8829,7 @@
         </w:tc>
         <w:tc>
           <w:tcPr>
-            <w:tcW w:w="2598" w:type="dxa"/>
+            <w:tcW w:w="2597" w:type="dxa"/>
             <w:tcBorders>
               <w:top w:val="single" w:sz="4" w:space="0" w:color="000000"/>
               <w:start w:val="single" w:sz="4" w:space="0" w:color="000000"/>
@@ -8903,7 +8903,7 @@
         </w:tc>
         <w:tc>
           <w:tcPr>
-            <w:tcW w:w="1358" w:type="dxa"/>
+            <w:tcW w:w="1359" w:type="dxa"/>
             <w:tcBorders>
               <w:top w:val="single" w:sz="4" w:space="0" w:color="000000"/>
               <w:start w:val="single" w:sz="4" w:space="0" w:color="000000"/>
@@ -9028,7 +9028,7 @@
         </w:tc>
         <w:tc>
           <w:tcPr>
-            <w:tcW w:w="2598" w:type="dxa"/>
+            <w:tcW w:w="2597" w:type="dxa"/>
             <w:tcBorders>
               <w:start w:val="single" w:sz="4" w:space="0" w:color="000000"/>
               <w:bottom w:val="single" w:sz="4" w:space="0" w:color="000000"/>
@@ -9190,7 +9190,7 @@
         </w:tc>
         <w:tc>
           <w:tcPr>
-            <w:tcW w:w="1358" w:type="dxa"/>
+            <w:tcW w:w="1359" w:type="dxa"/>
             <w:tcBorders>
               <w:start w:val="single" w:sz="4" w:space="0" w:color="000000"/>
               <w:bottom w:val="single" w:sz="4" w:space="0" w:color="000000"/>
@@ -9335,7 +9335,7 @@
         </w:tc>
         <w:tc>
           <w:tcPr>
-            <w:tcW w:w="2598" w:type="dxa"/>
+            <w:tcW w:w="2597" w:type="dxa"/>
             <w:tcBorders>
               <w:start w:val="single" w:sz="4" w:space="0" w:color="000000"/>
               <w:bottom w:val="single" w:sz="4" w:space="0" w:color="000000"/>
@@ -9439,7 +9439,7 @@
         </w:tc>
         <w:tc>
           <w:tcPr>
-            <w:tcW w:w="1358" w:type="dxa"/>
+            <w:tcW w:w="1359" w:type="dxa"/>
             <w:tcBorders>
               <w:start w:val="single" w:sz="4" w:space="0" w:color="000000"/>
               <w:bottom w:val="single" w:sz="4" w:space="0" w:color="000000"/>
@@ -9584,7 +9584,7 @@
         </w:tc>
         <w:tc>
           <w:tcPr>
-            <w:tcW w:w="2598" w:type="dxa"/>
+            <w:tcW w:w="2597" w:type="dxa"/>
             <w:tcBorders>
               <w:start w:val="single" w:sz="4" w:space="0" w:color="000000"/>
               <w:bottom w:val="single" w:sz="4" w:space="0" w:color="000000"/>
@@ -9725,7 +9725,7 @@
         </w:tc>
         <w:tc>
           <w:tcPr>
-            <w:tcW w:w="1358" w:type="dxa"/>
+            <w:tcW w:w="1359" w:type="dxa"/>
             <w:tcBorders>
               <w:start w:val="single" w:sz="4" w:space="0" w:color="000000"/>
               <w:bottom w:val="single" w:sz="4" w:space="0" w:color="000000"/>
@@ -9870,7 +9870,7 @@
         </w:tc>
         <w:tc>
           <w:tcPr>
-            <w:tcW w:w="2598" w:type="dxa"/>
+            <w:tcW w:w="2597" w:type="dxa"/>
             <w:tcBorders>
               <w:start w:val="single" w:sz="4" w:space="0" w:color="000000"/>
               <w:bottom w:val="single" w:sz="4" w:space="0" w:color="000000"/>
@@ -9957,7 +9957,7 @@
         </w:tc>
         <w:tc>
           <w:tcPr>
-            <w:tcW w:w="1358" w:type="dxa"/>
+            <w:tcW w:w="1359" w:type="dxa"/>
             <w:tcBorders>
               <w:start w:val="single" w:sz="4" w:space="0" w:color="000000"/>
               <w:bottom w:val="single" w:sz="4" w:space="0" w:color="000000"/>
@@ -10102,7 +10102,7 @@
         </w:tc>
         <w:tc>
           <w:tcPr>
-            <w:tcW w:w="2598" w:type="dxa"/>
+            <w:tcW w:w="2597" w:type="dxa"/>
             <w:tcBorders>
               <w:start w:val="single" w:sz="4" w:space="0" w:color="000000"/>
               <w:bottom w:val="single" w:sz="4" w:space="0" w:color="000000"/>
@@ -10205,7 +10205,7 @@
         </w:tc>
         <w:tc>
           <w:tcPr>
-            <w:tcW w:w="1358" w:type="dxa"/>
+            <w:tcW w:w="1359" w:type="dxa"/>
             <w:tcBorders>
               <w:start w:val="single" w:sz="4" w:space="0" w:color="000000"/>
               <w:bottom w:val="single" w:sz="4" w:space="0" w:color="000000"/>
@@ -10337,7 +10337,7 @@
         </w:tc>
         <w:tc>
           <w:tcPr>
-            <w:tcW w:w="2598" w:type="dxa"/>
+            <w:tcW w:w="2597" w:type="dxa"/>
             <w:tcBorders>
               <w:start w:val="single" w:sz="4" w:space="0" w:color="000000"/>
               <w:bottom w:val="single" w:sz="4" w:space="0" w:color="000000"/>
@@ -10431,7 +10431,7 @@
         </w:tc>
         <w:tc>
           <w:tcPr>
-            <w:tcW w:w="1358" w:type="dxa"/>
+            <w:tcW w:w="1359" w:type="dxa"/>
             <w:tcBorders>
               <w:start w:val="single" w:sz="4" w:space="0" w:color="000000"/>
               <w:bottom w:val="single" w:sz="4" w:space="0" w:color="000000"/>
@@ -10630,17 +10630,17 @@
         </w:tblCellMar>
       </w:tblPr>
       <w:tblGrid>
-        <w:gridCol w:w="1850"/>
+        <w:gridCol w:w="1849"/>
         <w:gridCol w:w="2525"/>
         <w:gridCol w:w="1701"/>
-        <w:gridCol w:w="1358"/>
+        <w:gridCol w:w="1359"/>
         <w:gridCol w:w="2538"/>
       </w:tblGrid>
       <w:tr>
         <w:trPr/>
         <w:tc>
           <w:tcPr>
-            <w:tcW w:w="1850" w:type="dxa"/>
+            <w:tcW w:w="1849" w:type="dxa"/>
             <w:tcBorders>
               <w:top w:val="single" w:sz="4" w:space="0" w:color="000000"/>
               <w:start w:val="single" w:sz="4" w:space="0" w:color="000000"/>
@@ -10751,7 +10751,7 @@
         </w:tc>
         <w:tc>
           <w:tcPr>
-            <w:tcW w:w="1358" w:type="dxa"/>
+            <w:tcW w:w="1359" w:type="dxa"/>
             <w:tcBorders>
               <w:top w:val="single" w:sz="4" w:space="0" w:color="000000"/>
               <w:start w:val="single" w:sz="4" w:space="0" w:color="000000"/>
@@ -10829,7 +10829,7 @@
         <w:trPr/>
         <w:tc>
           <w:tcPr>
-            <w:tcW w:w="1850" w:type="dxa"/>
+            <w:tcW w:w="1849" w:type="dxa"/>
             <w:tcBorders>
               <w:start w:val="single" w:sz="4" w:space="0" w:color="000000"/>
               <w:bottom w:val="single" w:sz="4" w:space="0" w:color="000000"/>
@@ -11038,7 +11038,7 @@
         </w:tc>
         <w:tc>
           <w:tcPr>
-            <w:tcW w:w="1358" w:type="dxa"/>
+            <w:tcW w:w="1359" w:type="dxa"/>
             <w:tcBorders>
               <w:start w:val="single" w:sz="4" w:space="0" w:color="000000"/>
               <w:bottom w:val="single" w:sz="4" w:space="0" w:color="000000"/>
@@ -11136,7 +11136,7 @@
         <w:trPr/>
         <w:tc>
           <w:tcPr>
-            <w:tcW w:w="1850" w:type="dxa"/>
+            <w:tcW w:w="1849" w:type="dxa"/>
             <w:tcBorders>
               <w:start w:val="single" w:sz="4" w:space="0" w:color="000000"/>
               <w:bottom w:val="single" w:sz="4" w:space="0" w:color="000000"/>
@@ -11257,7 +11257,7 @@
         </w:tc>
         <w:tc>
           <w:tcPr>
-            <w:tcW w:w="1358" w:type="dxa"/>
+            <w:tcW w:w="1359" w:type="dxa"/>
             <w:tcBorders>
               <w:start w:val="single" w:sz="4" w:space="0" w:color="000000"/>
               <w:bottom w:val="single" w:sz="4" w:space="0" w:color="000000"/>
@@ -11355,7 +11355,7 @@
         <w:trPr/>
         <w:tc>
           <w:tcPr>
-            <w:tcW w:w="1850" w:type="dxa"/>
+            <w:tcW w:w="1849" w:type="dxa"/>
             <w:tcBorders>
               <w:start w:val="single" w:sz="4" w:space="0" w:color="000000"/>
               <w:bottom w:val="single" w:sz="4" w:space="0" w:color="000000"/>
@@ -11489,7 +11489,7 @@
         </w:tc>
         <w:tc>
           <w:tcPr>
-            <w:tcW w:w="1358" w:type="dxa"/>
+            <w:tcW w:w="1359" w:type="dxa"/>
             <w:tcBorders>
               <w:start w:val="single" w:sz="4" w:space="0" w:color="000000"/>
               <w:bottom w:val="single" w:sz="4" w:space="0" w:color="000000"/>
@@ -11587,7 +11587,7 @@
         <w:trPr/>
         <w:tc>
           <w:tcPr>
-            <w:tcW w:w="1850" w:type="dxa"/>
+            <w:tcW w:w="1849" w:type="dxa"/>
             <w:tcBorders>
               <w:start w:val="single" w:sz="4" w:space="0" w:color="000000"/>
               <w:bottom w:val="single" w:sz="4" w:space="0" w:color="000000"/>
@@ -11721,7 +11721,7 @@
         </w:tc>
         <w:tc>
           <w:tcPr>
-            <w:tcW w:w="1358" w:type="dxa"/>
+            <w:tcW w:w="1359" w:type="dxa"/>
             <w:tcBorders>
               <w:start w:val="single" w:sz="4" w:space="0" w:color="000000"/>
               <w:bottom w:val="single" w:sz="4" w:space="0" w:color="000000"/>
@@ -11819,7 +11819,7 @@
         <w:trPr/>
         <w:tc>
           <w:tcPr>
-            <w:tcW w:w="1850" w:type="dxa"/>
+            <w:tcW w:w="1849" w:type="dxa"/>
             <w:tcBorders>
               <w:start w:val="single" w:sz="4" w:space="0" w:color="000000"/>
               <w:bottom w:val="single" w:sz="4" w:space="0" w:color="000000"/>
@@ -11947,7 +11947,7 @@
         </w:tc>
         <w:tc>
           <w:tcPr>
-            <w:tcW w:w="1358" w:type="dxa"/>
+            <w:tcW w:w="1359" w:type="dxa"/>
             <w:tcBorders>
               <w:start w:val="single" w:sz="4" w:space="0" w:color="000000"/>
               <w:bottom w:val="single" w:sz="4" w:space="0" w:color="000000"/>
@@ -12032,7 +12032,7 @@
         <w:trPr/>
         <w:tc>
           <w:tcPr>
-            <w:tcW w:w="1850" w:type="dxa"/>
+            <w:tcW w:w="1849" w:type="dxa"/>
             <w:tcBorders>
               <w:start w:val="single" w:sz="4" w:space="0" w:color="000000"/>
               <w:bottom w:val="single" w:sz="4" w:space="0" w:color="000000"/>
@@ -12173,7 +12173,7 @@
         </w:tc>
         <w:tc>
           <w:tcPr>
-            <w:tcW w:w="1358" w:type="dxa"/>
+            <w:tcW w:w="1359" w:type="dxa"/>
             <w:tcBorders>
               <w:start w:val="single" w:sz="4" w:space="0" w:color="000000"/>
               <w:bottom w:val="single" w:sz="4" w:space="0" w:color="000000"/>
@@ -12271,7 +12271,7 @@
         <w:trPr/>
         <w:tc>
           <w:tcPr>
-            <w:tcW w:w="1850" w:type="dxa"/>
+            <w:tcW w:w="1849" w:type="dxa"/>
             <w:tcBorders>
               <w:start w:val="single" w:sz="4" w:space="0" w:color="000000"/>
               <w:bottom w:val="single" w:sz="4" w:space="0" w:color="000000"/>
@@ -12335,347 +12335,24 @@
                 <w:szCs w:val="24"/>
                 <w:u w:val="none"/>
               </w:rPr>
-              <w:t>D</w:t>
-            </w:r>
-            <w:r>
-              <w:rPr>
-                <w:b/>
-                <w:bCs/>
-                <w:i w:val="false"/>
-                <w:iCs w:val="false"/>
-                <w:strike w:val="false"/>
-                <w:dstrike w:val="false"/>
-                <w:outline w:val="false"/>
-                <w:shadow w:val="false"/>
-                <w:color w:val="auto"/>
-                <w:sz w:val="24"/>
-                <w:szCs w:val="24"/>
-                <w:u w:val="none"/>
-              </w:rPr>
-              <w:t>E</w:t>
-            </w:r>
-            <w:r>
-              <w:rPr>
-                <w:b/>
-                <w:bCs/>
-                <w:i w:val="false"/>
-                <w:iCs w:val="false"/>
-                <w:strike w:val="false"/>
-                <w:dstrike w:val="false"/>
-                <w:outline w:val="false"/>
-                <w:shadow w:val="false"/>
-                <w:color w:val="auto"/>
-                <w:sz w:val="24"/>
-                <w:szCs w:val="24"/>
-                <w:u w:val="none"/>
-              </w:rPr>
-              <w:t>P</w:t>
-            </w:r>
-            <w:r>
-              <w:rPr>
-                <w:b/>
-                <w:bCs/>
-                <w:i w:val="false"/>
-                <w:iCs w:val="false"/>
-                <w:strike w:val="false"/>
-                <w:dstrike w:val="false"/>
-                <w:outline w:val="false"/>
-                <w:shadow w:val="false"/>
-                <w:color w:val="auto"/>
-                <w:sz w:val="24"/>
-                <w:szCs w:val="24"/>
-                <w:u w:val="none"/>
-              </w:rPr>
-              <w:t>R</w:t>
-            </w:r>
-            <w:r>
-              <w:rPr>
-                <w:b/>
-                <w:bCs/>
-                <w:i w:val="false"/>
-                <w:iCs w:val="false"/>
-                <w:strike w:val="false"/>
-                <w:dstrike w:val="false"/>
-                <w:outline w:val="false"/>
-                <w:shadow w:val="false"/>
-                <w:color w:val="auto"/>
-                <w:sz w:val="24"/>
-                <w:szCs w:val="24"/>
-                <w:u w:val="none"/>
-              </w:rPr>
-              <w:t>ECATED</w:t>
-            </w:r>
-            <w:r>
-              <w:rPr>
-                <w:b w:val="false"/>
-                <w:bCs w:val="false"/>
-                <w:i w:val="false"/>
-                <w:iCs w:val="false"/>
-                <w:strike w:val="false"/>
-                <w:dstrike w:val="false"/>
-                <w:outline w:val="false"/>
-                <w:shadow w:val="false"/>
-                <w:color w:val="auto"/>
-                <w:sz w:val="24"/>
-                <w:szCs w:val="24"/>
-                <w:u w:val="none"/>
-              </w:rPr>
-              <w:t xml:space="preserve">. </w:t>
-            </w:r>
-            <w:r>
-              <w:rPr>
-                <w:b w:val="false"/>
-                <w:bCs w:val="false"/>
-                <w:i w:val="false"/>
-                <w:iCs w:val="false"/>
-                <w:strike w:val="false"/>
-                <w:dstrike w:val="false"/>
-                <w:outline w:val="false"/>
-                <w:shadow w:val="false"/>
-                <w:color w:val="auto"/>
-                <w:sz w:val="24"/>
-                <w:szCs w:val="24"/>
-                <w:u w:val="none"/>
-              </w:rPr>
-              <w:t>S</w:t>
-            </w:r>
-            <w:r>
-              <w:rPr>
-                <w:b w:val="false"/>
-                <w:bCs w:val="false"/>
-                <w:i w:val="false"/>
-                <w:iCs w:val="false"/>
-                <w:strike w:val="false"/>
-                <w:dstrike w:val="false"/>
-                <w:outline w:val="false"/>
-                <w:shadow w:val="false"/>
-                <w:color w:val="auto"/>
-                <w:sz w:val="24"/>
-                <w:szCs w:val="24"/>
-                <w:u w:val="none"/>
-              </w:rPr>
-              <w:t>t</w:t>
-            </w:r>
-            <w:r>
-              <w:rPr>
-                <w:b w:val="false"/>
-                <w:bCs w:val="false"/>
-                <w:i w:val="false"/>
-                <w:iCs w:val="false"/>
-                <w:strike w:val="false"/>
-                <w:dstrike w:val="false"/>
-                <w:outline w:val="false"/>
-                <w:shadow w:val="false"/>
-                <w:color w:val="auto"/>
-                <w:sz w:val="24"/>
-                <w:szCs w:val="24"/>
-                <w:u w:val="none"/>
-              </w:rPr>
-              <w:t>a</w:t>
-            </w:r>
-            <w:r>
-              <w:rPr>
-                <w:b w:val="false"/>
-                <w:bCs w:val="false"/>
-                <w:i w:val="false"/>
-                <w:iCs w:val="false"/>
-                <w:strike w:val="false"/>
-                <w:dstrike w:val="false"/>
-                <w:outline w:val="false"/>
-                <w:shadow w:val="false"/>
-                <w:color w:val="auto"/>
-                <w:sz w:val="24"/>
-                <w:szCs w:val="24"/>
-                <w:u w:val="none"/>
-              </w:rPr>
-              <w:t>t</w:t>
-            </w:r>
-            <w:r>
-              <w:rPr>
-                <w:b w:val="false"/>
-                <w:bCs w:val="false"/>
-                <w:i w:val="false"/>
-                <w:iCs w:val="false"/>
-                <w:strike w:val="false"/>
-                <w:dstrike w:val="false"/>
-                <w:outline w:val="false"/>
-                <w:shadow w:val="false"/>
-                <w:color w:val="auto"/>
-                <w:sz w:val="24"/>
-                <w:szCs w:val="24"/>
-                <w:u w:val="none"/>
-              </w:rPr>
-              <w:t>u</w:t>
-            </w:r>
-            <w:r>
-              <w:rPr>
-                <w:b w:val="false"/>
-                <w:bCs w:val="false"/>
-                <w:i w:val="false"/>
-                <w:iCs w:val="false"/>
-                <w:strike w:val="false"/>
-                <w:dstrike w:val="false"/>
-                <w:outline w:val="false"/>
-                <w:shadow w:val="false"/>
-                <w:color w:val="auto"/>
-                <w:sz w:val="24"/>
-                <w:szCs w:val="24"/>
-                <w:u w:val="none"/>
-              </w:rPr>
-              <w:t xml:space="preserve">s </w:t>
-            </w:r>
-            <w:r>
-              <w:rPr>
-                <w:b w:val="false"/>
-                <w:bCs w:val="false"/>
-                <w:i w:val="false"/>
-                <w:iCs w:val="false"/>
-                <w:strike w:val="false"/>
-                <w:dstrike w:val="false"/>
-                <w:outline w:val="false"/>
-                <w:shadow w:val="false"/>
-                <w:color w:val="auto"/>
-                <w:sz w:val="24"/>
-                <w:szCs w:val="24"/>
-                <w:u w:val="none"/>
-              </w:rPr>
-              <w:t>o</w:t>
-            </w:r>
-            <w:r>
-              <w:rPr>
-                <w:b w:val="false"/>
-                <w:bCs w:val="false"/>
-                <w:i w:val="false"/>
-                <w:iCs w:val="false"/>
-                <w:strike w:val="false"/>
-                <w:dstrike w:val="false"/>
-                <w:outline w:val="false"/>
-                <w:shadow w:val="false"/>
-                <w:color w:val="auto"/>
-                <w:sz w:val="24"/>
-                <w:szCs w:val="24"/>
-                <w:u w:val="none"/>
-              </w:rPr>
-              <w:t xml:space="preserve">f </w:t>
-            </w:r>
-            <w:r>
-              <w:rPr>
-                <w:b w:val="false"/>
-                <w:bCs w:val="false"/>
-                <w:i w:val="false"/>
-                <w:iCs w:val="false"/>
-                <w:strike w:val="false"/>
-                <w:dstrike w:val="false"/>
-                <w:outline w:val="false"/>
-                <w:shadow w:val="false"/>
-                <w:color w:val="auto"/>
-                <w:sz w:val="24"/>
-                <w:szCs w:val="24"/>
-                <w:u w:val="none"/>
-              </w:rPr>
-              <w:t>t</w:t>
-            </w:r>
-            <w:r>
-              <w:rPr>
-                <w:b w:val="false"/>
-                <w:bCs w:val="false"/>
-                <w:i w:val="false"/>
-                <w:iCs w:val="false"/>
-                <w:strike w:val="false"/>
-                <w:dstrike w:val="false"/>
-                <w:outline w:val="false"/>
-                <w:shadow w:val="false"/>
-                <w:color w:val="auto"/>
-                <w:sz w:val="24"/>
-                <w:szCs w:val="24"/>
-                <w:u w:val="none"/>
-              </w:rPr>
-              <w:t>h</w:t>
-            </w:r>
-            <w:r>
-              <w:rPr>
-                <w:b w:val="false"/>
-                <w:bCs w:val="false"/>
-                <w:i w:val="false"/>
-                <w:iCs w:val="false"/>
-                <w:strike w:val="false"/>
-                <w:dstrike w:val="false"/>
-                <w:outline w:val="false"/>
-                <w:shadow w:val="false"/>
-                <w:color w:val="auto"/>
-                <w:sz w:val="24"/>
-                <w:szCs w:val="24"/>
-                <w:u w:val="none"/>
-              </w:rPr>
-              <w:t xml:space="preserve">e </w:t>
-            </w:r>
-            <w:r>
-              <w:rPr>
-                <w:b w:val="false"/>
-                <w:bCs w:val="false"/>
-                <w:i w:val="false"/>
-                <w:iCs w:val="false"/>
-                <w:strike w:val="false"/>
-                <w:dstrike w:val="false"/>
-                <w:outline w:val="false"/>
-                <w:shadow w:val="false"/>
-                <w:color w:val="auto"/>
-                <w:sz w:val="24"/>
-                <w:szCs w:val="24"/>
-                <w:u w:val="none"/>
-              </w:rPr>
-              <w:t>F</w:t>
-            </w:r>
-            <w:r>
-              <w:rPr>
-                <w:b w:val="false"/>
-                <w:bCs w:val="false"/>
-                <w:i w:val="false"/>
-                <w:iCs w:val="false"/>
-                <w:strike w:val="false"/>
-                <w:dstrike w:val="false"/>
-                <w:outline w:val="false"/>
-                <w:shadow w:val="false"/>
-                <w:color w:val="auto"/>
-                <w:sz w:val="24"/>
-                <w:szCs w:val="24"/>
-                <w:u w:val="none"/>
-              </w:rPr>
-              <w:t>I</w:t>
-            </w:r>
-            <w:r>
-              <w:rPr>
-                <w:b w:val="false"/>
-                <w:bCs w:val="false"/>
-                <w:i w:val="false"/>
-                <w:iCs w:val="false"/>
-                <w:strike w:val="false"/>
-                <w:dstrike w:val="false"/>
-                <w:outline w:val="false"/>
-                <w:shadow w:val="false"/>
-                <w:color w:val="auto"/>
-                <w:sz w:val="24"/>
-                <w:szCs w:val="24"/>
-                <w:u w:val="none"/>
-              </w:rPr>
-              <w:t>F</w:t>
-            </w:r>
-            <w:r>
-              <w:rPr>
-                <w:b w:val="false"/>
-                <w:bCs w:val="false"/>
-                <w:i w:val="false"/>
-                <w:iCs w:val="false"/>
-                <w:strike w:val="false"/>
-                <w:dstrike w:val="false"/>
-                <w:outline w:val="false"/>
-                <w:shadow w:val="false"/>
-                <w:color w:val="auto"/>
-                <w:sz w:val="24"/>
-                <w:szCs w:val="24"/>
-                <w:u w:val="none"/>
-              </w:rPr>
-              <w:t xml:space="preserve">O. </w:t>
+              <w:t>DEPRECATED</w:t>
+            </w:r>
+            <w:r>
+              <w:rPr>
+                <w:b w:val="false"/>
+                <w:bCs w:val="false"/>
+                <w:i w:val="false"/>
+                <w:iCs w:val="false"/>
+                <w:strike w:val="false"/>
+                <w:dstrike w:val="false"/>
+                <w:outline w:val="false"/>
+                <w:shadow w:val="false"/>
+                <w:color w:val="auto"/>
+                <w:sz w:val="24"/>
+                <w:szCs w:val="24"/>
+                <w:u w:val="none"/>
+              </w:rPr>
+              <w:t xml:space="preserve">. Status of the FIFO. </w:t>
             </w:r>
           </w:p>
         </w:tc>
@@ -12728,7 +12405,7 @@
         </w:tc>
         <w:tc>
           <w:tcPr>
-            <w:tcW w:w="1358" w:type="dxa"/>
+            <w:tcW w:w="1359" w:type="dxa"/>
             <w:tcBorders>
               <w:start w:val="single" w:sz="4" w:space="0" w:color="000000"/>
               <w:bottom w:val="single" w:sz="4" w:space="0" w:color="000000"/>
@@ -12826,7 +12503,7 @@
         <w:trPr/>
         <w:tc>
           <w:tcPr>
-            <w:tcW w:w="1850" w:type="dxa"/>
+            <w:tcW w:w="1849" w:type="dxa"/>
             <w:tcBorders>
               <w:start w:val="single" w:sz="4" w:space="0" w:color="000000"/>
               <w:bottom w:val="single" w:sz="4" w:space="0" w:color="000000"/>
@@ -13268,7 +12945,7 @@
         </w:tc>
         <w:tc>
           <w:tcPr>
-            <w:tcW w:w="1358" w:type="dxa"/>
+            <w:tcW w:w="1359" w:type="dxa"/>
             <w:tcBorders>
               <w:start w:val="single" w:sz="4" w:space="0" w:color="000000"/>
               <w:bottom w:val="single" w:sz="4" w:space="0" w:color="000000"/>
@@ -13366,7 +13043,7 @@
         <w:trPr/>
         <w:tc>
           <w:tcPr>
-            <w:tcW w:w="1850" w:type="dxa"/>
+            <w:tcW w:w="1849" w:type="dxa"/>
             <w:tcBorders>
               <w:start w:val="single" w:sz="4" w:space="0" w:color="000000"/>
               <w:bottom w:val="single" w:sz="4" w:space="0" w:color="000000"/>
@@ -13698,7 +13375,7 @@
         </w:tc>
         <w:tc>
           <w:tcPr>
-            <w:tcW w:w="1358" w:type="dxa"/>
+            <w:tcW w:w="1359" w:type="dxa"/>
             <w:tcBorders>
               <w:start w:val="single" w:sz="4" w:space="0" w:color="000000"/>
               <w:bottom w:val="single" w:sz="4" w:space="0" w:color="000000"/>
@@ -13947,7 +13624,7 @@
         <w:trPr/>
         <w:tc>
           <w:tcPr>
-            <w:tcW w:w="1850" w:type="dxa"/>
+            <w:tcW w:w="1849" w:type="dxa"/>
             <w:tcBorders>
               <w:start w:val="single" w:sz="4" w:space="0" w:color="000000"/>
               <w:bottom w:val="single" w:sz="4" w:space="0" w:color="000000"/>
@@ -14088,7 +13765,7 @@
         </w:tc>
         <w:tc>
           <w:tcPr>
-            <w:tcW w:w="1358" w:type="dxa"/>
+            <w:tcW w:w="1359" w:type="dxa"/>
             <w:tcBorders>
               <w:start w:val="single" w:sz="4" w:space="0" w:color="000000"/>
               <w:bottom w:val="single" w:sz="4" w:space="0" w:color="000000"/>
@@ -14228,9 +13905,9 @@
       </w:tblPr>
       <w:tblGrid>
         <w:gridCol w:w="1678"/>
-        <w:gridCol w:w="2966"/>
+        <w:gridCol w:w="2965"/>
         <w:gridCol w:w="1884"/>
-        <w:gridCol w:w="1535"/>
+        <w:gridCol w:w="1536"/>
         <w:gridCol w:w="1909"/>
       </w:tblGrid>
       <w:tr>
@@ -14274,7 +13951,7 @@
         </w:tc>
         <w:tc>
           <w:tcPr>
-            <w:tcW w:w="2966" w:type="dxa"/>
+            <w:tcW w:w="2965" w:type="dxa"/>
             <w:tcBorders>
               <w:top w:val="single" w:sz="4" w:space="0" w:color="000000"/>
               <w:start w:val="single" w:sz="4" w:space="0" w:color="000000"/>
@@ -14348,7 +14025,7 @@
         </w:tc>
         <w:tc>
           <w:tcPr>
-            <w:tcW w:w="1535" w:type="dxa"/>
+            <w:tcW w:w="1536" w:type="dxa"/>
             <w:tcBorders>
               <w:top w:val="single" w:sz="4" w:space="0" w:color="000000"/>
               <w:start w:val="single" w:sz="4" w:space="0" w:color="000000"/>
@@ -14473,7 +14150,7 @@
         </w:tc>
         <w:tc>
           <w:tcPr>
-            <w:tcW w:w="2966" w:type="dxa"/>
+            <w:tcW w:w="2965" w:type="dxa"/>
             <w:tcBorders>
               <w:start w:val="single" w:sz="4" w:space="0" w:color="000000"/>
               <w:bottom w:val="single" w:sz="4" w:space="0" w:color="000000"/>
@@ -14514,6 +14191,363 @@
               <w:rPr/>
               <w:t>.</w:t>
             </w:r>
+            <w:r>
+              <w:rPr>
+                <w:b w:val="false"/>
+                <w:bCs w:val="false"/>
+                <w:i w:val="false"/>
+                <w:iCs w:val="false"/>
+                <w:strike w:val="false"/>
+                <w:dstrike w:val="false"/>
+                <w:outline w:val="false"/>
+                <w:shadow w:val="false"/>
+                <w:color w:val="auto"/>
+                <w:sz w:val="24"/>
+                <w:szCs w:val="24"/>
+                <w:u w:val="none"/>
+              </w:rPr>
+              <w:t xml:space="preserve"> </w:t>
+            </w:r>
+            <w:r>
+              <w:rPr>
+                <w:b w:val="false"/>
+                <w:bCs w:val="false"/>
+                <w:i w:val="false"/>
+                <w:iCs w:val="false"/>
+                <w:strike w:val="false"/>
+                <w:dstrike w:val="false"/>
+                <w:outline w:val="false"/>
+                <w:shadow w:val="false"/>
+                <w:color w:val="auto"/>
+                <w:sz w:val="24"/>
+                <w:szCs w:val="24"/>
+                <w:u w:val="none"/>
+              </w:rPr>
+              <w:t>M</w:t>
+            </w:r>
+            <w:r>
+              <w:rPr>
+                <w:b w:val="false"/>
+                <w:bCs w:val="false"/>
+                <w:i w:val="false"/>
+                <w:iCs w:val="false"/>
+                <w:strike w:val="false"/>
+                <w:dstrike w:val="false"/>
+                <w:outline w:val="false"/>
+                <w:shadow w:val="false"/>
+                <w:color w:val="auto"/>
+                <w:sz w:val="24"/>
+                <w:szCs w:val="24"/>
+                <w:u w:val="none"/>
+              </w:rPr>
+              <w:t>e</w:t>
+            </w:r>
+            <w:r>
+              <w:rPr>
+                <w:b w:val="false"/>
+                <w:bCs w:val="false"/>
+                <w:i w:val="false"/>
+                <w:iCs w:val="false"/>
+                <w:strike w:val="false"/>
+                <w:dstrike w:val="false"/>
+                <w:outline w:val="false"/>
+                <w:shadow w:val="false"/>
+                <w:color w:val="auto"/>
+                <w:sz w:val="24"/>
+                <w:szCs w:val="24"/>
+                <w:u w:val="none"/>
+              </w:rPr>
+              <w:t>a</w:t>
+            </w:r>
+            <w:r>
+              <w:rPr>
+                <w:b w:val="false"/>
+                <w:bCs w:val="false"/>
+                <w:i w:val="false"/>
+                <w:iCs w:val="false"/>
+                <w:strike w:val="false"/>
+                <w:dstrike w:val="false"/>
+                <w:outline w:val="false"/>
+                <w:shadow w:val="false"/>
+                <w:color w:val="auto"/>
+                <w:sz w:val="24"/>
+                <w:szCs w:val="24"/>
+                <w:u w:val="none"/>
+              </w:rPr>
+              <w:t>s</w:t>
+            </w:r>
+            <w:r>
+              <w:rPr>
+                <w:b w:val="false"/>
+                <w:bCs w:val="false"/>
+                <w:i w:val="false"/>
+                <w:iCs w:val="false"/>
+                <w:strike w:val="false"/>
+                <w:dstrike w:val="false"/>
+                <w:outline w:val="false"/>
+                <w:shadow w:val="false"/>
+                <w:color w:val="auto"/>
+                <w:sz w:val="24"/>
+                <w:szCs w:val="24"/>
+                <w:u w:val="none"/>
+              </w:rPr>
+              <w:t>u</w:t>
+            </w:r>
+            <w:r>
+              <w:rPr>
+                <w:b w:val="false"/>
+                <w:bCs w:val="false"/>
+                <w:i w:val="false"/>
+                <w:iCs w:val="false"/>
+                <w:strike w:val="false"/>
+                <w:dstrike w:val="false"/>
+                <w:outline w:val="false"/>
+                <w:shadow w:val="false"/>
+                <w:color w:val="auto"/>
+                <w:sz w:val="24"/>
+                <w:szCs w:val="24"/>
+                <w:u w:val="none"/>
+              </w:rPr>
+              <w:t>r</w:t>
+            </w:r>
+            <w:r>
+              <w:rPr>
+                <w:b w:val="false"/>
+                <w:bCs w:val="false"/>
+                <w:i w:val="false"/>
+                <w:iCs w:val="false"/>
+                <w:strike w:val="false"/>
+                <w:dstrike w:val="false"/>
+                <w:outline w:val="false"/>
+                <w:shadow w:val="false"/>
+                <w:color w:val="auto"/>
+                <w:sz w:val="24"/>
+                <w:szCs w:val="24"/>
+                <w:u w:val="none"/>
+              </w:rPr>
+              <w:t>e</w:t>
+            </w:r>
+            <w:r>
+              <w:rPr>
+                <w:b w:val="false"/>
+                <w:bCs w:val="false"/>
+                <w:i w:val="false"/>
+                <w:iCs w:val="false"/>
+                <w:strike w:val="false"/>
+                <w:dstrike w:val="false"/>
+                <w:outline w:val="false"/>
+                <w:shadow w:val="false"/>
+                <w:color w:val="auto"/>
+                <w:sz w:val="24"/>
+                <w:szCs w:val="24"/>
+                <w:u w:val="none"/>
+              </w:rPr>
+              <w:t xml:space="preserve">d </w:t>
+            </w:r>
+            <w:r>
+              <w:rPr>
+                <w:b w:val="false"/>
+                <w:bCs w:val="false"/>
+                <w:i w:val="false"/>
+                <w:iCs w:val="false"/>
+                <w:strike w:val="false"/>
+                <w:dstrike w:val="false"/>
+                <w:outline w:val="false"/>
+                <w:shadow w:val="false"/>
+                <w:color w:val="auto"/>
+                <w:sz w:val="24"/>
+                <w:szCs w:val="24"/>
+                <w:u w:val="none"/>
+              </w:rPr>
+              <w:t>u</w:t>
+            </w:r>
+            <w:r>
+              <w:rPr>
+                <w:b w:val="false"/>
+                <w:bCs w:val="false"/>
+                <w:i w:val="false"/>
+                <w:iCs w:val="false"/>
+                <w:strike w:val="false"/>
+                <w:dstrike w:val="false"/>
+                <w:outline w:val="false"/>
+                <w:shadow w:val="false"/>
+                <w:color w:val="auto"/>
+                <w:sz w:val="24"/>
+                <w:szCs w:val="24"/>
+                <w:u w:val="none"/>
+              </w:rPr>
+              <w:t>s</w:t>
+            </w:r>
+            <w:r>
+              <w:rPr>
+                <w:b w:val="false"/>
+                <w:bCs w:val="false"/>
+                <w:i w:val="false"/>
+                <w:iCs w:val="false"/>
+                <w:strike w:val="false"/>
+                <w:dstrike w:val="false"/>
+                <w:outline w:val="false"/>
+                <w:shadow w:val="false"/>
+                <w:color w:val="auto"/>
+                <w:sz w:val="24"/>
+                <w:szCs w:val="24"/>
+                <w:u w:val="none"/>
+              </w:rPr>
+              <w:t>i</w:t>
+            </w:r>
+            <w:r>
+              <w:rPr>
+                <w:b w:val="false"/>
+                <w:bCs w:val="false"/>
+                <w:i w:val="false"/>
+                <w:iCs w:val="false"/>
+                <w:strike w:val="false"/>
+                <w:dstrike w:val="false"/>
+                <w:outline w:val="false"/>
+                <w:shadow w:val="false"/>
+                <w:color w:val="auto"/>
+                <w:sz w:val="24"/>
+                <w:szCs w:val="24"/>
+                <w:u w:val="none"/>
+              </w:rPr>
+              <w:t>n</w:t>
+            </w:r>
+            <w:r>
+              <w:rPr>
+                <w:b w:val="false"/>
+                <w:bCs w:val="false"/>
+                <w:i w:val="false"/>
+                <w:iCs w:val="false"/>
+                <w:strike w:val="false"/>
+                <w:dstrike w:val="false"/>
+                <w:outline w:val="false"/>
+                <w:shadow w:val="false"/>
+                <w:color w:val="auto"/>
+                <w:sz w:val="24"/>
+                <w:szCs w:val="24"/>
+                <w:u w:val="none"/>
+              </w:rPr>
+              <w:t xml:space="preserve">g </w:t>
+            </w:r>
+            <w:r>
+              <w:rPr>
+                <w:b/>
+                <w:bCs/>
+                <w:i w:val="false"/>
+                <w:iCs w:val="false"/>
+                <w:strike w:val="false"/>
+                <w:dstrike w:val="false"/>
+                <w:outline w:val="false"/>
+                <w:shadow w:val="false"/>
+                <w:color w:val="auto"/>
+                <w:sz w:val="24"/>
+                <w:szCs w:val="24"/>
+                <w:u w:val="none"/>
+              </w:rPr>
+              <w:t>T</w:t>
+            </w:r>
+            <w:r>
+              <w:rPr>
+                <w:b/>
+                <w:bCs/>
+                <w:i w:val="false"/>
+                <w:iCs w:val="false"/>
+                <w:strike w:val="false"/>
+                <w:dstrike w:val="false"/>
+                <w:outline w:val="false"/>
+                <w:shadow w:val="false"/>
+                <w:color w:val="auto"/>
+                <w:sz w:val="24"/>
+                <w:szCs w:val="24"/>
+                <w:u w:val="none"/>
+              </w:rPr>
+              <w:t>i</w:t>
+            </w:r>
+            <w:r>
+              <w:rPr>
+                <w:b/>
+                <w:bCs/>
+                <w:i w:val="false"/>
+                <w:iCs w:val="false"/>
+                <w:strike w:val="false"/>
+                <w:dstrike w:val="false"/>
+                <w:outline w:val="false"/>
+                <w:shadow w:val="false"/>
+                <w:color w:val="auto"/>
+                <w:sz w:val="24"/>
+                <w:szCs w:val="24"/>
+                <w:u w:val="none"/>
+              </w:rPr>
+              <w:t>m</w:t>
+            </w:r>
+            <w:r>
+              <w:rPr>
+                <w:b/>
+                <w:bCs/>
+                <w:i w:val="false"/>
+                <w:iCs w:val="false"/>
+                <w:strike w:val="false"/>
+                <w:dstrike w:val="false"/>
+                <w:outline w:val="false"/>
+                <w:shadow w:val="false"/>
+                <w:color w:val="auto"/>
+                <w:sz w:val="24"/>
+                <w:szCs w:val="24"/>
+                <w:u w:val="none"/>
+              </w:rPr>
+              <w:t>e</w:t>
+            </w:r>
+            <w:r>
+              <w:rPr>
+                <w:b/>
+                <w:bCs/>
+                <w:i w:val="false"/>
+                <w:iCs w:val="false"/>
+                <w:strike w:val="false"/>
+                <w:dstrike w:val="false"/>
+                <w:outline w:val="false"/>
+                <w:shadow w:val="false"/>
+                <w:color w:val="auto"/>
+                <w:sz w:val="24"/>
+                <w:szCs w:val="24"/>
+                <w:u w:val="none"/>
+              </w:rPr>
+              <w:t xml:space="preserve">r </w:t>
+            </w:r>
+            <w:r>
+              <w:rPr>
+                <w:b/>
+                <w:bCs/>
+                <w:i w:val="false"/>
+                <w:iCs w:val="false"/>
+                <w:strike w:val="false"/>
+                <w:dstrike w:val="false"/>
+                <w:outline w:val="false"/>
+                <w:shadow w:val="false"/>
+                <w:color w:val="auto"/>
+                <w:sz w:val="24"/>
+                <w:szCs w:val="24"/>
+                <w:u w:val="none"/>
+              </w:rPr>
+              <w:t>C</w:t>
+            </w:r>
+            <w:r>
+              <w:rPr>
+                <w:b w:val="false"/>
+                <w:bCs w:val="false"/>
+                <w:i w:val="false"/>
+                <w:iCs w:val="false"/>
+                <w:strike w:val="false"/>
+                <w:dstrike w:val="false"/>
+                <w:outline w:val="false"/>
+                <w:shadow w:val="false"/>
+                <w:color w:val="auto"/>
+                <w:sz w:val="24"/>
+                <w:szCs w:val="24"/>
+                <w:u w:val="none"/>
+              </w:rPr>
+              <w:t>.</w:t>
+            </w:r>
           </w:p>
         </w:tc>
         <w:tc>
@@ -14552,7 +14586,7 @@
         </w:tc>
         <w:tc>
           <w:tcPr>
-            <w:tcW w:w="1535" w:type="dxa"/>
+            <w:tcW w:w="1536" w:type="dxa"/>
             <w:tcBorders>
               <w:start w:val="single" w:sz="4" w:space="0" w:color="000000"/>
               <w:bottom w:val="single" w:sz="4" w:space="0" w:color="000000"/>
@@ -14725,7 +14759,7 @@
         </w:tc>
         <w:tc>
           <w:tcPr>
-            <w:tcW w:w="2966" w:type="dxa"/>
+            <w:tcW w:w="2965" w:type="dxa"/>
             <w:tcBorders>
               <w:start w:val="single" w:sz="4" w:space="0" w:color="000000"/>
               <w:bottom w:val="single" w:sz="4" w:space="0" w:color="000000"/>
@@ -15225,7 +15259,7 @@
         </w:tc>
         <w:tc>
           <w:tcPr>
-            <w:tcW w:w="1535" w:type="dxa"/>
+            <w:tcW w:w="1536" w:type="dxa"/>
             <w:tcBorders>
               <w:start w:val="single" w:sz="4" w:space="0" w:color="000000"/>
               <w:bottom w:val="single" w:sz="4" w:space="0" w:color="000000"/>
@@ -15448,17 +15482,17 @@
         </w:tblCellMar>
       </w:tblPr>
       <w:tblGrid>
-        <w:gridCol w:w="1128"/>
+        <w:gridCol w:w="1127"/>
         <w:gridCol w:w="3600"/>
         <w:gridCol w:w="1444"/>
-        <w:gridCol w:w="1178"/>
+        <w:gridCol w:w="1179"/>
         <w:gridCol w:w="2622"/>
       </w:tblGrid>
       <w:tr>
         <w:trPr/>
         <w:tc>
           <w:tcPr>
-            <w:tcW w:w="1128" w:type="dxa"/>
+            <w:tcW w:w="1127" w:type="dxa"/>
             <w:tcBorders>
               <w:top w:val="single" w:sz="4" w:space="0" w:color="000000"/>
               <w:start w:val="single" w:sz="4" w:space="0" w:color="000000"/>
@@ -15569,7 +15603,7 @@
         </w:tc>
         <w:tc>
           <w:tcPr>
-            <w:tcW w:w="1178" w:type="dxa"/>
+            <w:tcW w:w="1179" w:type="dxa"/>
             <w:tcBorders>
               <w:top w:val="single" w:sz="4" w:space="0" w:color="000000"/>
               <w:start w:val="single" w:sz="4" w:space="0" w:color="000000"/>
@@ -15649,7 +15683,7 @@
         </w:trPr>
         <w:tc>
           <w:tcPr>
-            <w:tcW w:w="1128" w:type="dxa"/>
+            <w:tcW w:w="1127" w:type="dxa"/>
             <w:tcBorders>
               <w:start w:val="single" w:sz="4" w:space="0" w:color="000000"/>
               <w:bottom w:val="single" w:sz="4" w:space="0" w:color="000000"/>
@@ -15802,7 +15836,7 @@
         </w:tc>
         <w:tc>
           <w:tcPr>
-            <w:tcW w:w="1178" w:type="dxa"/>
+            <w:tcW w:w="1179" w:type="dxa"/>
             <w:tcBorders>
               <w:start w:val="single" w:sz="4" w:space="0" w:color="000000"/>
               <w:bottom w:val="single" w:sz="4" w:space="0" w:color="000000"/>
@@ -15940,7 +15974,7 @@
         <w:trPr/>
         <w:tc>
           <w:tcPr>
-            <w:tcW w:w="1128" w:type="dxa"/>
+            <w:tcW w:w="1127" w:type="dxa"/>
             <w:tcBorders>
               <w:start w:val="single" w:sz="4" w:space="0" w:color="000000"/>
               <w:bottom w:val="single" w:sz="4" w:space="0" w:color="000000"/>
@@ -16625,7 +16659,7 @@
         </w:tc>
         <w:tc>
           <w:tcPr>
-            <w:tcW w:w="1178" w:type="dxa"/>
+            <w:tcW w:w="1179" w:type="dxa"/>
             <w:tcBorders>
               <w:start w:val="single" w:sz="4" w:space="0" w:color="000000"/>
               <w:bottom w:val="single" w:sz="4" w:space="0" w:color="000000"/>
@@ -16799,7 +16833,7 @@
         <w:trPr/>
         <w:tc>
           <w:tcPr>
-            <w:tcW w:w="1128" w:type="dxa"/>
+            <w:tcW w:w="1127" w:type="dxa"/>
             <w:tcBorders>
               <w:start w:val="single" w:sz="4" w:space="0" w:color="000000"/>
               <w:bottom w:val="single" w:sz="4" w:space="0" w:color="000000"/>
@@ -16939,7 +16973,7 @@
         </w:tc>
         <w:tc>
           <w:tcPr>
-            <w:tcW w:w="1178" w:type="dxa"/>
+            <w:tcW w:w="1179" w:type="dxa"/>
             <w:tcBorders>
               <w:start w:val="single" w:sz="4" w:space="0" w:color="000000"/>
               <w:bottom w:val="single" w:sz="4" w:space="0" w:color="000000"/>
@@ -17037,7 +17071,7 @@
         <w:trPr/>
         <w:tc>
           <w:tcPr>
-            <w:tcW w:w="1128" w:type="dxa"/>
+            <w:tcW w:w="1127" w:type="dxa"/>
             <w:tcBorders>
               <w:start w:val="single" w:sz="4" w:space="0" w:color="000000"/>
               <w:bottom w:val="single" w:sz="4" w:space="0" w:color="000000"/>
@@ -17471,7 +17505,7 @@
         </w:tc>
         <w:tc>
           <w:tcPr>
-            <w:tcW w:w="1178" w:type="dxa"/>
+            <w:tcW w:w="1179" w:type="dxa"/>
             <w:tcBorders>
               <w:start w:val="single" w:sz="4" w:space="0" w:color="000000"/>
               <w:bottom w:val="single" w:sz="4" w:space="0" w:color="000000"/>
@@ -17645,7 +17679,7 @@
         <w:trPr/>
         <w:tc>
           <w:tcPr>
-            <w:tcW w:w="1128" w:type="dxa"/>
+            <w:tcW w:w="1127" w:type="dxa"/>
             <w:tcBorders>
               <w:start w:val="single" w:sz="4" w:space="0" w:color="000000"/>
               <w:bottom w:val="single" w:sz="4" w:space="0" w:color="000000"/>
@@ -17819,7 +17853,7 @@
         </w:tc>
         <w:tc>
           <w:tcPr>
-            <w:tcW w:w="1178" w:type="dxa"/>
+            <w:tcW w:w="1179" w:type="dxa"/>
             <w:tcBorders>
               <w:start w:val="single" w:sz="4" w:space="0" w:color="000000"/>
               <w:bottom w:val="single" w:sz="4" w:space="0" w:color="000000"/>
@@ -17917,7 +17951,7 @@
         <w:trPr/>
         <w:tc>
           <w:tcPr>
-            <w:tcW w:w="1128" w:type="dxa"/>
+            <w:tcW w:w="1127" w:type="dxa"/>
             <w:tcBorders>
               <w:start w:val="single" w:sz="4" w:space="0" w:color="000000"/>
               <w:bottom w:val="single" w:sz="4" w:space="0" w:color="000000"/>
@@ -18091,7 +18125,7 @@
         </w:tc>
         <w:tc>
           <w:tcPr>
-            <w:tcW w:w="1178" w:type="dxa"/>
+            <w:tcW w:w="1179" w:type="dxa"/>
             <w:tcBorders>
               <w:start w:val="single" w:sz="4" w:space="0" w:color="000000"/>
               <w:bottom w:val="single" w:sz="4" w:space="0" w:color="000000"/>
@@ -18189,7 +18223,7 @@
         <w:trPr/>
         <w:tc>
           <w:tcPr>
-            <w:tcW w:w="1128" w:type="dxa"/>
+            <w:tcW w:w="1127" w:type="dxa"/>
             <w:tcBorders>
               <w:start w:val="single" w:sz="4" w:space="0" w:color="000000"/>
               <w:bottom w:val="single" w:sz="4" w:space="0" w:color="000000"/>
@@ -18329,7 +18363,7 @@
         </w:tc>
         <w:tc>
           <w:tcPr>
-            <w:tcW w:w="1178" w:type="dxa"/>
+            <w:tcW w:w="1179" w:type="dxa"/>
             <w:tcBorders>
               <w:start w:val="single" w:sz="4" w:space="0" w:color="000000"/>
               <w:bottom w:val="single" w:sz="4" w:space="0" w:color="000000"/>
@@ -18478,8 +18512,8 @@
       </w:tblPr>
       <w:tblGrid>
         <w:gridCol w:w="1313"/>
-        <w:gridCol w:w="3331"/>
-        <w:gridCol w:w="1356"/>
+        <w:gridCol w:w="3330"/>
+        <w:gridCol w:w="1357"/>
         <w:gridCol w:w="1350"/>
         <w:gridCol w:w="2622"/>
       </w:tblGrid>
@@ -18524,7 +18558,7 @@
         </w:tc>
         <w:tc>
           <w:tcPr>
-            <w:tcW w:w="3331" w:type="dxa"/>
+            <w:tcW w:w="3330" w:type="dxa"/>
             <w:tcBorders>
               <w:top w:val="single" w:sz="4" w:space="0" w:color="000000"/>
               <w:start w:val="single" w:sz="4" w:space="0" w:color="000000"/>
@@ -18561,7 +18595,7 @@
         </w:tc>
         <w:tc>
           <w:tcPr>
-            <w:tcW w:w="1356" w:type="dxa"/>
+            <w:tcW w:w="1357" w:type="dxa"/>
             <w:tcBorders>
               <w:top w:val="single" w:sz="4" w:space="0" w:color="000000"/>
               <w:start w:val="single" w:sz="4" w:space="0" w:color="000000"/>
@@ -18723,7 +18757,7 @@
         </w:tc>
         <w:tc>
           <w:tcPr>
-            <w:tcW w:w="3331" w:type="dxa"/>
+            <w:tcW w:w="3330" w:type="dxa"/>
             <w:tcBorders>
               <w:start w:val="single" w:sz="4" w:space="0" w:color="000000"/>
               <w:bottom w:val="single" w:sz="4" w:space="0" w:color="000000"/>
@@ -18994,7 +19028,7 @@
         </w:tc>
         <w:tc>
           <w:tcPr>
-            <w:tcW w:w="1356" w:type="dxa"/>
+            <w:tcW w:w="1357" w:type="dxa"/>
             <w:tcBorders>
               <w:start w:val="single" w:sz="4" w:space="0" w:color="000000"/>
               <w:bottom w:val="single" w:sz="4" w:space="0" w:color="000000"/>
@@ -19204,17 +19238,17 @@
         </w:tblCellMar>
       </w:tblPr>
       <w:tblGrid>
-        <w:gridCol w:w="2150"/>
+        <w:gridCol w:w="2149"/>
         <w:gridCol w:w="1800"/>
         <w:gridCol w:w="1894"/>
-        <w:gridCol w:w="1900"/>
+        <w:gridCol w:w="1901"/>
         <w:gridCol w:w="2228"/>
       </w:tblGrid>
       <w:tr>
         <w:trPr/>
         <w:tc>
           <w:tcPr>
-            <w:tcW w:w="2150" w:type="dxa"/>
+            <w:tcW w:w="2149" w:type="dxa"/>
             <w:tcBorders>
               <w:top w:val="single" w:sz="4" w:space="0" w:color="000000"/>
               <w:start w:val="single" w:sz="4" w:space="0" w:color="000000"/>
@@ -19325,7 +19359,7 @@
         </w:tc>
         <w:tc>
           <w:tcPr>
-            <w:tcW w:w="1900" w:type="dxa"/>
+            <w:tcW w:w="1901" w:type="dxa"/>
             <w:tcBorders>
               <w:top w:val="single" w:sz="4" w:space="0" w:color="000000"/>
               <w:start w:val="single" w:sz="4" w:space="0" w:color="000000"/>
@@ -19403,7 +19437,7 @@
         <w:trPr/>
         <w:tc>
           <w:tcPr>
-            <w:tcW w:w="2150" w:type="dxa"/>
+            <w:tcW w:w="2149" w:type="dxa"/>
             <w:tcBorders>
               <w:start w:val="single" w:sz="4" w:space="0" w:color="000000"/>
               <w:bottom w:val="single" w:sz="4" w:space="0" w:color="000000"/>
@@ -19509,7 +19543,7 @@
         </w:tc>
         <w:tc>
           <w:tcPr>
-            <w:tcW w:w="1900" w:type="dxa"/>
+            <w:tcW w:w="1901" w:type="dxa"/>
             <w:tcBorders>
               <w:start w:val="single" w:sz="4" w:space="0" w:color="000000"/>
               <w:bottom w:val="single" w:sz="4" w:space="0" w:color="000000"/>
@@ -19585,7 +19619,7 @@
         <w:trPr/>
         <w:tc>
           <w:tcPr>
-            <w:tcW w:w="2150" w:type="dxa"/>
+            <w:tcW w:w="2149" w:type="dxa"/>
             <w:tcBorders>
               <w:start w:val="single" w:sz="4" w:space="0" w:color="000000"/>
               <w:bottom w:val="single" w:sz="4" w:space="0" w:color="000000"/>
@@ -19692,7 +19726,7 @@
         </w:tc>
         <w:tc>
           <w:tcPr>
-            <w:tcW w:w="1900" w:type="dxa"/>
+            <w:tcW w:w="1901" w:type="dxa"/>
             <w:tcBorders>
               <w:start w:val="single" w:sz="4" w:space="0" w:color="000000"/>
               <w:bottom w:val="single" w:sz="4" w:space="0" w:color="000000"/>
@@ -19768,7 +19802,7 @@
         <w:trPr/>
         <w:tc>
           <w:tcPr>
-            <w:tcW w:w="2150" w:type="dxa"/>
+            <w:tcW w:w="2149" w:type="dxa"/>
             <w:tcBorders>
               <w:start w:val="single" w:sz="4" w:space="0" w:color="000000"/>
               <w:bottom w:val="single" w:sz="4" w:space="0" w:color="000000"/>
@@ -19875,7 +19909,7 @@
         </w:tc>
         <w:tc>
           <w:tcPr>
-            <w:tcW w:w="1900" w:type="dxa"/>
+            <w:tcW w:w="1901" w:type="dxa"/>
             <w:tcBorders>
               <w:start w:val="single" w:sz="4" w:space="0" w:color="000000"/>
               <w:bottom w:val="single" w:sz="4" w:space="0" w:color="000000"/>
@@ -21278,9 +21312,9 @@
       </w:tblPr>
       <w:tblGrid>
         <w:gridCol w:w="1350"/>
-        <w:gridCol w:w="2926"/>
+        <w:gridCol w:w="2925"/>
         <w:gridCol w:w="1800"/>
-        <w:gridCol w:w="1358"/>
+        <w:gridCol w:w="1359"/>
         <w:gridCol w:w="2538"/>
       </w:tblGrid>
       <w:tr>
@@ -21324,7 +21358,7 @@
         </w:tc>
         <w:tc>
           <w:tcPr>
-            <w:tcW w:w="2926" w:type="dxa"/>
+            <w:tcW w:w="2925" w:type="dxa"/>
             <w:tcBorders>
               <w:top w:val="single" w:sz="4" w:space="0" w:color="000000"/>
               <w:start w:val="single" w:sz="4" w:space="0" w:color="000000"/>
@@ -21398,7 +21432,7 @@
         </w:tc>
         <w:tc>
           <w:tcPr>
-            <w:tcW w:w="1358" w:type="dxa"/>
+            <w:tcW w:w="1359" w:type="dxa"/>
             <w:tcBorders>
               <w:top w:val="single" w:sz="4" w:space="0" w:color="000000"/>
               <w:start w:val="single" w:sz="4" w:space="0" w:color="000000"/>
@@ -21523,7 +21557,7 @@
         </w:tc>
         <w:tc>
           <w:tcPr>
-            <w:tcW w:w="2926" w:type="dxa"/>
+            <w:tcW w:w="2925" w:type="dxa"/>
             <w:tcBorders>
               <w:start w:val="single" w:sz="4" w:space="0" w:color="000000"/>
               <w:bottom w:val="single" w:sz="4" w:space="0" w:color="000000"/>
@@ -21651,7 +21685,7 @@
         </w:tc>
         <w:tc>
           <w:tcPr>
-            <w:tcW w:w="1358" w:type="dxa"/>
+            <w:tcW w:w="1359" w:type="dxa"/>
             <w:tcBorders>
               <w:start w:val="single" w:sz="4" w:space="0" w:color="000000"/>
               <w:bottom w:val="single" w:sz="4" w:space="0" w:color="000000"/>
@@ -21796,7 +21830,7 @@
         </w:tc>
         <w:tc>
           <w:tcPr>
-            <w:tcW w:w="2926" w:type="dxa"/>
+            <w:tcW w:w="2925" w:type="dxa"/>
             <w:tcBorders>
               <w:start w:val="single" w:sz="4" w:space="0" w:color="000000"/>
               <w:bottom w:val="single" w:sz="4" w:space="0" w:color="000000"/>
@@ -21907,7 +21941,7 @@
         </w:tc>
         <w:tc>
           <w:tcPr>
-            <w:tcW w:w="1358" w:type="dxa"/>
+            <w:tcW w:w="1359" w:type="dxa"/>
             <w:tcBorders>
               <w:start w:val="single" w:sz="4" w:space="0" w:color="000000"/>
               <w:bottom w:val="single" w:sz="4" w:space="0" w:color="000000"/>
@@ -22052,7 +22086,7 @@
         </w:tc>
         <w:tc>
           <w:tcPr>
-            <w:tcW w:w="2926" w:type="dxa"/>
+            <w:tcW w:w="2925" w:type="dxa"/>
             <w:tcBorders>
               <w:start w:val="single" w:sz="4" w:space="0" w:color="000000"/>
               <w:bottom w:val="single" w:sz="4" w:space="0" w:color="000000"/>
@@ -22163,7 +22197,7 @@
         </w:tc>
         <w:tc>
           <w:tcPr>
-            <w:tcW w:w="1358" w:type="dxa"/>
+            <w:tcW w:w="1359" w:type="dxa"/>
             <w:tcBorders>
               <w:start w:val="single" w:sz="4" w:space="0" w:color="000000"/>
               <w:bottom w:val="single" w:sz="4" w:space="0" w:color="000000"/>
@@ -22308,7 +22342,7 @@
         </w:tc>
         <w:tc>
           <w:tcPr>
-            <w:tcW w:w="2926" w:type="dxa"/>
+            <w:tcW w:w="2925" w:type="dxa"/>
             <w:tcBorders>
               <w:start w:val="single" w:sz="4" w:space="0" w:color="000000"/>
               <w:bottom w:val="single" w:sz="4" w:space="0" w:color="000000"/>
@@ -22419,7 +22453,7 @@
         </w:tc>
         <w:tc>
           <w:tcPr>
-            <w:tcW w:w="1358" w:type="dxa"/>
+            <w:tcW w:w="1359" w:type="dxa"/>
             <w:tcBorders>
               <w:start w:val="single" w:sz="4" w:space="0" w:color="000000"/>
               <w:bottom w:val="single" w:sz="4" w:space="0" w:color="000000"/>
@@ -22564,7 +22598,7 @@
         </w:tc>
         <w:tc>
           <w:tcPr>
-            <w:tcW w:w="2926" w:type="dxa"/>
+            <w:tcW w:w="2925" w:type="dxa"/>
             <w:tcBorders>
               <w:start w:val="single" w:sz="4" w:space="0" w:color="000000"/>
               <w:bottom w:val="single" w:sz="4" w:space="0" w:color="000000"/>
@@ -22675,7 +22709,7 @@
         </w:tc>
         <w:tc>
           <w:tcPr>
-            <w:tcW w:w="1358" w:type="dxa"/>
+            <w:tcW w:w="1359" w:type="dxa"/>
             <w:tcBorders>
               <w:start w:val="single" w:sz="4" w:space="0" w:color="000000"/>
               <w:bottom w:val="single" w:sz="4" w:space="0" w:color="000000"/>
@@ -22820,7 +22854,7 @@
         </w:tc>
         <w:tc>
           <w:tcPr>
-            <w:tcW w:w="2926" w:type="dxa"/>
+            <w:tcW w:w="2925" w:type="dxa"/>
             <w:tcBorders>
               <w:start w:val="single" w:sz="4" w:space="0" w:color="000000"/>
               <w:bottom w:val="single" w:sz="4" w:space="0" w:color="000000"/>
@@ -22914,7 +22948,7 @@
         </w:tc>
         <w:tc>
           <w:tcPr>
-            <w:tcW w:w="1358" w:type="dxa"/>
+            <w:tcW w:w="1359" w:type="dxa"/>
             <w:tcBorders>
               <w:start w:val="single" w:sz="4" w:space="0" w:color="000000"/>
               <w:bottom w:val="single" w:sz="4" w:space="0" w:color="000000"/>
@@ -23059,7 +23093,7 @@
         </w:tc>
         <w:tc>
           <w:tcPr>
-            <w:tcW w:w="2926" w:type="dxa"/>
+            <w:tcW w:w="2925" w:type="dxa"/>
             <w:tcBorders>
               <w:start w:val="single" w:sz="4" w:space="0" w:color="000000"/>
               <w:bottom w:val="single" w:sz="4" w:space="0" w:color="000000"/>
@@ -23153,7 +23187,7 @@
         </w:tc>
         <w:tc>
           <w:tcPr>
-            <w:tcW w:w="1358" w:type="dxa"/>
+            <w:tcW w:w="1359" w:type="dxa"/>
             <w:tcBorders>
               <w:start w:val="single" w:sz="4" w:space="0" w:color="000000"/>
               <w:bottom w:val="single" w:sz="4" w:space="0" w:color="000000"/>
@@ -23298,7 +23332,7 @@
         </w:tc>
         <w:tc>
           <w:tcPr>
-            <w:tcW w:w="2926" w:type="dxa"/>
+            <w:tcW w:w="2925" w:type="dxa"/>
             <w:tcBorders>
               <w:start w:val="single" w:sz="4" w:space="0" w:color="000000"/>
               <w:bottom w:val="single" w:sz="4" w:space="0" w:color="000000"/>
@@ -23392,7 +23426,7 @@
         </w:tc>
         <w:tc>
           <w:tcPr>
-            <w:tcW w:w="1358" w:type="dxa"/>
+            <w:tcW w:w="1359" w:type="dxa"/>
             <w:tcBorders>
               <w:start w:val="single" w:sz="4" w:space="0" w:color="000000"/>
               <w:bottom w:val="single" w:sz="4" w:space="0" w:color="000000"/>
@@ -23537,7 +23571,7 @@
         </w:tc>
         <w:tc>
           <w:tcPr>
-            <w:tcW w:w="2926" w:type="dxa"/>
+            <w:tcW w:w="2925" w:type="dxa"/>
             <w:tcBorders>
               <w:start w:val="single" w:sz="4" w:space="0" w:color="000000"/>
               <w:bottom w:val="single" w:sz="4" w:space="0" w:color="000000"/>
@@ -23631,7 +23665,7 @@
         </w:tc>
         <w:tc>
           <w:tcPr>
-            <w:tcW w:w="1358" w:type="dxa"/>
+            <w:tcW w:w="1359" w:type="dxa"/>
             <w:tcBorders>
               <w:start w:val="single" w:sz="4" w:space="0" w:color="000000"/>
               <w:bottom w:val="single" w:sz="4" w:space="0" w:color="000000"/>
@@ -23776,7 +23810,7 @@
         </w:tc>
         <w:tc>
           <w:tcPr>
-            <w:tcW w:w="2926" w:type="dxa"/>
+            <w:tcW w:w="2925" w:type="dxa"/>
             <w:tcBorders>
               <w:start w:val="single" w:sz="4" w:space="0" w:color="000000"/>
               <w:bottom w:val="single" w:sz="4" w:space="0" w:color="000000"/>
@@ -23870,7 +23904,7 @@
         </w:tc>
         <w:tc>
           <w:tcPr>
-            <w:tcW w:w="1358" w:type="dxa"/>
+            <w:tcW w:w="1359" w:type="dxa"/>
             <w:tcBorders>
               <w:start w:val="single" w:sz="4" w:space="0" w:color="000000"/>
               <w:bottom w:val="single" w:sz="4" w:space="0" w:color="000000"/>
@@ -24015,7 +24049,7 @@
         </w:tc>
         <w:tc>
           <w:tcPr>
-            <w:tcW w:w="2926" w:type="dxa"/>
+            <w:tcW w:w="2925" w:type="dxa"/>
             <w:tcBorders>
               <w:start w:val="single" w:sz="4" w:space="0" w:color="000000"/>
               <w:bottom w:val="single" w:sz="4" w:space="0" w:color="000000"/>
@@ -24109,7 +24143,7 @@
         </w:tc>
         <w:tc>
           <w:tcPr>
-            <w:tcW w:w="1358" w:type="dxa"/>
+            <w:tcW w:w="1359" w:type="dxa"/>
             <w:tcBorders>
               <w:start w:val="single" w:sz="4" w:space="0" w:color="000000"/>
               <w:bottom w:val="single" w:sz="4" w:space="0" w:color="000000"/>
@@ -24241,7 +24275,7 @@
         </w:tc>
         <w:tc>
           <w:tcPr>
-            <w:tcW w:w="2926" w:type="dxa"/>
+            <w:tcW w:w="2925" w:type="dxa"/>
             <w:tcBorders>
               <w:start w:val="single" w:sz="4" w:space="0" w:color="000000"/>
               <w:bottom w:val="single" w:sz="4" w:space="0" w:color="000000"/>
@@ -24352,7 +24386,7 @@
         </w:tc>
         <w:tc>
           <w:tcPr>
-            <w:tcW w:w="1358" w:type="dxa"/>
+            <w:tcW w:w="1359" w:type="dxa"/>
             <w:tcBorders>
               <w:start w:val="single" w:sz="4" w:space="0" w:color="000000"/>
               <w:bottom w:val="single" w:sz="4" w:space="0" w:color="000000"/>
@@ -24497,7 +24531,7 @@
         </w:tc>
         <w:tc>
           <w:tcPr>
-            <w:tcW w:w="2926" w:type="dxa"/>
+            <w:tcW w:w="2925" w:type="dxa"/>
             <w:tcBorders>
               <w:start w:val="single" w:sz="4" w:space="0" w:color="000000"/>
               <w:bottom w:val="single" w:sz="4" w:space="0" w:color="000000"/>
@@ -24591,7 +24625,7 @@
         </w:tc>
         <w:tc>
           <w:tcPr>
-            <w:tcW w:w="1358" w:type="dxa"/>
+            <w:tcW w:w="1359" w:type="dxa"/>
             <w:tcBorders>
               <w:start w:val="single" w:sz="4" w:space="0" w:color="000000"/>
               <w:bottom w:val="single" w:sz="4" w:space="0" w:color="000000"/>
@@ -24736,7 +24770,7 @@
         </w:tc>
         <w:tc>
           <w:tcPr>
-            <w:tcW w:w="2926" w:type="dxa"/>
+            <w:tcW w:w="2925" w:type="dxa"/>
             <w:tcBorders>
               <w:start w:val="single" w:sz="4" w:space="0" w:color="000000"/>
               <w:bottom w:val="single" w:sz="4" w:space="0" w:color="000000"/>
@@ -24830,7 +24864,7 @@
         </w:tc>
         <w:tc>
           <w:tcPr>
-            <w:tcW w:w="1358" w:type="dxa"/>
+            <w:tcW w:w="1359" w:type="dxa"/>
             <w:tcBorders>
               <w:start w:val="single" w:sz="4" w:space="0" w:color="000000"/>
               <w:bottom w:val="single" w:sz="4" w:space="0" w:color="000000"/>
@@ -24976,7 +25010,7 @@
         </w:tc>
         <w:tc>
           <w:tcPr>
-            <w:tcW w:w="2926" w:type="dxa"/>
+            <w:tcW w:w="2925" w:type="dxa"/>
             <w:tcBorders>
               <w:start w:val="single" w:sz="4" w:space="0" w:color="000000"/>
               <w:bottom w:val="single" w:sz="4" w:space="0" w:color="000000"/>
@@ -25070,7 +25104,7 @@
         </w:tc>
         <w:tc>
           <w:tcPr>
-            <w:tcW w:w="1358" w:type="dxa"/>
+            <w:tcW w:w="1359" w:type="dxa"/>
             <w:tcBorders>
               <w:start w:val="single" w:sz="4" w:space="0" w:color="000000"/>
               <w:bottom w:val="single" w:sz="4" w:space="0" w:color="000000"/>
@@ -25215,7 +25249,7 @@
         </w:tc>
         <w:tc>
           <w:tcPr>
-            <w:tcW w:w="2926" w:type="dxa"/>
+            <w:tcW w:w="2925" w:type="dxa"/>
             <w:tcBorders>
               <w:start w:val="single" w:sz="4" w:space="0" w:color="000000"/>
               <w:bottom w:val="single" w:sz="4" w:space="0" w:color="000000"/>
@@ -25309,7 +25343,7 @@
         </w:tc>
         <w:tc>
           <w:tcPr>
-            <w:tcW w:w="1358" w:type="dxa"/>
+            <w:tcW w:w="1359" w:type="dxa"/>
             <w:tcBorders>
               <w:start w:val="single" w:sz="4" w:space="0" w:color="000000"/>
               <w:bottom w:val="single" w:sz="4" w:space="0" w:color="000000"/>
@@ -25452,7 +25486,7 @@
         </w:tc>
         <w:tc>
           <w:tcPr>
-            <w:tcW w:w="2926" w:type="dxa"/>
+            <w:tcW w:w="2925" w:type="dxa"/>
             <w:tcBorders>
               <w:start w:val="single" w:sz="4" w:space="0" w:color="000000"/>
               <w:bottom w:val="single" w:sz="4" w:space="0" w:color="000000"/>
@@ -25563,7 +25597,7 @@
         </w:tc>
         <w:tc>
           <w:tcPr>
-            <w:tcW w:w="1358" w:type="dxa"/>
+            <w:tcW w:w="1359" w:type="dxa"/>
             <w:tcBorders>
               <w:start w:val="single" w:sz="4" w:space="0" w:color="000000"/>
               <w:bottom w:val="single" w:sz="4" w:space="0" w:color="000000"/>
@@ -25711,9 +25745,9 @@
         </w:tblCellMar>
       </w:tblPr>
       <w:tblGrid>
-        <w:gridCol w:w="1128"/>
+        <w:gridCol w:w="1127"/>
         <w:gridCol w:w="3516"/>
-        <w:gridCol w:w="1356"/>
+        <w:gridCol w:w="1357"/>
         <w:gridCol w:w="1350"/>
         <w:gridCol w:w="2622"/>
       </w:tblGrid>
@@ -25721,7 +25755,7 @@
         <w:trPr/>
         <w:tc>
           <w:tcPr>
-            <w:tcW w:w="1128" w:type="dxa"/>
+            <w:tcW w:w="1127" w:type="dxa"/>
             <w:tcBorders>
               <w:top w:val="single" w:sz="4" w:space="0" w:color="000000"/>
               <w:start w:val="single" w:sz="4" w:space="0" w:color="000000"/>
@@ -25795,7 +25829,7 @@
         </w:tc>
         <w:tc>
           <w:tcPr>
-            <w:tcW w:w="1356" w:type="dxa"/>
+            <w:tcW w:w="1357" w:type="dxa"/>
             <w:tcBorders>
               <w:top w:val="single" w:sz="4" w:space="0" w:color="000000"/>
               <w:start w:val="single" w:sz="4" w:space="0" w:color="000000"/>
@@ -25910,7 +25944,7 @@
         <w:trPr/>
         <w:tc>
           <w:tcPr>
-            <w:tcW w:w="1128" w:type="dxa"/>
+            <w:tcW w:w="1127" w:type="dxa"/>
             <w:tcBorders>
               <w:start w:val="single" w:sz="4" w:space="0" w:color="000000"/>
               <w:bottom w:val="single" w:sz="4" w:space="0" w:color="000000"/>
@@ -26004,7 +26038,7 @@
         </w:tc>
         <w:tc>
           <w:tcPr>
-            <w:tcW w:w="1356" w:type="dxa"/>
+            <w:tcW w:w="1357" w:type="dxa"/>
             <w:tcBorders>
               <w:start w:val="single" w:sz="4" w:space="0" w:color="000000"/>
               <w:bottom w:val="single" w:sz="4" w:space="0" w:color="000000"/>
@@ -26201,7 +26235,7 @@
         <w:trPr/>
         <w:tc>
           <w:tcPr>
-            <w:tcW w:w="1128" w:type="dxa"/>
+            <w:tcW w:w="1127" w:type="dxa"/>
             <w:tcBorders>
               <w:start w:val="single" w:sz="4" w:space="0" w:color="000000"/>
               <w:bottom w:val="single" w:sz="4" w:space="0" w:color="000000"/>
@@ -26839,7 +26873,7 @@
         </w:tc>
         <w:tc>
           <w:tcPr>
-            <w:tcW w:w="1356" w:type="dxa"/>
+            <w:tcW w:w="1357" w:type="dxa"/>
             <w:tcBorders>
               <w:start w:val="single" w:sz="4" w:space="0" w:color="000000"/>
               <w:bottom w:val="single" w:sz="4" w:space="0" w:color="000000"/>
@@ -27060,7 +27094,7 @@
         <w:trPr/>
         <w:tc>
           <w:tcPr>
-            <w:tcW w:w="1128" w:type="dxa"/>
+            <w:tcW w:w="1127" w:type="dxa"/>
             <w:tcBorders>
               <w:start w:val="single" w:sz="4" w:space="0" w:color="000000"/>
               <w:bottom w:val="single" w:sz="4" w:space="0" w:color="000000"/>
@@ -27153,7 +27187,7 @@
         </w:tc>
         <w:tc>
           <w:tcPr>
-            <w:tcW w:w="1356" w:type="dxa"/>
+            <w:tcW w:w="1357" w:type="dxa"/>
             <w:tcBorders>
               <w:start w:val="single" w:sz="4" w:space="0" w:color="000000"/>
               <w:bottom w:val="single" w:sz="4" w:space="0" w:color="000000"/>
@@ -27298,7 +27332,7 @@
         <w:trPr/>
         <w:tc>
           <w:tcPr>
-            <w:tcW w:w="1128" w:type="dxa"/>
+            <w:tcW w:w="1127" w:type="dxa"/>
             <w:tcBorders>
               <w:start w:val="single" w:sz="4" w:space="0" w:color="000000"/>
               <w:bottom w:val="single" w:sz="4" w:space="0" w:color="000000"/>
@@ -27425,7 +27459,7 @@
         </w:tc>
         <w:tc>
           <w:tcPr>
-            <w:tcW w:w="1356" w:type="dxa"/>
+            <w:tcW w:w="1357" w:type="dxa"/>
             <w:tcBorders>
               <w:start w:val="single" w:sz="4" w:space="0" w:color="000000"/>
               <w:bottom w:val="single" w:sz="4" w:space="0" w:color="000000"/>
@@ -27570,7 +27604,7 @@
         <w:trPr/>
         <w:tc>
           <w:tcPr>
-            <w:tcW w:w="1128" w:type="dxa"/>
+            <w:tcW w:w="1127" w:type="dxa"/>
             <w:tcBorders>
               <w:start w:val="single" w:sz="4" w:space="0" w:color="000000"/>
               <w:bottom w:val="single" w:sz="4" w:space="0" w:color="000000"/>
@@ -27697,7 +27731,7 @@
         </w:tc>
         <w:tc>
           <w:tcPr>
-            <w:tcW w:w="1356" w:type="dxa"/>
+            <w:tcW w:w="1357" w:type="dxa"/>
             <w:tcBorders>
               <w:start w:val="single" w:sz="4" w:space="0" w:color="000000"/>
               <w:bottom w:val="single" w:sz="4" w:space="0" w:color="000000"/>
@@ -27911,8 +27945,8 @@
         <w:gridCol w:w="1678"/>
         <w:gridCol w:w="1800"/>
         <w:gridCol w:w="2522"/>
-        <w:gridCol w:w="1878"/>
-        <w:gridCol w:w="2094"/>
+        <w:gridCol w:w="1877"/>
+        <w:gridCol w:w="2095"/>
       </w:tblGrid>
       <w:tr>
         <w:trPr/>
@@ -28029,7 +28063,7 @@
         </w:tc>
         <w:tc>
           <w:tcPr>
-            <w:tcW w:w="1878" w:type="dxa"/>
+            <w:tcW w:w="1877" w:type="dxa"/>
             <w:tcBorders>
               <w:top w:val="single" w:sz="4" w:space="0" w:color="000000"/>
               <w:start w:val="single" w:sz="4" w:space="0" w:color="000000"/>
@@ -28066,7 +28100,7 @@
         </w:tc>
         <w:tc>
           <w:tcPr>
-            <w:tcW w:w="2094" w:type="dxa"/>
+            <w:tcW w:w="2095" w:type="dxa"/>
             <w:tcBorders>
               <w:top w:val="single" w:sz="4" w:space="0" w:color="000000"/>
               <w:start w:val="single" w:sz="4" w:space="0" w:color="000000"/>
@@ -28213,7 +28247,7 @@
         </w:tc>
         <w:tc>
           <w:tcPr>
-            <w:tcW w:w="1878" w:type="dxa"/>
+            <w:tcW w:w="1877" w:type="dxa"/>
             <w:tcBorders>
               <w:start w:val="single" w:sz="4" w:space="0" w:color="000000"/>
               <w:bottom w:val="single" w:sz="4" w:space="0" w:color="000000"/>
@@ -28249,7 +28283,7 @@
         </w:tc>
         <w:tc>
           <w:tcPr>
-            <w:tcW w:w="2094" w:type="dxa"/>
+            <w:tcW w:w="2095" w:type="dxa"/>
             <w:tcBorders>
               <w:start w:val="single" w:sz="4" w:space="0" w:color="000000"/>
               <w:bottom w:val="single" w:sz="4" w:space="0" w:color="000000"/>
@@ -28396,7 +28430,7 @@
         </w:tc>
         <w:tc>
           <w:tcPr>
-            <w:tcW w:w="1878" w:type="dxa"/>
+            <w:tcW w:w="1877" w:type="dxa"/>
             <w:tcBorders>
               <w:start w:val="single" w:sz="4" w:space="0" w:color="000000"/>
               <w:bottom w:val="single" w:sz="4" w:space="0" w:color="000000"/>
@@ -28432,7 +28466,7 @@
         </w:tc>
         <w:tc>
           <w:tcPr>
-            <w:tcW w:w="2094" w:type="dxa"/>
+            <w:tcW w:w="2095" w:type="dxa"/>
             <w:tcBorders>
               <w:start w:val="single" w:sz="4" w:space="0" w:color="000000"/>
               <w:bottom w:val="single" w:sz="4" w:space="0" w:color="000000"/>
@@ -28579,7 +28613,7 @@
         </w:tc>
         <w:tc>
           <w:tcPr>
-            <w:tcW w:w="1878" w:type="dxa"/>
+            <w:tcW w:w="1877" w:type="dxa"/>
             <w:tcBorders>
               <w:start w:val="single" w:sz="4" w:space="0" w:color="000000"/>
               <w:bottom w:val="single" w:sz="4" w:space="0" w:color="000000"/>
@@ -28615,7 +28649,7 @@
         </w:tc>
         <w:tc>
           <w:tcPr>
-            <w:tcW w:w="2094" w:type="dxa"/>
+            <w:tcW w:w="2095" w:type="dxa"/>
             <w:tcBorders>
               <w:start w:val="single" w:sz="4" w:space="0" w:color="000000"/>
               <w:bottom w:val="single" w:sz="4" w:space="0" w:color="000000"/>
@@ -28697,9 +28731,9 @@
       </w:tblPr>
       <w:tblGrid>
         <w:gridCol w:w="1678"/>
-        <w:gridCol w:w="2598"/>
+        <w:gridCol w:w="2597"/>
         <w:gridCol w:w="1800"/>
-        <w:gridCol w:w="1358"/>
+        <w:gridCol w:w="1359"/>
         <w:gridCol w:w="2538"/>
       </w:tblGrid>
       <w:tr>
@@ -28743,7 +28777,7 @@
         </w:tc>
         <w:tc>
           <w:tcPr>
-            <w:tcW w:w="2598" w:type="dxa"/>
+            <w:tcW w:w="2597" w:type="dxa"/>
             <w:tcBorders>
               <w:top w:val="single" w:sz="4" w:space="0" w:color="000000"/>
               <w:start w:val="single" w:sz="4" w:space="0" w:color="000000"/>
@@ -28817,7 +28851,7 @@
         </w:tc>
         <w:tc>
           <w:tcPr>
-            <w:tcW w:w="1358" w:type="dxa"/>
+            <w:tcW w:w="1359" w:type="dxa"/>
             <w:tcBorders>
               <w:top w:val="single" w:sz="4" w:space="0" w:color="000000"/>
               <w:start w:val="single" w:sz="4" w:space="0" w:color="000000"/>
@@ -28942,7 +28976,7 @@
         </w:tc>
         <w:tc>
           <w:tcPr>
-            <w:tcW w:w="2598" w:type="dxa"/>
+            <w:tcW w:w="2597" w:type="dxa"/>
             <w:tcBorders>
               <w:start w:val="single" w:sz="4" w:space="0" w:color="000000"/>
               <w:bottom w:val="single" w:sz="4" w:space="0" w:color="000000"/>
@@ -29104,7 +29138,7 @@
         </w:tc>
         <w:tc>
           <w:tcPr>
-            <w:tcW w:w="1358" w:type="dxa"/>
+            <w:tcW w:w="1359" w:type="dxa"/>
             <w:tcBorders>
               <w:start w:val="single" w:sz="4" w:space="0" w:color="000000"/>
               <w:bottom w:val="single" w:sz="4" w:space="0" w:color="000000"/>
@@ -29249,7 +29283,7 @@
         </w:tc>
         <w:tc>
           <w:tcPr>
-            <w:tcW w:w="2598" w:type="dxa"/>
+            <w:tcW w:w="2597" w:type="dxa"/>
             <w:tcBorders>
               <w:start w:val="single" w:sz="4" w:space="0" w:color="000000"/>
               <w:bottom w:val="single" w:sz="4" w:space="0" w:color="000000"/>
@@ -29353,7 +29387,7 @@
         </w:tc>
         <w:tc>
           <w:tcPr>
-            <w:tcW w:w="1358" w:type="dxa"/>
+            <w:tcW w:w="1359" w:type="dxa"/>
             <w:tcBorders>
               <w:start w:val="single" w:sz="4" w:space="0" w:color="000000"/>
               <w:bottom w:val="single" w:sz="4" w:space="0" w:color="000000"/>
@@ -29498,7 +29532,7 @@
         </w:tc>
         <w:tc>
           <w:tcPr>
-            <w:tcW w:w="2598" w:type="dxa"/>
+            <w:tcW w:w="2597" w:type="dxa"/>
             <w:tcBorders>
               <w:start w:val="single" w:sz="4" w:space="0" w:color="000000"/>
               <w:bottom w:val="single" w:sz="4" w:space="0" w:color="000000"/>
@@ -29639,7 +29673,7 @@
         </w:tc>
         <w:tc>
           <w:tcPr>
-            <w:tcW w:w="1358" w:type="dxa"/>
+            <w:tcW w:w="1359" w:type="dxa"/>
             <w:tcBorders>
               <w:start w:val="single" w:sz="4" w:space="0" w:color="000000"/>
               <w:bottom w:val="single" w:sz="4" w:space="0" w:color="000000"/>
@@ -29784,7 +29818,7 @@
         </w:tc>
         <w:tc>
           <w:tcPr>
-            <w:tcW w:w="2598" w:type="dxa"/>
+            <w:tcW w:w="2597" w:type="dxa"/>
             <w:tcBorders>
               <w:start w:val="single" w:sz="4" w:space="0" w:color="000000"/>
               <w:bottom w:val="single" w:sz="4" w:space="0" w:color="000000"/>
@@ -29871,7 +29905,7 @@
         </w:tc>
         <w:tc>
           <w:tcPr>
-            <w:tcW w:w="1358" w:type="dxa"/>
+            <w:tcW w:w="1359" w:type="dxa"/>
             <w:tcBorders>
               <w:start w:val="single" w:sz="4" w:space="0" w:color="000000"/>
               <w:bottom w:val="single" w:sz="4" w:space="0" w:color="000000"/>
@@ -30016,7 +30050,7 @@
         </w:tc>
         <w:tc>
           <w:tcPr>
-            <w:tcW w:w="2598" w:type="dxa"/>
+            <w:tcW w:w="2597" w:type="dxa"/>
             <w:tcBorders>
               <w:start w:val="single" w:sz="4" w:space="0" w:color="000000"/>
               <w:bottom w:val="single" w:sz="4" w:space="0" w:color="000000"/>
@@ -30119,7 +30153,7 @@
         </w:tc>
         <w:tc>
           <w:tcPr>
-            <w:tcW w:w="1358" w:type="dxa"/>
+            <w:tcW w:w="1359" w:type="dxa"/>
             <w:tcBorders>
               <w:start w:val="single" w:sz="4" w:space="0" w:color="000000"/>
               <w:bottom w:val="single" w:sz="4" w:space="0" w:color="000000"/>
@@ -30251,7 +30285,7 @@
         </w:tc>
         <w:tc>
           <w:tcPr>
-            <w:tcW w:w="2598" w:type="dxa"/>
+            <w:tcW w:w="2597" w:type="dxa"/>
             <w:tcBorders>
               <w:start w:val="single" w:sz="4" w:space="0" w:color="000000"/>
               <w:bottom w:val="single" w:sz="4" w:space="0" w:color="000000"/>
@@ -30345,7 +30379,7 @@
         </w:tc>
         <w:tc>
           <w:tcPr>
-            <w:tcW w:w="1358" w:type="dxa"/>
+            <w:tcW w:w="1359" w:type="dxa"/>
             <w:tcBorders>
               <w:start w:val="single" w:sz="4" w:space="0" w:color="000000"/>
               <w:bottom w:val="single" w:sz="4" w:space="0" w:color="000000"/>
@@ -30503,9 +30537,9 @@
       </w:tblPr>
       <w:tblGrid>
         <w:gridCol w:w="1678"/>
-        <w:gridCol w:w="2598"/>
+        <w:gridCol w:w="2597"/>
         <w:gridCol w:w="1800"/>
-        <w:gridCol w:w="1358"/>
+        <w:gridCol w:w="1359"/>
         <w:gridCol w:w="2538"/>
       </w:tblGrid>
       <w:tr>
@@ -30549,7 +30583,7 @@
         </w:tc>
         <w:tc>
           <w:tcPr>
-            <w:tcW w:w="2598" w:type="dxa"/>
+            <w:tcW w:w="2597" w:type="dxa"/>
             <w:tcBorders>
               <w:top w:val="single" w:sz="4" w:space="0" w:color="000000"/>
               <w:start w:val="single" w:sz="4" w:space="0" w:color="000000"/>
@@ -30623,7 +30657,7 @@
         </w:tc>
         <w:tc>
           <w:tcPr>
-            <w:tcW w:w="1358" w:type="dxa"/>
+            <w:tcW w:w="1359" w:type="dxa"/>
             <w:tcBorders>
               <w:top w:val="single" w:sz="4" w:space="0" w:color="000000"/>
               <w:start w:val="single" w:sz="4" w:space="0" w:color="000000"/>
@@ -30748,7 +30782,7 @@
         </w:tc>
         <w:tc>
           <w:tcPr>
-            <w:tcW w:w="2598" w:type="dxa"/>
+            <w:tcW w:w="2597" w:type="dxa"/>
             <w:tcBorders>
               <w:start w:val="single" w:sz="4" w:space="0" w:color="000000"/>
               <w:bottom w:val="single" w:sz="4" w:space="0" w:color="000000"/>
@@ -30951,7 +30985,7 @@
         </w:tc>
         <w:tc>
           <w:tcPr>
-            <w:tcW w:w="1358" w:type="dxa"/>
+            <w:tcW w:w="1359" w:type="dxa"/>
             <w:tcBorders>
               <w:start w:val="single" w:sz="4" w:space="0" w:color="000000"/>
               <w:bottom w:val="single" w:sz="4" w:space="0" w:color="000000"/>
@@ -31096,7 +31130,7 @@
         </w:tc>
         <w:tc>
           <w:tcPr>
-            <w:tcW w:w="2598" w:type="dxa"/>
+            <w:tcW w:w="2597" w:type="dxa"/>
             <w:tcBorders>
               <w:start w:val="single" w:sz="4" w:space="0" w:color="000000"/>
               <w:bottom w:val="single" w:sz="4" w:space="0" w:color="000000"/>
@@ -31170,7 +31204,7 @@
         </w:tc>
         <w:tc>
           <w:tcPr>
-            <w:tcW w:w="1358" w:type="dxa"/>
+            <w:tcW w:w="1359" w:type="dxa"/>
             <w:tcBorders>
               <w:start w:val="single" w:sz="4" w:space="0" w:color="000000"/>
               <w:bottom w:val="single" w:sz="4" w:space="0" w:color="000000"/>
@@ -31315,7 +31349,7 @@
         </w:tc>
         <w:tc>
           <w:tcPr>
-            <w:tcW w:w="2598" w:type="dxa"/>
+            <w:tcW w:w="2597" w:type="dxa"/>
             <w:tcBorders>
               <w:start w:val="single" w:sz="4" w:space="0" w:color="000000"/>
               <w:bottom w:val="single" w:sz="4" w:space="0" w:color="000000"/>
@@ -31435,7 +31469,7 @@
         </w:tc>
         <w:tc>
           <w:tcPr>
-            <w:tcW w:w="1358" w:type="dxa"/>
+            <w:tcW w:w="1359" w:type="dxa"/>
             <w:tcBorders>
               <w:start w:val="single" w:sz="4" w:space="0" w:color="000000"/>
               <w:bottom w:val="single" w:sz="4" w:space="0" w:color="000000"/>
@@ -31589,17 +31623,17 @@
         </w:tblCellMar>
       </w:tblPr>
       <w:tblGrid>
-        <w:gridCol w:w="1077"/>
+        <w:gridCol w:w="1076"/>
         <w:gridCol w:w="3199"/>
         <w:gridCol w:w="1800"/>
-        <w:gridCol w:w="1358"/>
+        <w:gridCol w:w="1359"/>
         <w:gridCol w:w="2538"/>
       </w:tblGrid>
       <w:tr>
         <w:trPr/>
         <w:tc>
           <w:tcPr>
-            <w:tcW w:w="1077" w:type="dxa"/>
+            <w:tcW w:w="1076" w:type="dxa"/>
             <w:tcBorders>
               <w:top w:val="single" w:sz="4" w:space="0" w:color="000000"/>
               <w:start w:val="single" w:sz="4" w:space="0" w:color="000000"/>
@@ -31710,7 +31744,7 @@
         </w:tc>
         <w:tc>
           <w:tcPr>
-            <w:tcW w:w="1358" w:type="dxa"/>
+            <w:tcW w:w="1359" w:type="dxa"/>
             <w:tcBorders>
               <w:top w:val="single" w:sz="4" w:space="0" w:color="000000"/>
               <w:start w:val="single" w:sz="4" w:space="0" w:color="000000"/>
@@ -31788,7 +31822,7 @@
         <w:trPr/>
         <w:tc>
           <w:tcPr>
-            <w:tcW w:w="1077" w:type="dxa"/>
+            <w:tcW w:w="1076" w:type="dxa"/>
             <w:tcBorders>
               <w:start w:val="single" w:sz="4" w:space="0" w:color="000000"/>
               <w:bottom w:val="single" w:sz="4" w:space="0" w:color="000000"/>
@@ -32128,7 +32162,7 @@
         </w:tc>
         <w:tc>
           <w:tcPr>
-            <w:tcW w:w="1358" w:type="dxa"/>
+            <w:tcW w:w="1359" w:type="dxa"/>
             <w:tcBorders>
               <w:start w:val="single" w:sz="4" w:space="0" w:color="000000"/>
               <w:bottom w:val="single" w:sz="4" w:space="0" w:color="000000"/>
@@ -32226,7 +32260,7 @@
         <w:trPr/>
         <w:tc>
           <w:tcPr>
-            <w:tcW w:w="1077" w:type="dxa"/>
+            <w:tcW w:w="1076" w:type="dxa"/>
             <w:tcBorders>
               <w:start w:val="single" w:sz="4" w:space="0" w:color="000000"/>
               <w:bottom w:val="single" w:sz="4" w:space="0" w:color="000000"/>
@@ -32404,7 +32438,7 @@
         </w:tc>
         <w:tc>
           <w:tcPr>
-            <w:tcW w:w="1358" w:type="dxa"/>
+            <w:tcW w:w="1359" w:type="dxa"/>
             <w:tcBorders>
               <w:start w:val="single" w:sz="4" w:space="0" w:color="000000"/>
               <w:bottom w:val="single" w:sz="4" w:space="0" w:color="000000"/>
@@ -32807,9 +32841,9 @@
       </w:tblPr>
       <w:tblGrid>
         <w:gridCol w:w="1678"/>
-        <w:gridCol w:w="2598"/>
+        <w:gridCol w:w="2597"/>
         <w:gridCol w:w="1800"/>
-        <w:gridCol w:w="1358"/>
+        <w:gridCol w:w="1359"/>
         <w:gridCol w:w="2538"/>
       </w:tblGrid>
       <w:tr>
@@ -32853,7 +32887,7 @@
         </w:tc>
         <w:tc>
           <w:tcPr>
-            <w:tcW w:w="2598" w:type="dxa"/>
+            <w:tcW w:w="2597" w:type="dxa"/>
             <w:tcBorders>
               <w:top w:val="single" w:sz="4" w:space="0" w:color="000000"/>
               <w:start w:val="single" w:sz="4" w:space="0" w:color="000000"/>
@@ -32927,7 +32961,7 @@
         </w:tc>
         <w:tc>
           <w:tcPr>
-            <w:tcW w:w="1358" w:type="dxa"/>
+            <w:tcW w:w="1359" w:type="dxa"/>
             <w:tcBorders>
               <w:top w:val="single" w:sz="4" w:space="0" w:color="000000"/>
               <w:start w:val="single" w:sz="4" w:space="0" w:color="000000"/>
@@ -33052,7 +33086,7 @@
         </w:tc>
         <w:tc>
           <w:tcPr>
-            <w:tcW w:w="2598" w:type="dxa"/>
+            <w:tcW w:w="2597" w:type="dxa"/>
             <w:tcBorders>
               <w:start w:val="single" w:sz="4" w:space="0" w:color="000000"/>
               <w:bottom w:val="single" w:sz="4" w:space="0" w:color="000000"/>
@@ -33334,7 +33368,7 @@
         </w:tc>
         <w:tc>
           <w:tcPr>
-            <w:tcW w:w="1358" w:type="dxa"/>
+            <w:tcW w:w="1359" w:type="dxa"/>
             <w:tcBorders>
               <w:start w:val="single" w:sz="4" w:space="0" w:color="000000"/>
               <w:bottom w:val="single" w:sz="4" w:space="0" w:color="000000"/>
@@ -33479,7 +33513,7 @@
         </w:tc>
         <w:tc>
           <w:tcPr>
-            <w:tcW w:w="2598" w:type="dxa"/>
+            <w:tcW w:w="2597" w:type="dxa"/>
             <w:tcBorders>
               <w:start w:val="single" w:sz="4" w:space="0" w:color="000000"/>
               <w:bottom w:val="single" w:sz="4" w:space="0" w:color="000000"/>
@@ -33767,7 +33801,7 @@
         </w:tc>
         <w:tc>
           <w:tcPr>
-            <w:tcW w:w="1358" w:type="dxa"/>
+            <w:tcW w:w="1359" w:type="dxa"/>
             <w:tcBorders>
               <w:start w:val="single" w:sz="4" w:space="0" w:color="000000"/>
               <w:bottom w:val="single" w:sz="4" w:space="0" w:color="000000"/>
@@ -33913,9 +33947,9 @@
       </w:tblPr>
       <w:tblGrid>
         <w:gridCol w:w="1678"/>
-        <w:gridCol w:w="2598"/>
+        <w:gridCol w:w="2597"/>
         <w:gridCol w:w="1800"/>
-        <w:gridCol w:w="1358"/>
+        <w:gridCol w:w="1359"/>
         <w:gridCol w:w="2538"/>
       </w:tblGrid>
       <w:tr>
@@ -33959,7 +33993,7 @@
         </w:tc>
         <w:tc>
           <w:tcPr>
-            <w:tcW w:w="2598" w:type="dxa"/>
+            <w:tcW w:w="2597" w:type="dxa"/>
             <w:tcBorders>
               <w:top w:val="single" w:sz="4" w:space="0" w:color="000000"/>
               <w:start w:val="single" w:sz="4" w:space="0" w:color="000000"/>
@@ -34033,7 +34067,7 @@
         </w:tc>
         <w:tc>
           <w:tcPr>
-            <w:tcW w:w="1358" w:type="dxa"/>
+            <w:tcW w:w="1359" w:type="dxa"/>
             <w:tcBorders>
               <w:top w:val="single" w:sz="4" w:space="0" w:color="000000"/>
               <w:start w:val="single" w:sz="4" w:space="0" w:color="000000"/>
@@ -34158,7 +34192,7 @@
         </w:tc>
         <w:tc>
           <w:tcPr>
-            <w:tcW w:w="2598" w:type="dxa"/>
+            <w:tcW w:w="2597" w:type="dxa"/>
             <w:tcBorders>
               <w:start w:val="single" w:sz="4" w:space="0" w:color="000000"/>
               <w:bottom w:val="single" w:sz="4" w:space="0" w:color="000000"/>
@@ -34440,7 +34474,7 @@
         </w:tc>
         <w:tc>
           <w:tcPr>
-            <w:tcW w:w="1358" w:type="dxa"/>
+            <w:tcW w:w="1359" w:type="dxa"/>
             <w:tcBorders>
               <w:start w:val="single" w:sz="4" w:space="0" w:color="000000"/>
               <w:bottom w:val="single" w:sz="4" w:space="0" w:color="000000"/>
@@ -34585,7 +34619,7 @@
         </w:tc>
         <w:tc>
           <w:tcPr>
-            <w:tcW w:w="2598" w:type="dxa"/>
+            <w:tcW w:w="2597" w:type="dxa"/>
             <w:tcBorders>
               <w:start w:val="single" w:sz="4" w:space="0" w:color="000000"/>
               <w:bottom w:val="single" w:sz="4" w:space="0" w:color="000000"/>
@@ -34873,7 +34907,7 @@
         </w:tc>
         <w:tc>
           <w:tcPr>
-            <w:tcW w:w="1358" w:type="dxa"/>
+            <w:tcW w:w="1359" w:type="dxa"/>
             <w:tcBorders>
               <w:start w:val="single" w:sz="4" w:space="0" w:color="000000"/>
               <w:bottom w:val="single" w:sz="4" w:space="0" w:color="000000"/>
@@ -35044,8 +35078,8 @@
       </w:tblPr>
       <w:tblGrid>
         <w:gridCol w:w="1678"/>
-        <w:gridCol w:w="4399"/>
-        <w:gridCol w:w="2074"/>
+        <w:gridCol w:w="4398"/>
+        <w:gridCol w:w="2075"/>
         <w:gridCol w:w="1821"/>
       </w:tblGrid>
       <w:tr>
@@ -35089,7 +35123,7 @@
         </w:tc>
         <w:tc>
           <w:tcPr>
-            <w:tcW w:w="4399" w:type="dxa"/>
+            <w:tcW w:w="4398" w:type="dxa"/>
             <w:tcBorders>
               <w:top w:val="single" w:sz="4" w:space="0" w:color="000000"/>
               <w:start w:val="single" w:sz="4" w:space="0" w:color="000000"/>
@@ -35126,7 +35160,7 @@
         </w:tc>
         <w:tc>
           <w:tcPr>
-            <w:tcW w:w="2074" w:type="dxa"/>
+            <w:tcW w:w="2075" w:type="dxa"/>
             <w:tcBorders>
               <w:top w:val="single" w:sz="4" w:space="0" w:color="000000"/>
               <w:start w:val="single" w:sz="4" w:space="0" w:color="000000"/>
@@ -35251,7 +35285,7 @@
         </w:tc>
         <w:tc>
           <w:tcPr>
-            <w:tcW w:w="4399" w:type="dxa"/>
+            <w:tcW w:w="4398" w:type="dxa"/>
             <w:tcBorders>
               <w:start w:val="single" w:sz="4" w:space="0" w:color="000000"/>
               <w:bottom w:val="single" w:sz="4" w:space="0" w:color="000000"/>
@@ -35300,7 +35334,7 @@
         </w:tc>
         <w:tc>
           <w:tcPr>
-            <w:tcW w:w="2074" w:type="dxa"/>
+            <w:tcW w:w="2075" w:type="dxa"/>
             <w:tcBorders>
               <w:start w:val="single" w:sz="4" w:space="0" w:color="000000"/>
               <w:bottom w:val="single" w:sz="4" w:space="0" w:color="000000"/>
@@ -36051,8 +36085,8 @@
       <w:szCs w:val="26"/>
     </w:rPr>
   </w:style>
-  <w:style w:type="character" w:styleId="Bullets">
-    <w:name w:val="Bullets"/>
+  <w:style w:type="character" w:styleId="Bulletsuser">
+    <w:name w:val="Bullets (user)"/>
     <w:qFormat/>
     <w:rPr>
       <w:rFonts w:ascii="OpenSymbol" w:hAnsi="OpenSymbol" w:eastAsia="OpenSymbol" w:cs="OpenSymbol"/>

</xml_diff>